<commit_message>
adding vars to table 10
</commit_message>
<xml_diff>
--- a/Tables/Final/Table10_vbt.docx
+++ b/Tables/Final/Table10_vbt.docx
@@ -17,7 +17,7 @@
         <w:tblLook w:firstRow="1" w:lastRow="0" w:firstColumn="0" w:lastColumn="0" w:noHBand="0" w:noVBand="1"/>
       </w:tblPr>
       <w:tblGrid>
-        <w:gridCol w:w="4018"/>
+        <w:gridCol w:w="4446"/>
         <w:gridCol w:w="2735"/>
         <w:gridCol w:w="3639"/>
         <w:gridCol w:w="2735"/>
@@ -4893,6 +4893,1626 @@
         <w:tc>
           <w:tcPr>
             <w:tcBorders>
+              <w:bottom w:val="none" w:sz="0" w:space="0" w:color="000000"/>
+              <w:top w:val="none" w:sz="0" w:space="0" w:color="000000"/>
+              <w:left w:val="none" w:sz="0" w:space="0" w:color="000000"/>
+              <w:right w:val="none" w:sz="0" w:space="0" w:color="000000"/>
+            </w:tcBorders>
+            <w:shd w:val="clear" w:color="auto" w:fill="FFFFFF"/>
+            <w:tcMar>
+              <w:top w:w="0" w:type="dxa"/>
+              <w:bottom w:w="0" w:type="dxa"/>
+              <w:left w:w="0" w:type="dxa"/>
+              <w:right w:w="0" w:type="dxa"/>
+            </w:tcMar>
+            <w:vAlign w:val="center"/>
+          </w:tcPr>
+          <w:p>
+            <w:pPr>
+              <w:pStyle w:val="Normal"/>
+              <w:jc w:val="left"/>
+              <w:pBdr>
+                <w:bottom w:val="none" w:sz="0" w:space="0" w:color="000000"/>
+                <w:top w:val="none" w:sz="0" w:space="0" w:color="000000"/>
+                <w:left w:val="none" w:sz="0" w:space="0" w:color="000000"/>
+                <w:right w:val="none" w:sz="0" w:space="0" w:color="000000"/>
+              </w:pBdr>
+              <w:spacing w:after="100" w:before="100" w:line="240"/>
+              <w:ind w:left="100" w:right="100" w:firstLine="0" w:firstLineChars="0"/>
+              <w:rPr>
+                <w:rFonts w:ascii="Arial" w:hAnsi="Arial" w:eastAsia="Arial" w:cs="Arial"/>
+                <w:i w:val="false"/>
+                <w:b w:val="false"/>
+                <w:u w:val="none"/>
+                <w:sz w:val="18"/>
+                <w:szCs w:val="18"/>
+                <w:color w:val="000000"/>
+              </w:rPr>
+            </w:pPr>
+            <w:r>
+              <w:rPr>
+                <w:rFonts w:ascii="Arial" w:hAnsi="Arial" w:eastAsia="Arial" w:cs="Arial"/>
+                <w:i w:val="false"/>
+                <w:b w:val="false"/>
+                <w:u w:val="none"/>
+                <w:sz w:val="18"/>
+                <w:szCs w:val="18"/>
+                <w:color w:val="000000"/>
+              </w:rPr>
+              <w:t xml:space="preserve">Pain with tampon test (median [IQR])</w:t>
+            </w:r>
+          </w:p>
+        </w:tc>
+        <w:tc>
+          <w:tcPr>
+            <w:tcBorders>
+              <w:bottom w:val="none" w:sz="0" w:space="0" w:color="000000"/>
+              <w:top w:val="none" w:sz="0" w:space="0" w:color="000000"/>
+              <w:left w:val="none" w:sz="0" w:space="0" w:color="000000"/>
+              <w:right w:val="none" w:sz="0" w:space="0" w:color="000000"/>
+            </w:tcBorders>
+            <w:shd w:val="clear" w:color="auto" w:fill="FFFFFF"/>
+            <w:tcMar>
+              <w:top w:w="0" w:type="dxa"/>
+              <w:bottom w:w="0" w:type="dxa"/>
+              <w:left w:w="0" w:type="dxa"/>
+              <w:right w:w="0" w:type="dxa"/>
+            </w:tcMar>
+            <w:vAlign w:val="center"/>
+          </w:tcPr>
+          <w:p>
+            <w:pPr>
+              <w:pStyle w:val="Normal"/>
+              <w:jc w:val="left"/>
+              <w:pBdr>
+                <w:bottom w:val="none" w:sz="0" w:space="0" w:color="000000"/>
+                <w:top w:val="none" w:sz="0" w:space="0" w:color="000000"/>
+                <w:left w:val="none" w:sz="0" w:space="0" w:color="000000"/>
+                <w:right w:val="none" w:sz="0" w:space="0" w:color="000000"/>
+              </w:pBdr>
+              <w:spacing w:after="100" w:before="100" w:line="240"/>
+              <w:ind w:left="100" w:right="100" w:firstLine="0" w:firstLineChars="0"/>
+              <w:rPr>
+                <w:rFonts w:ascii="Arial" w:hAnsi="Arial" w:eastAsia="Arial" w:cs="Arial"/>
+                <w:i w:val="false"/>
+                <w:b w:val="false"/>
+                <w:u w:val="none"/>
+                <w:sz w:val="18"/>
+                <w:szCs w:val="18"/>
+                <w:color w:val="000000"/>
+              </w:rPr>
+            </w:pPr>
+            <w:r>
+              <w:rPr>
+                <w:rFonts w:ascii="Arial" w:hAnsi="Arial" w:eastAsia="Arial" w:cs="Arial"/>
+                <w:i w:val="false"/>
+                <w:b w:val="false"/>
+                <w:u w:val="none"/>
+                <w:sz w:val="18"/>
+                <w:szCs w:val="18"/>
+                <w:color w:val="000000"/>
+              </w:rPr>
+              <w:t xml:space="preserve">1.00 [0.00, 3.00]</w:t>
+            </w:r>
+          </w:p>
+        </w:tc>
+        <w:tc>
+          <w:tcPr>
+            <w:tcBorders>
+              <w:bottom w:val="none" w:sz="0" w:space="0" w:color="000000"/>
+              <w:top w:val="none" w:sz="0" w:space="0" w:color="000000"/>
+              <w:left w:val="none" w:sz="0" w:space="0" w:color="000000"/>
+              <w:right w:val="none" w:sz="0" w:space="0" w:color="000000"/>
+            </w:tcBorders>
+            <w:shd w:val="clear" w:color="auto" w:fill="FFFFFF"/>
+            <w:tcMar>
+              <w:top w:w="0" w:type="dxa"/>
+              <w:bottom w:w="0" w:type="dxa"/>
+              <w:left w:w="0" w:type="dxa"/>
+              <w:right w:w="0" w:type="dxa"/>
+            </w:tcMar>
+            <w:vAlign w:val="center"/>
+          </w:tcPr>
+          <w:p>
+            <w:pPr>
+              <w:pStyle w:val="Normal"/>
+              <w:jc w:val="left"/>
+              <w:pBdr>
+                <w:bottom w:val="none" w:sz="0" w:space="0" w:color="000000"/>
+                <w:top w:val="none" w:sz="0" w:space="0" w:color="000000"/>
+                <w:left w:val="none" w:sz="0" w:space="0" w:color="000000"/>
+                <w:right w:val="none" w:sz="0" w:space="0" w:color="000000"/>
+              </w:pBdr>
+              <w:spacing w:after="100" w:before="100" w:line="240"/>
+              <w:ind w:left="100" w:right="100" w:firstLine="0" w:firstLineChars="0"/>
+              <w:rPr>
+                <w:rFonts w:ascii="Arial" w:hAnsi="Arial" w:eastAsia="Arial" w:cs="Arial"/>
+                <w:i w:val="false"/>
+                <w:b w:val="false"/>
+                <w:u w:val="none"/>
+                <w:sz w:val="18"/>
+                <w:szCs w:val="18"/>
+                <w:color w:val="000000"/>
+              </w:rPr>
+            </w:pPr>
+            <w:r>
+              <w:rPr>
+                <w:rFonts w:ascii="Arial" w:hAnsi="Arial" w:eastAsia="Arial" w:cs="Arial"/>
+                <w:i w:val="false"/>
+                <w:b w:val="false"/>
+                <w:u w:val="none"/>
+                <w:sz w:val="18"/>
+                <w:szCs w:val="18"/>
+                <w:color w:val="000000"/>
+              </w:rPr>
+              <w:t xml:space="preserve">3.00 [1.00, 5.00]</w:t>
+            </w:r>
+          </w:p>
+        </w:tc>
+        <w:tc>
+          <w:tcPr>
+            <w:tcBorders>
+              <w:bottom w:val="none" w:sz="0" w:space="0" w:color="000000"/>
+              <w:top w:val="none" w:sz="0" w:space="0" w:color="000000"/>
+              <w:left w:val="none" w:sz="0" w:space="0" w:color="000000"/>
+              <w:right w:val="none" w:sz="0" w:space="0" w:color="000000"/>
+            </w:tcBorders>
+            <w:shd w:val="clear" w:color="auto" w:fill="FFFFFF"/>
+            <w:tcMar>
+              <w:top w:w="0" w:type="dxa"/>
+              <w:bottom w:w="0" w:type="dxa"/>
+              <w:left w:w="0" w:type="dxa"/>
+              <w:right w:w="0" w:type="dxa"/>
+            </w:tcMar>
+            <w:vAlign w:val="center"/>
+          </w:tcPr>
+          <w:p>
+            <w:pPr>
+              <w:pStyle w:val="Normal"/>
+              <w:jc w:val="left"/>
+              <w:pBdr>
+                <w:bottom w:val="none" w:sz="0" w:space="0" w:color="000000"/>
+                <w:top w:val="none" w:sz="0" w:space="0" w:color="000000"/>
+                <w:left w:val="none" w:sz="0" w:space="0" w:color="000000"/>
+                <w:right w:val="none" w:sz="0" w:space="0" w:color="000000"/>
+              </w:pBdr>
+              <w:spacing w:after="100" w:before="100" w:line="240"/>
+              <w:ind w:left="100" w:right="100" w:firstLine="0" w:firstLineChars="0"/>
+              <w:rPr>
+                <w:rFonts w:ascii="Arial" w:hAnsi="Arial" w:eastAsia="Arial" w:cs="Arial"/>
+                <w:i w:val="false"/>
+                <w:b w:val="false"/>
+                <w:u w:val="none"/>
+                <w:sz w:val="18"/>
+                <w:szCs w:val="18"/>
+                <w:color w:val="000000"/>
+              </w:rPr>
+            </w:pPr>
+            <w:r>
+              <w:rPr>
+                <w:rFonts w:ascii="Arial" w:hAnsi="Arial" w:eastAsia="Arial" w:cs="Arial"/>
+                <w:i w:val="false"/>
+                <w:b w:val="false"/>
+                <w:u w:val="none"/>
+                <w:sz w:val="18"/>
+                <w:szCs w:val="18"/>
+                <w:color w:val="000000"/>
+              </w:rPr>
+              <w:t xml:space="preserve">1.00 [0.00, 1.00]</w:t>
+            </w:r>
+          </w:p>
+        </w:tc>
+        <w:tc>
+          <w:tcPr>
+            <w:tcBorders>
+              <w:bottom w:val="none" w:sz="0" w:space="0" w:color="000000"/>
+              <w:top w:val="none" w:sz="0" w:space="0" w:color="000000"/>
+              <w:left w:val="none" w:sz="0" w:space="0" w:color="000000"/>
+              <w:right w:val="none" w:sz="0" w:space="0" w:color="000000"/>
+            </w:tcBorders>
+            <w:shd w:val="clear" w:color="auto" w:fill="FFFFFF"/>
+            <w:tcMar>
+              <w:top w:w="0" w:type="dxa"/>
+              <w:bottom w:w="0" w:type="dxa"/>
+              <w:left w:w="0" w:type="dxa"/>
+              <w:right w:w="0" w:type="dxa"/>
+            </w:tcMar>
+            <w:vAlign w:val="center"/>
+          </w:tcPr>
+          <w:p>
+            <w:pPr>
+              <w:pStyle w:val="Normal"/>
+              <w:jc w:val="left"/>
+              <w:pBdr>
+                <w:bottom w:val="none" w:sz="0" w:space="0" w:color="000000"/>
+                <w:top w:val="none" w:sz="0" w:space="0" w:color="000000"/>
+                <w:left w:val="none" w:sz="0" w:space="0" w:color="000000"/>
+                <w:right w:val="none" w:sz="0" w:space="0" w:color="000000"/>
+              </w:pBdr>
+              <w:spacing w:after="100" w:before="100" w:line="240"/>
+              <w:ind w:left="100" w:right="100" w:firstLine="0" w:firstLineChars="0"/>
+              <w:rPr>
+                <w:rFonts w:ascii="Arial" w:hAnsi="Arial" w:eastAsia="Arial" w:cs="Arial"/>
+                <w:i w:val="false"/>
+                <w:b w:val="false"/>
+                <w:u w:val="none"/>
+                <w:sz w:val="18"/>
+                <w:szCs w:val="18"/>
+                <w:color w:val="000000"/>
+              </w:rPr>
+            </w:pPr>
+            <w:r>
+              <w:rPr>
+                <w:rFonts w:ascii="Arial" w:hAnsi="Arial" w:eastAsia="Arial" w:cs="Arial"/>
+                <w:i w:val="false"/>
+                <w:b w:val="false"/>
+                <w:u w:val="none"/>
+                <w:sz w:val="18"/>
+                <w:szCs w:val="18"/>
+                <w:color w:val="000000"/>
+              </w:rPr>
+              <w:t xml:space="preserve">&lt;0.001</w:t>
+            </w:r>
+          </w:p>
+        </w:tc>
+        <w:tc>
+          <w:tcPr>
+            <w:tcBorders>
+              <w:bottom w:val="none" w:sz="0" w:space="0" w:color="000000"/>
+              <w:top w:val="none" w:sz="0" w:space="0" w:color="000000"/>
+              <w:left w:val="none" w:sz="0" w:space="0" w:color="000000"/>
+              <w:right w:val="none" w:sz="0" w:space="0" w:color="000000"/>
+            </w:tcBorders>
+            <w:shd w:val="clear" w:color="auto" w:fill="FFFFFF"/>
+            <w:tcMar>
+              <w:top w:w="0" w:type="dxa"/>
+              <w:bottom w:w="0" w:type="dxa"/>
+              <w:left w:w="0" w:type="dxa"/>
+              <w:right w:w="0" w:type="dxa"/>
+            </w:tcMar>
+            <w:vAlign w:val="center"/>
+          </w:tcPr>
+          <w:p>
+            <w:pPr>
+              <w:pStyle w:val="Normal"/>
+              <w:jc w:val="left"/>
+              <w:pBdr>
+                <w:bottom w:val="none" w:sz="0" w:space="0" w:color="000000"/>
+                <w:top w:val="none" w:sz="0" w:space="0" w:color="000000"/>
+                <w:left w:val="none" w:sz="0" w:space="0" w:color="000000"/>
+                <w:right w:val="none" w:sz="0" w:space="0" w:color="000000"/>
+              </w:pBdr>
+              <w:spacing w:after="100" w:before="100" w:line="240"/>
+              <w:ind w:left="100" w:right="100" w:firstLine="0" w:firstLineChars="0"/>
+              <w:rPr>
+                <w:rFonts w:ascii="Arial" w:hAnsi="Arial" w:eastAsia="Arial" w:cs="Arial"/>
+                <w:i w:val="false"/>
+                <w:b w:val="false"/>
+                <w:u w:val="none"/>
+                <w:sz w:val="18"/>
+                <w:szCs w:val="18"/>
+                <w:color w:val="000000"/>
+              </w:rPr>
+            </w:pPr>
+            <w:r>
+              <w:rPr>
+                <w:rFonts w:ascii="Arial" w:hAnsi="Arial" w:eastAsia="Arial" w:cs="Arial"/>
+                <w:i w:val="false"/>
+                <w:b w:val="false"/>
+                <w:u w:val="none"/>
+                <w:sz w:val="18"/>
+                <w:szCs w:val="18"/>
+                <w:color w:val="000000"/>
+              </w:rPr>
+              <w:t xml:space="preserve">&lt;0.001</w:t>
+            </w:r>
+          </w:p>
+        </w:tc>
+      </w:tr>
+      <w:tr>
+        <w:trPr>
+          <w:trHeight w:val="617" w:hRule="auto"/>
+        </w:trPr>
+        body16
+        <w:tc>
+          <w:tcPr>
+            <w:tcBorders>
+              <w:bottom w:val="none" w:sz="0" w:space="0" w:color="000000"/>
+              <w:top w:val="none" w:sz="0" w:space="0" w:color="000000"/>
+              <w:left w:val="none" w:sz="0" w:space="0" w:color="000000"/>
+              <w:right w:val="none" w:sz="0" w:space="0" w:color="000000"/>
+            </w:tcBorders>
+            <w:shd w:val="clear" w:color="auto" w:fill="FFFFFF"/>
+            <w:tcMar>
+              <w:top w:w="0" w:type="dxa"/>
+              <w:bottom w:w="0" w:type="dxa"/>
+              <w:left w:w="0" w:type="dxa"/>
+              <w:right w:w="0" w:type="dxa"/>
+            </w:tcMar>
+            <w:vAlign w:val="center"/>
+          </w:tcPr>
+          <w:p>
+            <w:pPr>
+              <w:pStyle w:val="Normal"/>
+              <w:jc w:val="left"/>
+              <w:pBdr>
+                <w:bottom w:val="none" w:sz="0" w:space="0" w:color="000000"/>
+                <w:top w:val="none" w:sz="0" w:space="0" w:color="000000"/>
+                <w:left w:val="none" w:sz="0" w:space="0" w:color="000000"/>
+                <w:right w:val="none" w:sz="0" w:space="0" w:color="000000"/>
+              </w:pBdr>
+              <w:spacing w:after="100" w:before="100" w:line="240"/>
+              <w:ind w:left="100" w:right="100" w:firstLine="0" w:firstLineChars="0"/>
+              <w:rPr>
+                <w:rFonts w:ascii="Arial" w:hAnsi="Arial" w:eastAsia="Arial" w:cs="Arial"/>
+                <w:i w:val="false"/>
+                <w:b w:val="false"/>
+                <w:u w:val="none"/>
+                <w:sz w:val="18"/>
+                <w:szCs w:val="18"/>
+                <w:color w:val="000000"/>
+              </w:rPr>
+            </w:pPr>
+            <w:r>
+              <w:rPr>
+                <w:rFonts w:ascii="Arial" w:hAnsi="Arial" w:eastAsia="Arial" w:cs="Arial"/>
+                <w:i w:val="false"/>
+                <w:b w:val="false"/>
+                <w:u w:val="none"/>
+                <w:sz w:val="18"/>
+                <w:szCs w:val="18"/>
+                <w:color w:val="000000"/>
+              </w:rPr>
+              <w:t xml:space="preserve">Understanding of bladder task (%)</w:t>
+            </w:r>
+          </w:p>
+        </w:tc>
+        <w:tc>
+          <w:tcPr>
+            <w:tcBorders>
+              <w:bottom w:val="none" w:sz="0" w:space="0" w:color="000000"/>
+              <w:top w:val="none" w:sz="0" w:space="0" w:color="000000"/>
+              <w:left w:val="none" w:sz="0" w:space="0" w:color="000000"/>
+              <w:right w:val="none" w:sz="0" w:space="0" w:color="000000"/>
+            </w:tcBorders>
+            <w:shd w:val="clear" w:color="auto" w:fill="FFFFFF"/>
+            <w:tcMar>
+              <w:top w:w="0" w:type="dxa"/>
+              <w:bottom w:w="0" w:type="dxa"/>
+              <w:left w:w="0" w:type="dxa"/>
+              <w:right w:w="0" w:type="dxa"/>
+            </w:tcMar>
+            <w:vAlign w:val="center"/>
+          </w:tcPr>
+          <w:p>
+            <w:pPr>
+              <w:pStyle w:val="Normal"/>
+              <w:jc w:val="left"/>
+              <w:pBdr>
+                <w:bottom w:val="none" w:sz="0" w:space="0" w:color="000000"/>
+                <w:top w:val="none" w:sz="0" w:space="0" w:color="000000"/>
+                <w:left w:val="none" w:sz="0" w:space="0" w:color="000000"/>
+                <w:right w:val="none" w:sz="0" w:space="0" w:color="000000"/>
+              </w:pBdr>
+              <w:spacing w:after="100" w:before="100" w:line="240"/>
+              <w:ind w:left="100" w:right="100" w:firstLine="0" w:firstLineChars="0"/>
+              <w:rPr>
+                <w:rFonts w:ascii="Arial" w:hAnsi="Arial" w:eastAsia="Arial" w:cs="Arial"/>
+                <w:i w:val="false"/>
+                <w:b w:val="false"/>
+                <w:u w:val="none"/>
+                <w:sz w:val="18"/>
+                <w:szCs w:val="18"/>
+                <w:color w:val="000000"/>
+              </w:rPr>
+            </w:pPr>
+            <w:r>
+              <w:rPr>
+                <w:rFonts w:ascii="Arial" w:hAnsi="Arial" w:eastAsia="Arial" w:cs="Arial"/>
+                <w:i w:val="false"/>
+                <w:b w:val="false"/>
+                <w:u w:val="none"/>
+                <w:sz w:val="18"/>
+                <w:szCs w:val="18"/>
+                <w:color w:val="000000"/>
+              </w:rPr>
+              <w:t xml:space="preserve"/>
+            </w:r>
+          </w:p>
+        </w:tc>
+        <w:tc>
+          <w:tcPr>
+            <w:tcBorders>
+              <w:bottom w:val="none" w:sz="0" w:space="0" w:color="000000"/>
+              <w:top w:val="none" w:sz="0" w:space="0" w:color="000000"/>
+              <w:left w:val="none" w:sz="0" w:space="0" w:color="000000"/>
+              <w:right w:val="none" w:sz="0" w:space="0" w:color="000000"/>
+            </w:tcBorders>
+            <w:shd w:val="clear" w:color="auto" w:fill="FFFFFF"/>
+            <w:tcMar>
+              <w:top w:w="0" w:type="dxa"/>
+              <w:bottom w:w="0" w:type="dxa"/>
+              <w:left w:w="0" w:type="dxa"/>
+              <w:right w:w="0" w:type="dxa"/>
+            </w:tcMar>
+            <w:vAlign w:val="center"/>
+          </w:tcPr>
+          <w:p>
+            <w:pPr>
+              <w:pStyle w:val="Normal"/>
+              <w:jc w:val="left"/>
+              <w:pBdr>
+                <w:bottom w:val="none" w:sz="0" w:space="0" w:color="000000"/>
+                <w:top w:val="none" w:sz="0" w:space="0" w:color="000000"/>
+                <w:left w:val="none" w:sz="0" w:space="0" w:color="000000"/>
+                <w:right w:val="none" w:sz="0" w:space="0" w:color="000000"/>
+              </w:pBdr>
+              <w:spacing w:after="100" w:before="100" w:line="240"/>
+              <w:ind w:left="100" w:right="100" w:firstLine="0" w:firstLineChars="0"/>
+              <w:rPr>
+                <w:rFonts w:ascii="Arial" w:hAnsi="Arial" w:eastAsia="Arial" w:cs="Arial"/>
+                <w:i w:val="false"/>
+                <w:b w:val="false"/>
+                <w:u w:val="none"/>
+                <w:sz w:val="18"/>
+                <w:szCs w:val="18"/>
+                <w:color w:val="000000"/>
+              </w:rPr>
+            </w:pPr>
+            <w:r>
+              <w:rPr>
+                <w:rFonts w:ascii="Arial" w:hAnsi="Arial" w:eastAsia="Arial" w:cs="Arial"/>
+                <w:i w:val="false"/>
+                <w:b w:val="false"/>
+                <w:u w:val="none"/>
+                <w:sz w:val="18"/>
+                <w:szCs w:val="18"/>
+                <w:color w:val="000000"/>
+              </w:rPr>
+              <w:t xml:space="preserve"/>
+            </w:r>
+          </w:p>
+        </w:tc>
+        <w:tc>
+          <w:tcPr>
+            <w:tcBorders>
+              <w:bottom w:val="none" w:sz="0" w:space="0" w:color="000000"/>
+              <w:top w:val="none" w:sz="0" w:space="0" w:color="000000"/>
+              <w:left w:val="none" w:sz="0" w:space="0" w:color="000000"/>
+              <w:right w:val="none" w:sz="0" w:space="0" w:color="000000"/>
+            </w:tcBorders>
+            <w:shd w:val="clear" w:color="auto" w:fill="FFFFFF"/>
+            <w:tcMar>
+              <w:top w:w="0" w:type="dxa"/>
+              <w:bottom w:w="0" w:type="dxa"/>
+              <w:left w:w="0" w:type="dxa"/>
+              <w:right w:w="0" w:type="dxa"/>
+            </w:tcMar>
+            <w:vAlign w:val="center"/>
+          </w:tcPr>
+          <w:p>
+            <w:pPr>
+              <w:pStyle w:val="Normal"/>
+              <w:jc w:val="left"/>
+              <w:pBdr>
+                <w:bottom w:val="none" w:sz="0" w:space="0" w:color="000000"/>
+                <w:top w:val="none" w:sz="0" w:space="0" w:color="000000"/>
+                <w:left w:val="none" w:sz="0" w:space="0" w:color="000000"/>
+                <w:right w:val="none" w:sz="0" w:space="0" w:color="000000"/>
+              </w:pBdr>
+              <w:spacing w:after="100" w:before="100" w:line="240"/>
+              <w:ind w:left="100" w:right="100" w:firstLine="0" w:firstLineChars="0"/>
+              <w:rPr>
+                <w:rFonts w:ascii="Arial" w:hAnsi="Arial" w:eastAsia="Arial" w:cs="Arial"/>
+                <w:i w:val="false"/>
+                <w:b w:val="false"/>
+                <w:u w:val="none"/>
+                <w:sz w:val="18"/>
+                <w:szCs w:val="18"/>
+                <w:color w:val="000000"/>
+              </w:rPr>
+            </w:pPr>
+            <w:r>
+              <w:rPr>
+                <w:rFonts w:ascii="Arial" w:hAnsi="Arial" w:eastAsia="Arial" w:cs="Arial"/>
+                <w:i w:val="false"/>
+                <w:b w:val="false"/>
+                <w:u w:val="none"/>
+                <w:sz w:val="18"/>
+                <w:szCs w:val="18"/>
+                <w:color w:val="000000"/>
+              </w:rPr>
+              <w:t xml:space="preserve"/>
+            </w:r>
+          </w:p>
+        </w:tc>
+        <w:tc>
+          <w:tcPr>
+            <w:tcBorders>
+              <w:bottom w:val="none" w:sz="0" w:space="0" w:color="000000"/>
+              <w:top w:val="none" w:sz="0" w:space="0" w:color="000000"/>
+              <w:left w:val="none" w:sz="0" w:space="0" w:color="000000"/>
+              <w:right w:val="none" w:sz="0" w:space="0" w:color="000000"/>
+            </w:tcBorders>
+            <w:shd w:val="clear" w:color="auto" w:fill="FFFFFF"/>
+            <w:tcMar>
+              <w:top w:w="0" w:type="dxa"/>
+              <w:bottom w:w="0" w:type="dxa"/>
+              <w:left w:w="0" w:type="dxa"/>
+              <w:right w:w="0" w:type="dxa"/>
+            </w:tcMar>
+            <w:vAlign w:val="center"/>
+          </w:tcPr>
+          <w:p>
+            <w:pPr>
+              <w:pStyle w:val="Normal"/>
+              <w:jc w:val="left"/>
+              <w:pBdr>
+                <w:bottom w:val="none" w:sz="0" w:space="0" w:color="000000"/>
+                <w:top w:val="none" w:sz="0" w:space="0" w:color="000000"/>
+                <w:left w:val="none" w:sz="0" w:space="0" w:color="000000"/>
+                <w:right w:val="none" w:sz="0" w:space="0" w:color="000000"/>
+              </w:pBdr>
+              <w:spacing w:after="100" w:before="100" w:line="240"/>
+              <w:ind w:left="100" w:right="100" w:firstLine="0" w:firstLineChars="0"/>
+              <w:rPr>
+                <w:rFonts w:ascii="Arial" w:hAnsi="Arial" w:eastAsia="Arial" w:cs="Arial"/>
+                <w:i w:val="false"/>
+                <w:b w:val="false"/>
+                <w:u w:val="none"/>
+                <w:sz w:val="18"/>
+                <w:szCs w:val="18"/>
+                <w:color w:val="000000"/>
+              </w:rPr>
+            </w:pPr>
+            <w:r>
+              <w:rPr>
+                <w:rFonts w:ascii="Arial" w:hAnsi="Arial" w:eastAsia="Arial" w:cs="Arial"/>
+                <w:i w:val="false"/>
+                <w:b w:val="false"/>
+                <w:u w:val="none"/>
+                <w:sz w:val="18"/>
+                <w:szCs w:val="18"/>
+                <w:color w:val="000000"/>
+              </w:rPr>
+              <w:t xml:space="preserve">0.223</w:t>
+            </w:r>
+          </w:p>
+        </w:tc>
+        <w:tc>
+          <w:tcPr>
+            <w:tcBorders>
+              <w:bottom w:val="none" w:sz="0" w:space="0" w:color="000000"/>
+              <w:top w:val="none" w:sz="0" w:space="0" w:color="000000"/>
+              <w:left w:val="none" w:sz="0" w:space="0" w:color="000000"/>
+              <w:right w:val="none" w:sz="0" w:space="0" w:color="000000"/>
+            </w:tcBorders>
+            <w:shd w:val="clear" w:color="auto" w:fill="FFFFFF"/>
+            <w:tcMar>
+              <w:top w:w="0" w:type="dxa"/>
+              <w:bottom w:w="0" w:type="dxa"/>
+              <w:left w:w="0" w:type="dxa"/>
+              <w:right w:w="0" w:type="dxa"/>
+            </w:tcMar>
+            <w:vAlign w:val="center"/>
+          </w:tcPr>
+          <w:p>
+            <w:pPr>
+              <w:pStyle w:val="Normal"/>
+              <w:jc w:val="left"/>
+              <w:pBdr>
+                <w:bottom w:val="none" w:sz="0" w:space="0" w:color="000000"/>
+                <w:top w:val="none" w:sz="0" w:space="0" w:color="000000"/>
+                <w:left w:val="none" w:sz="0" w:space="0" w:color="000000"/>
+                <w:right w:val="none" w:sz="0" w:space="0" w:color="000000"/>
+              </w:pBdr>
+              <w:spacing w:after="100" w:before="100" w:line="240"/>
+              <w:ind w:left="100" w:right="100" w:firstLine="0" w:firstLineChars="0"/>
+              <w:rPr>
+                <w:rFonts w:ascii="Arial" w:hAnsi="Arial" w:eastAsia="Arial" w:cs="Arial"/>
+                <w:i w:val="false"/>
+                <w:b w:val="false"/>
+                <w:u w:val="none"/>
+                <w:sz w:val="18"/>
+                <w:szCs w:val="18"/>
+                <w:color w:val="000000"/>
+              </w:rPr>
+            </w:pPr>
+            <w:r>
+              <w:rPr>
+                <w:rFonts w:ascii="Arial" w:hAnsi="Arial" w:eastAsia="Arial" w:cs="Arial"/>
+                <w:i w:val="false"/>
+                <w:b w:val="false"/>
+                <w:u w:val="none"/>
+                <w:sz w:val="18"/>
+                <w:szCs w:val="18"/>
+                <w:color w:val="000000"/>
+              </w:rPr>
+              <w:t xml:space="preserve">0.420</w:t>
+            </w:r>
+          </w:p>
+        </w:tc>
+      </w:tr>
+      <w:tr>
+        <w:trPr>
+          <w:trHeight w:val="617" w:hRule="auto"/>
+        </w:trPr>
+        body17
+        <w:tc>
+          <w:tcPr>
+            <w:tcBorders>
+              <w:bottom w:val="none" w:sz="0" w:space="0" w:color="000000"/>
+              <w:top w:val="none" w:sz="0" w:space="0" w:color="000000"/>
+              <w:left w:val="none" w:sz="0" w:space="0" w:color="000000"/>
+              <w:right w:val="none" w:sz="0" w:space="0" w:color="000000"/>
+            </w:tcBorders>
+            <w:shd w:val="clear" w:color="auto" w:fill="FFFFFF"/>
+            <w:tcMar>
+              <w:top w:w="0" w:type="dxa"/>
+              <w:bottom w:w="0" w:type="dxa"/>
+              <w:left w:w="0" w:type="dxa"/>
+              <w:right w:w="0" w:type="dxa"/>
+            </w:tcMar>
+            <w:vAlign w:val="center"/>
+          </w:tcPr>
+          <w:p>
+            <w:pPr>
+              <w:pStyle w:val="Normal"/>
+              <w:jc w:val="left"/>
+              <w:pBdr>
+                <w:bottom w:val="none" w:sz="0" w:space="0" w:color="000000"/>
+                <w:top w:val="none" w:sz="0" w:space="0" w:color="000000"/>
+                <w:left w:val="none" w:sz="0" w:space="0" w:color="000000"/>
+                <w:right w:val="none" w:sz="0" w:space="0" w:color="000000"/>
+              </w:pBdr>
+              <w:spacing w:after="100" w:before="100" w:line="240"/>
+              <w:ind w:left="100" w:right="100" w:firstLine="0" w:firstLineChars="0"/>
+              <w:rPr>
+                <w:rFonts w:ascii="Arial" w:hAnsi="Arial" w:eastAsia="Arial" w:cs="Arial"/>
+                <w:i w:val="false"/>
+                <w:b w:val="false"/>
+                <w:u w:val="none"/>
+                <w:sz w:val="18"/>
+                <w:szCs w:val="18"/>
+                <w:color w:val="000000"/>
+              </w:rPr>
+            </w:pPr>
+            <w:r>
+              <w:rPr>
+                <w:rFonts w:ascii="Arial" w:hAnsi="Arial" w:eastAsia="Arial" w:cs="Arial"/>
+                <w:i w:val="false"/>
+                <w:b w:val="false"/>
+                <w:u w:val="none"/>
+                <w:sz w:val="18"/>
+                <w:szCs w:val="18"/>
+                <w:color w:val="000000"/>
+              </w:rPr>
+              <w:t xml:space="preserve">No</w:t>
+            </w:r>
+          </w:p>
+        </w:tc>
+        <w:tc>
+          <w:tcPr>
+            <w:tcBorders>
+              <w:bottom w:val="none" w:sz="0" w:space="0" w:color="000000"/>
+              <w:top w:val="none" w:sz="0" w:space="0" w:color="000000"/>
+              <w:left w:val="none" w:sz="0" w:space="0" w:color="000000"/>
+              <w:right w:val="none" w:sz="0" w:space="0" w:color="000000"/>
+            </w:tcBorders>
+            <w:shd w:val="clear" w:color="auto" w:fill="FFFFFF"/>
+            <w:tcMar>
+              <w:top w:w="0" w:type="dxa"/>
+              <w:bottom w:w="0" w:type="dxa"/>
+              <w:left w:w="0" w:type="dxa"/>
+              <w:right w:w="0" w:type="dxa"/>
+            </w:tcMar>
+            <w:vAlign w:val="center"/>
+          </w:tcPr>
+          <w:p>
+            <w:pPr>
+              <w:pStyle w:val="Normal"/>
+              <w:jc w:val="left"/>
+              <w:pBdr>
+                <w:bottom w:val="none" w:sz="0" w:space="0" w:color="000000"/>
+                <w:top w:val="none" w:sz="0" w:space="0" w:color="000000"/>
+                <w:left w:val="none" w:sz="0" w:space="0" w:color="000000"/>
+                <w:right w:val="none" w:sz="0" w:space="0" w:color="000000"/>
+              </w:pBdr>
+              <w:spacing w:after="100" w:before="100" w:line="240"/>
+              <w:ind w:left="100" w:right="100" w:firstLine="0" w:firstLineChars="0"/>
+              <w:rPr>
+                <w:rFonts w:ascii="Arial" w:hAnsi="Arial" w:eastAsia="Arial" w:cs="Arial"/>
+                <w:i w:val="false"/>
+                <w:b w:val="false"/>
+                <w:u w:val="none"/>
+                <w:sz w:val="18"/>
+                <w:szCs w:val="18"/>
+                <w:color w:val="000000"/>
+              </w:rPr>
+            </w:pPr>
+            <w:r>
+              <w:rPr>
+                <w:rFonts w:ascii="Arial" w:hAnsi="Arial" w:eastAsia="Arial" w:cs="Arial"/>
+                <w:i w:val="false"/>
+                <w:b w:val="false"/>
+                <w:u w:val="none"/>
+                <w:sz w:val="18"/>
+                <w:szCs w:val="18"/>
+                <w:color w:val="000000"/>
+              </w:rPr>
+              <w:t xml:space="preserve">2 (0.8)</w:t>
+            </w:r>
+          </w:p>
+        </w:tc>
+        <w:tc>
+          <w:tcPr>
+            <w:tcBorders>
+              <w:bottom w:val="none" w:sz="0" w:space="0" w:color="000000"/>
+              <w:top w:val="none" w:sz="0" w:space="0" w:color="000000"/>
+              <w:left w:val="none" w:sz="0" w:space="0" w:color="000000"/>
+              <w:right w:val="none" w:sz="0" w:space="0" w:color="000000"/>
+            </w:tcBorders>
+            <w:shd w:val="clear" w:color="auto" w:fill="FFFFFF"/>
+            <w:tcMar>
+              <w:top w:w="0" w:type="dxa"/>
+              <w:bottom w:w="0" w:type="dxa"/>
+              <w:left w:w="0" w:type="dxa"/>
+              <w:right w:w="0" w:type="dxa"/>
+            </w:tcMar>
+            <w:vAlign w:val="center"/>
+          </w:tcPr>
+          <w:p>
+            <w:pPr>
+              <w:pStyle w:val="Normal"/>
+              <w:jc w:val="left"/>
+              <w:pBdr>
+                <w:bottom w:val="none" w:sz="0" w:space="0" w:color="000000"/>
+                <w:top w:val="none" w:sz="0" w:space="0" w:color="000000"/>
+                <w:left w:val="none" w:sz="0" w:space="0" w:color="000000"/>
+                <w:right w:val="none" w:sz="0" w:space="0" w:color="000000"/>
+              </w:pBdr>
+              <w:spacing w:after="100" w:before="100" w:line="240"/>
+              <w:ind w:left="100" w:right="100" w:firstLine="0" w:firstLineChars="0"/>
+              <w:rPr>
+                <w:rFonts w:ascii="Arial" w:hAnsi="Arial" w:eastAsia="Arial" w:cs="Arial"/>
+                <w:i w:val="false"/>
+                <w:b w:val="false"/>
+                <w:u w:val="none"/>
+                <w:sz w:val="18"/>
+                <w:szCs w:val="18"/>
+                <w:color w:val="000000"/>
+              </w:rPr>
+            </w:pPr>
+            <w:r>
+              <w:rPr>
+                <w:rFonts w:ascii="Arial" w:hAnsi="Arial" w:eastAsia="Arial" w:cs="Arial"/>
+                <w:i w:val="false"/>
+                <w:b w:val="false"/>
+                <w:u w:val="none"/>
+                <w:sz w:val="18"/>
+                <w:szCs w:val="18"/>
+                <w:color w:val="000000"/>
+              </w:rPr>
+              <w:t xml:space="preserve">3 (2.3)</w:t>
+            </w:r>
+          </w:p>
+        </w:tc>
+        <w:tc>
+          <w:tcPr>
+            <w:tcBorders>
+              <w:bottom w:val="none" w:sz="0" w:space="0" w:color="000000"/>
+              <w:top w:val="none" w:sz="0" w:space="0" w:color="000000"/>
+              <w:left w:val="none" w:sz="0" w:space="0" w:color="000000"/>
+              <w:right w:val="none" w:sz="0" w:space="0" w:color="000000"/>
+            </w:tcBorders>
+            <w:shd w:val="clear" w:color="auto" w:fill="FFFFFF"/>
+            <w:tcMar>
+              <w:top w:w="0" w:type="dxa"/>
+              <w:bottom w:w="0" w:type="dxa"/>
+              <w:left w:w="0" w:type="dxa"/>
+              <w:right w:w="0" w:type="dxa"/>
+            </w:tcMar>
+            <w:vAlign w:val="center"/>
+          </w:tcPr>
+          <w:p>
+            <w:pPr>
+              <w:pStyle w:val="Normal"/>
+              <w:jc w:val="left"/>
+              <w:pBdr>
+                <w:bottom w:val="none" w:sz="0" w:space="0" w:color="000000"/>
+                <w:top w:val="none" w:sz="0" w:space="0" w:color="000000"/>
+                <w:left w:val="none" w:sz="0" w:space="0" w:color="000000"/>
+                <w:right w:val="none" w:sz="0" w:space="0" w:color="000000"/>
+              </w:pBdr>
+              <w:spacing w:after="100" w:before="100" w:line="240"/>
+              <w:ind w:left="100" w:right="100" w:firstLine="0" w:firstLineChars="0"/>
+              <w:rPr>
+                <w:rFonts w:ascii="Arial" w:hAnsi="Arial" w:eastAsia="Arial" w:cs="Arial"/>
+                <w:i w:val="false"/>
+                <w:b w:val="false"/>
+                <w:u w:val="none"/>
+                <w:sz w:val="18"/>
+                <w:szCs w:val="18"/>
+                <w:color w:val="000000"/>
+              </w:rPr>
+            </w:pPr>
+            <w:r>
+              <w:rPr>
+                <w:rFonts w:ascii="Arial" w:hAnsi="Arial" w:eastAsia="Arial" w:cs="Arial"/>
+                <w:i w:val="false"/>
+                <w:b w:val="false"/>
+                <w:u w:val="none"/>
+                <w:sz w:val="18"/>
+                <w:szCs w:val="18"/>
+                <w:color w:val="000000"/>
+              </w:rPr>
+              <w:t xml:space="preserve">0 (0.0)</w:t>
+            </w:r>
+          </w:p>
+        </w:tc>
+        <w:tc>
+          <w:tcPr>
+            <w:tcBorders>
+              <w:bottom w:val="none" w:sz="0" w:space="0" w:color="000000"/>
+              <w:top w:val="none" w:sz="0" w:space="0" w:color="000000"/>
+              <w:left w:val="none" w:sz="0" w:space="0" w:color="000000"/>
+              <w:right w:val="none" w:sz="0" w:space="0" w:color="000000"/>
+            </w:tcBorders>
+            <w:shd w:val="clear" w:color="auto" w:fill="FFFFFF"/>
+            <w:tcMar>
+              <w:top w:w="0" w:type="dxa"/>
+              <w:bottom w:w="0" w:type="dxa"/>
+              <w:left w:w="0" w:type="dxa"/>
+              <w:right w:w="0" w:type="dxa"/>
+            </w:tcMar>
+            <w:vAlign w:val="center"/>
+          </w:tcPr>
+          <w:p>
+            <w:pPr>
+              <w:pStyle w:val="Normal"/>
+              <w:jc w:val="left"/>
+              <w:pBdr>
+                <w:bottom w:val="none" w:sz="0" w:space="0" w:color="000000"/>
+                <w:top w:val="none" w:sz="0" w:space="0" w:color="000000"/>
+                <w:left w:val="none" w:sz="0" w:space="0" w:color="000000"/>
+                <w:right w:val="none" w:sz="0" w:space="0" w:color="000000"/>
+              </w:pBdr>
+              <w:spacing w:after="100" w:before="100" w:line="240"/>
+              <w:ind w:left="100" w:right="100" w:firstLine="0" w:firstLineChars="0"/>
+              <w:rPr>
+                <w:rFonts w:ascii="Arial" w:hAnsi="Arial" w:eastAsia="Arial" w:cs="Arial"/>
+                <w:i w:val="false"/>
+                <w:b w:val="false"/>
+                <w:u w:val="none"/>
+                <w:sz w:val="18"/>
+                <w:szCs w:val="18"/>
+                <w:color w:val="000000"/>
+              </w:rPr>
+            </w:pPr>
+            <w:r>
+              <w:rPr>
+                <w:rFonts w:ascii="Arial" w:hAnsi="Arial" w:eastAsia="Arial" w:cs="Arial"/>
+                <w:i w:val="false"/>
+                <w:b w:val="false"/>
+                <w:u w:val="none"/>
+                <w:sz w:val="18"/>
+                <w:szCs w:val="18"/>
+                <w:color w:val="000000"/>
+              </w:rPr>
+              <w:t xml:space="preserve"/>
+            </w:r>
+          </w:p>
+        </w:tc>
+        <w:tc>
+          <w:tcPr>
+            <w:tcBorders>
+              <w:bottom w:val="none" w:sz="0" w:space="0" w:color="000000"/>
+              <w:top w:val="none" w:sz="0" w:space="0" w:color="000000"/>
+              <w:left w:val="none" w:sz="0" w:space="0" w:color="000000"/>
+              <w:right w:val="none" w:sz="0" w:space="0" w:color="000000"/>
+            </w:tcBorders>
+            <w:shd w:val="clear" w:color="auto" w:fill="FFFFFF"/>
+            <w:tcMar>
+              <w:top w:w="0" w:type="dxa"/>
+              <w:bottom w:w="0" w:type="dxa"/>
+              <w:left w:w="0" w:type="dxa"/>
+              <w:right w:w="0" w:type="dxa"/>
+            </w:tcMar>
+            <w:vAlign w:val="center"/>
+          </w:tcPr>
+          <w:p>
+            <w:pPr>
+              <w:pStyle w:val="Normal"/>
+              <w:jc w:val="left"/>
+              <w:pBdr>
+                <w:bottom w:val="none" w:sz="0" w:space="0" w:color="000000"/>
+                <w:top w:val="none" w:sz="0" w:space="0" w:color="000000"/>
+                <w:left w:val="none" w:sz="0" w:space="0" w:color="000000"/>
+                <w:right w:val="none" w:sz="0" w:space="0" w:color="000000"/>
+              </w:pBdr>
+              <w:spacing w:after="100" w:before="100" w:line="240"/>
+              <w:ind w:left="100" w:right="100" w:firstLine="0" w:firstLineChars="0"/>
+              <w:rPr>
+                <w:rFonts w:ascii="Arial" w:hAnsi="Arial" w:eastAsia="Arial" w:cs="Arial"/>
+                <w:i w:val="false"/>
+                <w:b w:val="false"/>
+                <w:u w:val="none"/>
+                <w:sz w:val="18"/>
+                <w:szCs w:val="18"/>
+                <w:color w:val="000000"/>
+              </w:rPr>
+            </w:pPr>
+            <w:r>
+              <w:rPr>
+                <w:rFonts w:ascii="Arial" w:hAnsi="Arial" w:eastAsia="Arial" w:cs="Arial"/>
+                <w:i w:val="false"/>
+                <w:b w:val="false"/>
+                <w:u w:val="none"/>
+                <w:sz w:val="18"/>
+                <w:szCs w:val="18"/>
+                <w:color w:val="000000"/>
+              </w:rPr>
+              <w:t xml:space="preserve"/>
+            </w:r>
+          </w:p>
+        </w:tc>
+      </w:tr>
+      <w:tr>
+        <w:trPr>
+          <w:trHeight w:val="617" w:hRule="auto"/>
+        </w:trPr>
+        body18
+        <w:tc>
+          <w:tcPr>
+            <w:tcBorders>
+              <w:bottom w:val="none" w:sz="0" w:space="0" w:color="000000"/>
+              <w:top w:val="none" w:sz="0" w:space="0" w:color="000000"/>
+              <w:left w:val="none" w:sz="0" w:space="0" w:color="000000"/>
+              <w:right w:val="none" w:sz="0" w:space="0" w:color="000000"/>
+            </w:tcBorders>
+            <w:shd w:val="clear" w:color="auto" w:fill="FFFFFF"/>
+            <w:tcMar>
+              <w:top w:w="0" w:type="dxa"/>
+              <w:bottom w:w="0" w:type="dxa"/>
+              <w:left w:w="0" w:type="dxa"/>
+              <w:right w:w="0" w:type="dxa"/>
+            </w:tcMar>
+            <w:vAlign w:val="center"/>
+          </w:tcPr>
+          <w:p>
+            <w:pPr>
+              <w:pStyle w:val="Normal"/>
+              <w:jc w:val="left"/>
+              <w:pBdr>
+                <w:bottom w:val="none" w:sz="0" w:space="0" w:color="000000"/>
+                <w:top w:val="none" w:sz="0" w:space="0" w:color="000000"/>
+                <w:left w:val="none" w:sz="0" w:space="0" w:color="000000"/>
+                <w:right w:val="none" w:sz="0" w:space="0" w:color="000000"/>
+              </w:pBdr>
+              <w:spacing w:after="100" w:before="100" w:line="240"/>
+              <w:ind w:left="100" w:right="100" w:firstLine="0" w:firstLineChars="0"/>
+              <w:rPr>
+                <w:rFonts w:ascii="Arial" w:hAnsi="Arial" w:eastAsia="Arial" w:cs="Arial"/>
+                <w:i w:val="false"/>
+                <w:b w:val="false"/>
+                <w:u w:val="none"/>
+                <w:sz w:val="18"/>
+                <w:szCs w:val="18"/>
+                <w:color w:val="000000"/>
+              </w:rPr>
+            </w:pPr>
+            <w:r>
+              <w:rPr>
+                <w:rFonts w:ascii="Arial" w:hAnsi="Arial" w:eastAsia="Arial" w:cs="Arial"/>
+                <w:i w:val="false"/>
+                <w:b w:val="false"/>
+                <w:u w:val="none"/>
+                <w:sz w:val="18"/>
+                <w:szCs w:val="18"/>
+                <w:color w:val="000000"/>
+              </w:rPr>
+              <w:t xml:space="preserve">Unknown</w:t>
+            </w:r>
+          </w:p>
+        </w:tc>
+        <w:tc>
+          <w:tcPr>
+            <w:tcBorders>
+              <w:bottom w:val="none" w:sz="0" w:space="0" w:color="000000"/>
+              <w:top w:val="none" w:sz="0" w:space="0" w:color="000000"/>
+              <w:left w:val="none" w:sz="0" w:space="0" w:color="000000"/>
+              <w:right w:val="none" w:sz="0" w:space="0" w:color="000000"/>
+            </w:tcBorders>
+            <w:shd w:val="clear" w:color="auto" w:fill="FFFFFF"/>
+            <w:tcMar>
+              <w:top w:w="0" w:type="dxa"/>
+              <w:bottom w:w="0" w:type="dxa"/>
+              <w:left w:w="0" w:type="dxa"/>
+              <w:right w:w="0" w:type="dxa"/>
+            </w:tcMar>
+            <w:vAlign w:val="center"/>
+          </w:tcPr>
+          <w:p>
+            <w:pPr>
+              <w:pStyle w:val="Normal"/>
+              <w:jc w:val="left"/>
+              <w:pBdr>
+                <w:bottom w:val="none" w:sz="0" w:space="0" w:color="000000"/>
+                <w:top w:val="none" w:sz="0" w:space="0" w:color="000000"/>
+                <w:left w:val="none" w:sz="0" w:space="0" w:color="000000"/>
+                <w:right w:val="none" w:sz="0" w:space="0" w:color="000000"/>
+              </w:pBdr>
+              <w:spacing w:after="100" w:before="100" w:line="240"/>
+              <w:ind w:left="100" w:right="100" w:firstLine="0" w:firstLineChars="0"/>
+              <w:rPr>
+                <w:rFonts w:ascii="Arial" w:hAnsi="Arial" w:eastAsia="Arial" w:cs="Arial"/>
+                <w:i w:val="false"/>
+                <w:b w:val="false"/>
+                <w:u w:val="none"/>
+                <w:sz w:val="18"/>
+                <w:szCs w:val="18"/>
+                <w:color w:val="000000"/>
+              </w:rPr>
+            </w:pPr>
+            <w:r>
+              <w:rPr>
+                <w:rFonts w:ascii="Arial" w:hAnsi="Arial" w:eastAsia="Arial" w:cs="Arial"/>
+                <w:i w:val="false"/>
+                <w:b w:val="false"/>
+                <w:u w:val="none"/>
+                <w:sz w:val="18"/>
+                <w:szCs w:val="18"/>
+                <w:color w:val="000000"/>
+              </w:rPr>
+              <w:t xml:space="preserve">2 (0.8)</w:t>
+            </w:r>
+          </w:p>
+        </w:tc>
+        <w:tc>
+          <w:tcPr>
+            <w:tcBorders>
+              <w:bottom w:val="none" w:sz="0" w:space="0" w:color="000000"/>
+              <w:top w:val="none" w:sz="0" w:space="0" w:color="000000"/>
+              <w:left w:val="none" w:sz="0" w:space="0" w:color="000000"/>
+              <w:right w:val="none" w:sz="0" w:space="0" w:color="000000"/>
+            </w:tcBorders>
+            <w:shd w:val="clear" w:color="auto" w:fill="FFFFFF"/>
+            <w:tcMar>
+              <w:top w:w="0" w:type="dxa"/>
+              <w:bottom w:w="0" w:type="dxa"/>
+              <w:left w:w="0" w:type="dxa"/>
+              <w:right w:w="0" w:type="dxa"/>
+            </w:tcMar>
+            <w:vAlign w:val="center"/>
+          </w:tcPr>
+          <w:p>
+            <w:pPr>
+              <w:pStyle w:val="Normal"/>
+              <w:jc w:val="left"/>
+              <w:pBdr>
+                <w:bottom w:val="none" w:sz="0" w:space="0" w:color="000000"/>
+                <w:top w:val="none" w:sz="0" w:space="0" w:color="000000"/>
+                <w:left w:val="none" w:sz="0" w:space="0" w:color="000000"/>
+                <w:right w:val="none" w:sz="0" w:space="0" w:color="000000"/>
+              </w:pBdr>
+              <w:spacing w:after="100" w:before="100" w:line="240"/>
+              <w:ind w:left="100" w:right="100" w:firstLine="0" w:firstLineChars="0"/>
+              <w:rPr>
+                <w:rFonts w:ascii="Arial" w:hAnsi="Arial" w:eastAsia="Arial" w:cs="Arial"/>
+                <w:i w:val="false"/>
+                <w:b w:val="false"/>
+                <w:u w:val="none"/>
+                <w:sz w:val="18"/>
+                <w:szCs w:val="18"/>
+                <w:color w:val="000000"/>
+              </w:rPr>
+            </w:pPr>
+            <w:r>
+              <w:rPr>
+                <w:rFonts w:ascii="Arial" w:hAnsi="Arial" w:eastAsia="Arial" w:cs="Arial"/>
+                <w:i w:val="false"/>
+                <w:b w:val="false"/>
+                <w:u w:val="none"/>
+                <w:sz w:val="18"/>
+                <w:szCs w:val="18"/>
+                <w:color w:val="000000"/>
+              </w:rPr>
+              <w:t xml:space="preserve">1 (0.8)</w:t>
+            </w:r>
+          </w:p>
+        </w:tc>
+        <w:tc>
+          <w:tcPr>
+            <w:tcBorders>
+              <w:bottom w:val="none" w:sz="0" w:space="0" w:color="000000"/>
+              <w:top w:val="none" w:sz="0" w:space="0" w:color="000000"/>
+              <w:left w:val="none" w:sz="0" w:space="0" w:color="000000"/>
+              <w:right w:val="none" w:sz="0" w:space="0" w:color="000000"/>
+            </w:tcBorders>
+            <w:shd w:val="clear" w:color="auto" w:fill="FFFFFF"/>
+            <w:tcMar>
+              <w:top w:w="0" w:type="dxa"/>
+              <w:bottom w:w="0" w:type="dxa"/>
+              <w:left w:w="0" w:type="dxa"/>
+              <w:right w:w="0" w:type="dxa"/>
+            </w:tcMar>
+            <w:vAlign w:val="center"/>
+          </w:tcPr>
+          <w:p>
+            <w:pPr>
+              <w:pStyle w:val="Normal"/>
+              <w:jc w:val="left"/>
+              <w:pBdr>
+                <w:bottom w:val="none" w:sz="0" w:space="0" w:color="000000"/>
+                <w:top w:val="none" w:sz="0" w:space="0" w:color="000000"/>
+                <w:left w:val="none" w:sz="0" w:space="0" w:color="000000"/>
+                <w:right w:val="none" w:sz="0" w:space="0" w:color="000000"/>
+              </w:pBdr>
+              <w:spacing w:after="100" w:before="100" w:line="240"/>
+              <w:ind w:left="100" w:right="100" w:firstLine="0" w:firstLineChars="0"/>
+              <w:rPr>
+                <w:rFonts w:ascii="Arial" w:hAnsi="Arial" w:eastAsia="Arial" w:cs="Arial"/>
+                <w:i w:val="false"/>
+                <w:b w:val="false"/>
+                <w:u w:val="none"/>
+                <w:sz w:val="18"/>
+                <w:szCs w:val="18"/>
+                <w:color w:val="000000"/>
+              </w:rPr>
+            </w:pPr>
+            <w:r>
+              <w:rPr>
+                <w:rFonts w:ascii="Arial" w:hAnsi="Arial" w:eastAsia="Arial" w:cs="Arial"/>
+                <w:i w:val="false"/>
+                <w:b w:val="false"/>
+                <w:u w:val="none"/>
+                <w:sz w:val="18"/>
+                <w:szCs w:val="18"/>
+                <w:color w:val="000000"/>
+              </w:rPr>
+              <w:t xml:space="preserve">2 (3.2)</w:t>
+            </w:r>
+          </w:p>
+        </w:tc>
+        <w:tc>
+          <w:tcPr>
+            <w:tcBorders>
+              <w:bottom w:val="none" w:sz="0" w:space="0" w:color="000000"/>
+              <w:top w:val="none" w:sz="0" w:space="0" w:color="000000"/>
+              <w:left w:val="none" w:sz="0" w:space="0" w:color="000000"/>
+              <w:right w:val="none" w:sz="0" w:space="0" w:color="000000"/>
+            </w:tcBorders>
+            <w:shd w:val="clear" w:color="auto" w:fill="FFFFFF"/>
+            <w:tcMar>
+              <w:top w:w="0" w:type="dxa"/>
+              <w:bottom w:w="0" w:type="dxa"/>
+              <w:left w:w="0" w:type="dxa"/>
+              <w:right w:w="0" w:type="dxa"/>
+            </w:tcMar>
+            <w:vAlign w:val="center"/>
+          </w:tcPr>
+          <w:p>
+            <w:pPr>
+              <w:pStyle w:val="Normal"/>
+              <w:jc w:val="left"/>
+              <w:pBdr>
+                <w:bottom w:val="none" w:sz="0" w:space="0" w:color="000000"/>
+                <w:top w:val="none" w:sz="0" w:space="0" w:color="000000"/>
+                <w:left w:val="none" w:sz="0" w:space="0" w:color="000000"/>
+                <w:right w:val="none" w:sz="0" w:space="0" w:color="000000"/>
+              </w:pBdr>
+              <w:spacing w:after="100" w:before="100" w:line="240"/>
+              <w:ind w:left="100" w:right="100" w:firstLine="0" w:firstLineChars="0"/>
+              <w:rPr>
+                <w:rFonts w:ascii="Arial" w:hAnsi="Arial" w:eastAsia="Arial" w:cs="Arial"/>
+                <w:i w:val="false"/>
+                <w:b w:val="false"/>
+                <w:u w:val="none"/>
+                <w:sz w:val="18"/>
+                <w:szCs w:val="18"/>
+                <w:color w:val="000000"/>
+              </w:rPr>
+            </w:pPr>
+            <w:r>
+              <w:rPr>
+                <w:rFonts w:ascii="Arial" w:hAnsi="Arial" w:eastAsia="Arial" w:cs="Arial"/>
+                <w:i w:val="false"/>
+                <w:b w:val="false"/>
+                <w:u w:val="none"/>
+                <w:sz w:val="18"/>
+                <w:szCs w:val="18"/>
+                <w:color w:val="000000"/>
+              </w:rPr>
+              <w:t xml:space="preserve"/>
+            </w:r>
+          </w:p>
+        </w:tc>
+        <w:tc>
+          <w:tcPr>
+            <w:tcBorders>
+              <w:bottom w:val="none" w:sz="0" w:space="0" w:color="000000"/>
+              <w:top w:val="none" w:sz="0" w:space="0" w:color="000000"/>
+              <w:left w:val="none" w:sz="0" w:space="0" w:color="000000"/>
+              <w:right w:val="none" w:sz="0" w:space="0" w:color="000000"/>
+            </w:tcBorders>
+            <w:shd w:val="clear" w:color="auto" w:fill="FFFFFF"/>
+            <w:tcMar>
+              <w:top w:w="0" w:type="dxa"/>
+              <w:bottom w:w="0" w:type="dxa"/>
+              <w:left w:w="0" w:type="dxa"/>
+              <w:right w:w="0" w:type="dxa"/>
+            </w:tcMar>
+            <w:vAlign w:val="center"/>
+          </w:tcPr>
+          <w:p>
+            <w:pPr>
+              <w:pStyle w:val="Normal"/>
+              <w:jc w:val="left"/>
+              <w:pBdr>
+                <w:bottom w:val="none" w:sz="0" w:space="0" w:color="000000"/>
+                <w:top w:val="none" w:sz="0" w:space="0" w:color="000000"/>
+                <w:left w:val="none" w:sz="0" w:space="0" w:color="000000"/>
+                <w:right w:val="none" w:sz="0" w:space="0" w:color="000000"/>
+              </w:pBdr>
+              <w:spacing w:after="100" w:before="100" w:line="240"/>
+              <w:ind w:left="100" w:right="100" w:firstLine="0" w:firstLineChars="0"/>
+              <w:rPr>
+                <w:rFonts w:ascii="Arial" w:hAnsi="Arial" w:eastAsia="Arial" w:cs="Arial"/>
+                <w:i w:val="false"/>
+                <w:b w:val="false"/>
+                <w:u w:val="none"/>
+                <w:sz w:val="18"/>
+                <w:szCs w:val="18"/>
+                <w:color w:val="000000"/>
+              </w:rPr>
+            </w:pPr>
+            <w:r>
+              <w:rPr>
+                <w:rFonts w:ascii="Arial" w:hAnsi="Arial" w:eastAsia="Arial" w:cs="Arial"/>
+                <w:i w:val="false"/>
+                <w:b w:val="false"/>
+                <w:u w:val="none"/>
+                <w:sz w:val="18"/>
+                <w:szCs w:val="18"/>
+                <w:color w:val="000000"/>
+              </w:rPr>
+              <w:t xml:space="preserve"/>
+            </w:r>
+          </w:p>
+        </w:tc>
+      </w:tr>
+      <w:tr>
+        <w:trPr>
+          <w:trHeight w:val="617" w:hRule="auto"/>
+        </w:trPr>
+        body19
+        <w:tc>
+          <w:tcPr>
+            <w:tcBorders>
+              <w:bottom w:val="none" w:sz="0" w:space="0" w:color="000000"/>
+              <w:top w:val="none" w:sz="0" w:space="0" w:color="000000"/>
+              <w:left w:val="none" w:sz="0" w:space="0" w:color="000000"/>
+              <w:right w:val="none" w:sz="0" w:space="0" w:color="000000"/>
+            </w:tcBorders>
+            <w:shd w:val="clear" w:color="auto" w:fill="FFFFFF"/>
+            <w:tcMar>
+              <w:top w:w="0" w:type="dxa"/>
+              <w:bottom w:w="0" w:type="dxa"/>
+              <w:left w:w="0" w:type="dxa"/>
+              <w:right w:w="0" w:type="dxa"/>
+            </w:tcMar>
+            <w:vAlign w:val="center"/>
+          </w:tcPr>
+          <w:p>
+            <w:pPr>
+              <w:pStyle w:val="Normal"/>
+              <w:jc w:val="left"/>
+              <w:pBdr>
+                <w:bottom w:val="none" w:sz="0" w:space="0" w:color="000000"/>
+                <w:top w:val="none" w:sz="0" w:space="0" w:color="000000"/>
+                <w:left w:val="none" w:sz="0" w:space="0" w:color="000000"/>
+                <w:right w:val="none" w:sz="0" w:space="0" w:color="000000"/>
+              </w:pBdr>
+              <w:spacing w:after="100" w:before="100" w:line="240"/>
+              <w:ind w:left="100" w:right="100" w:firstLine="0" w:firstLineChars="0"/>
+              <w:rPr>
+                <w:rFonts w:ascii="Arial" w:hAnsi="Arial" w:eastAsia="Arial" w:cs="Arial"/>
+                <w:i w:val="false"/>
+                <w:b w:val="false"/>
+                <w:u w:val="none"/>
+                <w:sz w:val="18"/>
+                <w:szCs w:val="18"/>
+                <w:color w:val="000000"/>
+              </w:rPr>
+            </w:pPr>
+            <w:r>
+              <w:rPr>
+                <w:rFonts w:ascii="Arial" w:hAnsi="Arial" w:eastAsia="Arial" w:cs="Arial"/>
+                <w:i w:val="false"/>
+                <w:b w:val="false"/>
+                <w:u w:val="none"/>
+                <w:sz w:val="18"/>
+                <w:szCs w:val="18"/>
+                <w:color w:val="000000"/>
+              </w:rPr>
+              <w:t xml:space="preserve">Yes</w:t>
+            </w:r>
+          </w:p>
+        </w:tc>
+        <w:tc>
+          <w:tcPr>
+            <w:tcBorders>
+              <w:bottom w:val="none" w:sz="0" w:space="0" w:color="000000"/>
+              <w:top w:val="none" w:sz="0" w:space="0" w:color="000000"/>
+              <w:left w:val="none" w:sz="0" w:space="0" w:color="000000"/>
+              <w:right w:val="none" w:sz="0" w:space="0" w:color="000000"/>
+            </w:tcBorders>
+            <w:shd w:val="clear" w:color="auto" w:fill="FFFFFF"/>
+            <w:tcMar>
+              <w:top w:w="0" w:type="dxa"/>
+              <w:bottom w:w="0" w:type="dxa"/>
+              <w:left w:w="0" w:type="dxa"/>
+              <w:right w:w="0" w:type="dxa"/>
+            </w:tcMar>
+            <w:vAlign w:val="center"/>
+          </w:tcPr>
+          <w:p>
+            <w:pPr>
+              <w:pStyle w:val="Normal"/>
+              <w:jc w:val="left"/>
+              <w:pBdr>
+                <w:bottom w:val="none" w:sz="0" w:space="0" w:color="000000"/>
+                <w:top w:val="none" w:sz="0" w:space="0" w:color="000000"/>
+                <w:left w:val="none" w:sz="0" w:space="0" w:color="000000"/>
+                <w:right w:val="none" w:sz="0" w:space="0" w:color="000000"/>
+              </w:pBdr>
+              <w:spacing w:after="100" w:before="100" w:line="240"/>
+              <w:ind w:left="100" w:right="100" w:firstLine="0" w:firstLineChars="0"/>
+              <w:rPr>
+                <w:rFonts w:ascii="Arial" w:hAnsi="Arial" w:eastAsia="Arial" w:cs="Arial"/>
+                <w:i w:val="false"/>
+                <w:b w:val="false"/>
+                <w:u w:val="none"/>
+                <w:sz w:val="18"/>
+                <w:szCs w:val="18"/>
+                <w:color w:val="000000"/>
+              </w:rPr>
+            </w:pPr>
+            <w:r>
+              <w:rPr>
+                <w:rFonts w:ascii="Arial" w:hAnsi="Arial" w:eastAsia="Arial" w:cs="Arial"/>
+                <w:i w:val="false"/>
+                <w:b w:val="false"/>
+                <w:u w:val="none"/>
+                <w:sz w:val="18"/>
+                <w:szCs w:val="18"/>
+                <w:color w:val="000000"/>
+              </w:rPr>
+              <w:t xml:space="preserve">261 (98.5)</w:t>
+            </w:r>
+          </w:p>
+        </w:tc>
+        <w:tc>
+          <w:tcPr>
+            <w:tcBorders>
+              <w:bottom w:val="none" w:sz="0" w:space="0" w:color="000000"/>
+              <w:top w:val="none" w:sz="0" w:space="0" w:color="000000"/>
+              <w:left w:val="none" w:sz="0" w:space="0" w:color="000000"/>
+              <w:right w:val="none" w:sz="0" w:space="0" w:color="000000"/>
+            </w:tcBorders>
+            <w:shd w:val="clear" w:color="auto" w:fill="FFFFFF"/>
+            <w:tcMar>
+              <w:top w:w="0" w:type="dxa"/>
+              <w:bottom w:w="0" w:type="dxa"/>
+              <w:left w:w="0" w:type="dxa"/>
+              <w:right w:w="0" w:type="dxa"/>
+            </w:tcMar>
+            <w:vAlign w:val="center"/>
+          </w:tcPr>
+          <w:p>
+            <w:pPr>
+              <w:pStyle w:val="Normal"/>
+              <w:jc w:val="left"/>
+              <w:pBdr>
+                <w:bottom w:val="none" w:sz="0" w:space="0" w:color="000000"/>
+                <w:top w:val="none" w:sz="0" w:space="0" w:color="000000"/>
+                <w:left w:val="none" w:sz="0" w:space="0" w:color="000000"/>
+                <w:right w:val="none" w:sz="0" w:space="0" w:color="000000"/>
+              </w:pBdr>
+              <w:spacing w:after="100" w:before="100" w:line="240"/>
+              <w:ind w:left="100" w:right="100" w:firstLine="0" w:firstLineChars="0"/>
+              <w:rPr>
+                <w:rFonts w:ascii="Arial" w:hAnsi="Arial" w:eastAsia="Arial" w:cs="Arial"/>
+                <w:i w:val="false"/>
+                <w:b w:val="false"/>
+                <w:u w:val="none"/>
+                <w:sz w:val="18"/>
+                <w:szCs w:val="18"/>
+                <w:color w:val="000000"/>
+              </w:rPr>
+            </w:pPr>
+            <w:r>
+              <w:rPr>
+                <w:rFonts w:ascii="Arial" w:hAnsi="Arial" w:eastAsia="Arial" w:cs="Arial"/>
+                <w:i w:val="false"/>
+                <w:b w:val="false"/>
+                <w:u w:val="none"/>
+                <w:sz w:val="18"/>
+                <w:szCs w:val="18"/>
+                <w:color w:val="000000"/>
+              </w:rPr>
+              <w:t xml:space="preserve">124 (96.9)</w:t>
+            </w:r>
+          </w:p>
+        </w:tc>
+        <w:tc>
+          <w:tcPr>
+            <w:tcBorders>
+              <w:bottom w:val="none" w:sz="0" w:space="0" w:color="000000"/>
+              <w:top w:val="none" w:sz="0" w:space="0" w:color="000000"/>
+              <w:left w:val="none" w:sz="0" w:space="0" w:color="000000"/>
+              <w:right w:val="none" w:sz="0" w:space="0" w:color="000000"/>
+            </w:tcBorders>
+            <w:shd w:val="clear" w:color="auto" w:fill="FFFFFF"/>
+            <w:tcMar>
+              <w:top w:w="0" w:type="dxa"/>
+              <w:bottom w:w="0" w:type="dxa"/>
+              <w:left w:w="0" w:type="dxa"/>
+              <w:right w:w="0" w:type="dxa"/>
+            </w:tcMar>
+            <w:vAlign w:val="center"/>
+          </w:tcPr>
+          <w:p>
+            <w:pPr>
+              <w:pStyle w:val="Normal"/>
+              <w:jc w:val="left"/>
+              <w:pBdr>
+                <w:bottom w:val="none" w:sz="0" w:space="0" w:color="000000"/>
+                <w:top w:val="none" w:sz="0" w:space="0" w:color="000000"/>
+                <w:left w:val="none" w:sz="0" w:space="0" w:color="000000"/>
+                <w:right w:val="none" w:sz="0" w:space="0" w:color="000000"/>
+              </w:pBdr>
+              <w:spacing w:after="100" w:before="100" w:line="240"/>
+              <w:ind w:left="100" w:right="100" w:firstLine="0" w:firstLineChars="0"/>
+              <w:rPr>
+                <w:rFonts w:ascii="Arial" w:hAnsi="Arial" w:eastAsia="Arial" w:cs="Arial"/>
+                <w:i w:val="false"/>
+                <w:b w:val="false"/>
+                <w:u w:val="none"/>
+                <w:sz w:val="18"/>
+                <w:szCs w:val="18"/>
+                <w:color w:val="000000"/>
+              </w:rPr>
+            </w:pPr>
+            <w:r>
+              <w:rPr>
+                <w:rFonts w:ascii="Arial" w:hAnsi="Arial" w:eastAsia="Arial" w:cs="Arial"/>
+                <w:i w:val="false"/>
+                <w:b w:val="false"/>
+                <w:u w:val="none"/>
+                <w:sz w:val="18"/>
+                <w:szCs w:val="18"/>
+                <w:color w:val="000000"/>
+              </w:rPr>
+              <w:t xml:space="preserve">61 (96.8)</w:t>
+            </w:r>
+          </w:p>
+        </w:tc>
+        <w:tc>
+          <w:tcPr>
+            <w:tcBorders>
+              <w:bottom w:val="none" w:sz="0" w:space="0" w:color="000000"/>
+              <w:top w:val="none" w:sz="0" w:space="0" w:color="000000"/>
+              <w:left w:val="none" w:sz="0" w:space="0" w:color="000000"/>
+              <w:right w:val="none" w:sz="0" w:space="0" w:color="000000"/>
+            </w:tcBorders>
+            <w:shd w:val="clear" w:color="auto" w:fill="FFFFFF"/>
+            <w:tcMar>
+              <w:top w:w="0" w:type="dxa"/>
+              <w:bottom w:w="0" w:type="dxa"/>
+              <w:left w:w="0" w:type="dxa"/>
+              <w:right w:w="0" w:type="dxa"/>
+            </w:tcMar>
+            <w:vAlign w:val="center"/>
+          </w:tcPr>
+          <w:p>
+            <w:pPr>
+              <w:pStyle w:val="Normal"/>
+              <w:jc w:val="left"/>
+              <w:pBdr>
+                <w:bottom w:val="none" w:sz="0" w:space="0" w:color="000000"/>
+                <w:top w:val="none" w:sz="0" w:space="0" w:color="000000"/>
+                <w:left w:val="none" w:sz="0" w:space="0" w:color="000000"/>
+                <w:right w:val="none" w:sz="0" w:space="0" w:color="000000"/>
+              </w:pBdr>
+              <w:spacing w:after="100" w:before="100" w:line="240"/>
+              <w:ind w:left="100" w:right="100" w:firstLine="0" w:firstLineChars="0"/>
+              <w:rPr>
+                <w:rFonts w:ascii="Arial" w:hAnsi="Arial" w:eastAsia="Arial" w:cs="Arial"/>
+                <w:i w:val="false"/>
+                <w:b w:val="false"/>
+                <w:u w:val="none"/>
+                <w:sz w:val="18"/>
+                <w:szCs w:val="18"/>
+                <w:color w:val="000000"/>
+              </w:rPr>
+            </w:pPr>
+            <w:r>
+              <w:rPr>
+                <w:rFonts w:ascii="Arial" w:hAnsi="Arial" w:eastAsia="Arial" w:cs="Arial"/>
+                <w:i w:val="false"/>
+                <w:b w:val="false"/>
+                <w:u w:val="none"/>
+                <w:sz w:val="18"/>
+                <w:szCs w:val="18"/>
+                <w:color w:val="000000"/>
+              </w:rPr>
+              <w:t xml:space="preserve"/>
+            </w:r>
+          </w:p>
+        </w:tc>
+        <w:tc>
+          <w:tcPr>
+            <w:tcBorders>
+              <w:bottom w:val="none" w:sz="0" w:space="0" w:color="000000"/>
+              <w:top w:val="none" w:sz="0" w:space="0" w:color="000000"/>
+              <w:left w:val="none" w:sz="0" w:space="0" w:color="000000"/>
+              <w:right w:val="none" w:sz="0" w:space="0" w:color="000000"/>
+            </w:tcBorders>
+            <w:shd w:val="clear" w:color="auto" w:fill="FFFFFF"/>
+            <w:tcMar>
+              <w:top w:w="0" w:type="dxa"/>
+              <w:bottom w:w="0" w:type="dxa"/>
+              <w:left w:w="0" w:type="dxa"/>
+              <w:right w:w="0" w:type="dxa"/>
+            </w:tcMar>
+            <w:vAlign w:val="center"/>
+          </w:tcPr>
+          <w:p>
+            <w:pPr>
+              <w:pStyle w:val="Normal"/>
+              <w:jc w:val="left"/>
+              <w:pBdr>
+                <w:bottom w:val="none" w:sz="0" w:space="0" w:color="000000"/>
+                <w:top w:val="none" w:sz="0" w:space="0" w:color="000000"/>
+                <w:left w:val="none" w:sz="0" w:space="0" w:color="000000"/>
+                <w:right w:val="none" w:sz="0" w:space="0" w:color="000000"/>
+              </w:pBdr>
+              <w:spacing w:after="100" w:before="100" w:line="240"/>
+              <w:ind w:left="100" w:right="100" w:firstLine="0" w:firstLineChars="0"/>
+              <w:rPr>
+                <w:rFonts w:ascii="Arial" w:hAnsi="Arial" w:eastAsia="Arial" w:cs="Arial"/>
+                <w:i w:val="false"/>
+                <w:b w:val="false"/>
+                <w:u w:val="none"/>
+                <w:sz w:val="18"/>
+                <w:szCs w:val="18"/>
+                <w:color w:val="000000"/>
+              </w:rPr>
+            </w:pPr>
+            <w:r>
+              <w:rPr>
+                <w:rFonts w:ascii="Arial" w:hAnsi="Arial" w:eastAsia="Arial" w:cs="Arial"/>
+                <w:i w:val="false"/>
+                <w:b w:val="false"/>
+                <w:u w:val="none"/>
+                <w:sz w:val="18"/>
+                <w:szCs w:val="18"/>
+                <w:color w:val="000000"/>
+              </w:rPr>
+              <w:t xml:space="preserve"/>
+            </w:r>
+          </w:p>
+        </w:tc>
+      </w:tr>
+      <w:tr>
+        <w:trPr>
+          <w:trHeight w:val="617" w:hRule="auto"/>
+        </w:trPr>
+        body20
+        <w:tc>
+          <w:tcPr>
+            <w:tcBorders>
               <w:bottom w:val="single" w:sz="12" w:space="0" w:color="000000"/>
               <w:top w:val="none" w:sz="0" w:space="0" w:color="000000"/>
               <w:left w:val="none" w:sz="0" w:space="0" w:color="000000"/>
@@ -4939,7 +6559,7 @@
                 <w:szCs w:val="18"/>
                 <w:color w:val="000000"/>
               </w:rPr>
-              <w:t xml:space="preserve">Pain with tampon test (median [IQR])</w:t>
+              <w:t xml:space="preserve">Focus during bladder task (median [IQR])</w:t>
             </w:r>
           </w:p>
         </w:tc>
@@ -4992,7 +6612,7 @@
                 <w:szCs w:val="18"/>
                 <w:color w:val="000000"/>
               </w:rPr>
-              <w:t xml:space="preserve">3.00 [0.00, 99.00]</w:t>
+              <w:t xml:space="preserve">78.00 [66.00, 90.00]</w:t>
             </w:r>
           </w:p>
         </w:tc>
@@ -5045,7 +6665,7 @@
                 <w:szCs w:val="18"/>
                 <w:color w:val="000000"/>
               </w:rPr>
-              <w:t xml:space="preserve">3.00 [1.00, 7.00]</w:t>
+              <w:t xml:space="preserve">80.00 [71.00, 90.50]</w:t>
             </w:r>
           </w:p>
         </w:tc>
@@ -5098,7 +6718,7 @@
                 <w:szCs w:val="18"/>
                 <w:color w:val="000000"/>
               </w:rPr>
-              <w:t xml:space="preserve">1.00 [0.00, 99.00]</w:t>
+              <w:t xml:space="preserve">76.00 [62.00, 88.00]</w:t>
             </w:r>
           </w:p>
         </w:tc>
@@ -5151,7 +6771,7 @@
                 <w:szCs w:val="18"/>
                 <w:color w:val="000000"/>
               </w:rPr>
-              <w:t xml:space="preserve">0.355</w:t>
+              <w:t xml:space="preserve">0.197</w:t>
             </w:r>
           </w:p>
         </w:tc>
@@ -5204,7 +6824,7 @@
                 <w:szCs w:val="18"/>
                 <w:color w:val="000000"/>
               </w:rPr>
-              <w:t xml:space="preserve">0.266</w:t>
+              <w:t xml:space="preserve">0.475</w:t>
             </w:r>
           </w:p>
         </w:tc>

</xml_diff>

<commit_message>
Re-run with 2 additional participants
</commit_message>
<xml_diff>
--- a/Tables/Final/Table10_vbt.docx
+++ b/Tables/Final/Table10_vbt.docx
@@ -19,7 +19,7 @@
       <w:tblGrid>
         <w:gridCol w:w="4446"/>
         <w:gridCol w:w="2735"/>
-        <w:gridCol w:w="3639"/>
+        <w:gridCol w:w="2735"/>
         <w:gridCol w:w="2735"/>
         <w:gridCol w:w="1090"/>
         <w:gridCol w:w="1585"/>
@@ -132,7 +132,7 @@
                 <w:szCs w:val="18"/>
                 <w:color w:val="000000"/>
               </w:rPr>
-              <w:t xml:space="preserve">Dysmenorrhea</w:t>
+              <w:t xml:space="preserve">Control</w:t>
             </w:r>
           </w:p>
         </w:tc>
@@ -185,7 +185,7 @@
                 <w:szCs w:val="18"/>
                 <w:color w:val="000000"/>
               </w:rPr>
-              <w:t xml:space="preserve">Dysmenorrhea plus Bladder Pain</w:t>
+              <w:t xml:space="preserve">Dysmenorrhea</w:t>
             </w:r>
           </w:p>
         </w:tc>
@@ -238,7 +238,7 @@
                 <w:szCs w:val="18"/>
                 <w:color w:val="000000"/>
               </w:rPr>
-              <w:t xml:space="preserve">Pain Free Control</w:t>
+              <w:t xml:space="preserve">DYSB</w:t>
             </w:r>
           </w:p>
         </w:tc>
@@ -456,7 +456,7 @@
                 <w:szCs w:val="18"/>
                 <w:color w:val="000000"/>
               </w:rPr>
-              <w:t xml:space="preserve">265</w:t>
+              <w:t xml:space="preserve">63</w:t>
             </w:r>
           </w:p>
         </w:tc>
@@ -509,7 +509,7 @@
                 <w:szCs w:val="18"/>
                 <w:color w:val="000000"/>
               </w:rPr>
-              <w:t xml:space="preserve">128</w:t>
+              <w:t xml:space="preserve">266</w:t>
             </w:r>
           </w:p>
         </w:tc>
@@ -562,7 +562,7 @@
                 <w:szCs w:val="18"/>
                 <w:color w:val="000000"/>
               </w:rPr>
-              <w:t xml:space="preserve">63</w:t>
+              <w:t xml:space="preserve">129</w:t>
             </w:r>
           </w:p>
         </w:tc>
@@ -780,112 +780,6 @@
                 <w:szCs w:val="18"/>
                 <w:color w:val="000000"/>
               </w:rPr>
-              <w:t xml:space="preserve">22.00 [14.00, 32.00]</w:t>
-            </w:r>
-          </w:p>
-        </w:tc>
-        <w:tc>
-          <w:tcPr>
-            <w:tcBorders>
-              <w:bottom w:val="none" w:sz="0" w:space="0" w:color="000000"/>
-              <w:top w:val="none" w:sz="0" w:space="0" w:color="000000"/>
-              <w:left w:val="none" w:sz="0" w:space="0" w:color="000000"/>
-              <w:right w:val="none" w:sz="0" w:space="0" w:color="000000"/>
-            </w:tcBorders>
-            <w:shd w:val="clear" w:color="auto" w:fill="FFFFFF"/>
-            <w:tcMar>
-              <w:top w:w="0" w:type="dxa"/>
-              <w:bottom w:w="0" w:type="dxa"/>
-              <w:left w:w="0" w:type="dxa"/>
-              <w:right w:w="0" w:type="dxa"/>
-            </w:tcMar>
-            <w:vAlign w:val="center"/>
-          </w:tcPr>
-          <w:p>
-            <w:pPr>
-              <w:pStyle w:val="Normal"/>
-              <w:jc w:val="left"/>
-              <w:pBdr>
-                <w:bottom w:val="none" w:sz="0" w:space="0" w:color="000000"/>
-                <w:top w:val="none" w:sz="0" w:space="0" w:color="000000"/>
-                <w:left w:val="none" w:sz="0" w:space="0" w:color="000000"/>
-                <w:right w:val="none" w:sz="0" w:space="0" w:color="000000"/>
-              </w:pBdr>
-              <w:spacing w:after="100" w:before="100" w:line="240"/>
-              <w:ind w:left="100" w:right="100" w:firstLine="0" w:firstLineChars="0"/>
-              <w:rPr>
-                <w:rFonts w:ascii="Arial" w:hAnsi="Arial" w:eastAsia="Arial" w:cs="Arial"/>
-                <w:i w:val="false"/>
-                <w:b w:val="false"/>
-                <w:u w:val="none"/>
-                <w:sz w:val="18"/>
-                <w:szCs w:val="18"/>
-                <w:color w:val="000000"/>
-              </w:rPr>
-            </w:pPr>
-            <w:r>
-              <w:rPr>
-                <w:rFonts w:ascii="Arial" w:hAnsi="Arial" w:eastAsia="Arial" w:cs="Arial"/>
-                <w:i w:val="false"/>
-                <w:b w:val="false"/>
-                <w:u w:val="none"/>
-                <w:sz w:val="18"/>
-                <w:szCs w:val="18"/>
-                <w:color w:val="000000"/>
-              </w:rPr>
-              <w:t xml:space="preserve">19.00 [13.00, 28.00]</w:t>
-            </w:r>
-          </w:p>
-        </w:tc>
-        <w:tc>
-          <w:tcPr>
-            <w:tcBorders>
-              <w:bottom w:val="none" w:sz="0" w:space="0" w:color="000000"/>
-              <w:top w:val="none" w:sz="0" w:space="0" w:color="000000"/>
-              <w:left w:val="none" w:sz="0" w:space="0" w:color="000000"/>
-              <w:right w:val="none" w:sz="0" w:space="0" w:color="000000"/>
-            </w:tcBorders>
-            <w:shd w:val="clear" w:color="auto" w:fill="FFFFFF"/>
-            <w:tcMar>
-              <w:top w:w="0" w:type="dxa"/>
-              <w:bottom w:w="0" w:type="dxa"/>
-              <w:left w:w="0" w:type="dxa"/>
-              <w:right w:w="0" w:type="dxa"/>
-            </w:tcMar>
-            <w:vAlign w:val="center"/>
-          </w:tcPr>
-          <w:p>
-            <w:pPr>
-              <w:pStyle w:val="Normal"/>
-              <w:jc w:val="left"/>
-              <w:pBdr>
-                <w:bottom w:val="none" w:sz="0" w:space="0" w:color="000000"/>
-                <w:top w:val="none" w:sz="0" w:space="0" w:color="000000"/>
-                <w:left w:val="none" w:sz="0" w:space="0" w:color="000000"/>
-                <w:right w:val="none" w:sz="0" w:space="0" w:color="000000"/>
-              </w:pBdr>
-              <w:spacing w:after="100" w:before="100" w:line="240"/>
-              <w:ind w:left="100" w:right="100" w:firstLine="0" w:firstLineChars="0"/>
-              <w:rPr>
-                <w:rFonts w:ascii="Arial" w:hAnsi="Arial" w:eastAsia="Arial" w:cs="Arial"/>
-                <w:i w:val="false"/>
-                <w:b w:val="false"/>
-                <w:u w:val="none"/>
-                <w:sz w:val="18"/>
-                <w:szCs w:val="18"/>
-                <w:color w:val="000000"/>
-              </w:rPr>
-            </w:pPr>
-            <w:r>
-              <w:rPr>
-                <w:rFonts w:ascii="Arial" w:hAnsi="Arial" w:eastAsia="Arial" w:cs="Arial"/>
-                <w:i w:val="false"/>
-                <w:b w:val="false"/>
-                <w:u w:val="none"/>
-                <w:sz w:val="18"/>
-                <w:szCs w:val="18"/>
-                <w:color w:val="000000"/>
-              </w:rPr>
               <w:t xml:space="preserve">21.00 [14.00, 35.50]</w:t>
             </w:r>
           </w:p>
@@ -939,60 +833,166 @@
                 <w:szCs w:val="18"/>
                 <w:color w:val="000000"/>
               </w:rPr>
-              <w:t xml:space="preserve">0.197</w:t>
-            </w:r>
-          </w:p>
-        </w:tc>
-        <w:tc>
-          <w:tcPr>
-            <w:tcBorders>
-              <w:bottom w:val="none" w:sz="0" w:space="0" w:color="000000"/>
-              <w:top w:val="none" w:sz="0" w:space="0" w:color="000000"/>
-              <w:left w:val="none" w:sz="0" w:space="0" w:color="000000"/>
-              <w:right w:val="none" w:sz="0" w:space="0" w:color="000000"/>
-            </w:tcBorders>
-            <w:shd w:val="clear" w:color="auto" w:fill="FFFFFF"/>
-            <w:tcMar>
-              <w:top w:w="0" w:type="dxa"/>
-              <w:bottom w:w="0" w:type="dxa"/>
-              <w:left w:w="0" w:type="dxa"/>
-              <w:right w:w="0" w:type="dxa"/>
-            </w:tcMar>
-            <w:vAlign w:val="center"/>
-          </w:tcPr>
-          <w:p>
-            <w:pPr>
-              <w:pStyle w:val="Normal"/>
-              <w:jc w:val="left"/>
-              <w:pBdr>
-                <w:bottom w:val="none" w:sz="0" w:space="0" w:color="000000"/>
-                <w:top w:val="none" w:sz="0" w:space="0" w:color="000000"/>
-                <w:left w:val="none" w:sz="0" w:space="0" w:color="000000"/>
-                <w:right w:val="none" w:sz="0" w:space="0" w:color="000000"/>
-              </w:pBdr>
-              <w:spacing w:after="100" w:before="100" w:line="240"/>
-              <w:ind w:left="100" w:right="100" w:firstLine="0" w:firstLineChars="0"/>
-              <w:rPr>
-                <w:rFonts w:ascii="Arial" w:hAnsi="Arial" w:eastAsia="Arial" w:cs="Arial"/>
-                <w:i w:val="false"/>
-                <w:b w:val="false"/>
-                <w:u w:val="none"/>
-                <w:sz w:val="18"/>
-                <w:szCs w:val="18"/>
-                <w:color w:val="000000"/>
-              </w:rPr>
-            </w:pPr>
-            <w:r>
-              <w:rPr>
-                <w:rFonts w:ascii="Arial" w:hAnsi="Arial" w:eastAsia="Arial" w:cs="Arial"/>
-                <w:i w:val="false"/>
-                <w:b w:val="false"/>
-                <w:u w:val="none"/>
-                <w:sz w:val="18"/>
-                <w:szCs w:val="18"/>
-                <w:color w:val="000000"/>
-              </w:rPr>
-              <w:t xml:space="preserve">0.073</w:t>
+              <w:t xml:space="preserve">22.00 [14.25, 32.75]</w:t>
+            </w:r>
+          </w:p>
+        </w:tc>
+        <w:tc>
+          <w:tcPr>
+            <w:tcBorders>
+              <w:bottom w:val="none" w:sz="0" w:space="0" w:color="000000"/>
+              <w:top w:val="none" w:sz="0" w:space="0" w:color="000000"/>
+              <w:left w:val="none" w:sz="0" w:space="0" w:color="000000"/>
+              <w:right w:val="none" w:sz="0" w:space="0" w:color="000000"/>
+            </w:tcBorders>
+            <w:shd w:val="clear" w:color="auto" w:fill="FFFFFF"/>
+            <w:tcMar>
+              <w:top w:w="0" w:type="dxa"/>
+              <w:bottom w:w="0" w:type="dxa"/>
+              <w:left w:w="0" w:type="dxa"/>
+              <w:right w:w="0" w:type="dxa"/>
+            </w:tcMar>
+            <w:vAlign w:val="center"/>
+          </w:tcPr>
+          <w:p>
+            <w:pPr>
+              <w:pStyle w:val="Normal"/>
+              <w:jc w:val="left"/>
+              <w:pBdr>
+                <w:bottom w:val="none" w:sz="0" w:space="0" w:color="000000"/>
+                <w:top w:val="none" w:sz="0" w:space="0" w:color="000000"/>
+                <w:left w:val="none" w:sz="0" w:space="0" w:color="000000"/>
+                <w:right w:val="none" w:sz="0" w:space="0" w:color="000000"/>
+              </w:pBdr>
+              <w:spacing w:after="100" w:before="100" w:line="240"/>
+              <w:ind w:left="100" w:right="100" w:firstLine="0" w:firstLineChars="0"/>
+              <w:rPr>
+                <w:rFonts w:ascii="Arial" w:hAnsi="Arial" w:eastAsia="Arial" w:cs="Arial"/>
+                <w:i w:val="false"/>
+                <w:b w:val="false"/>
+                <w:u w:val="none"/>
+                <w:sz w:val="18"/>
+                <w:szCs w:val="18"/>
+                <w:color w:val="000000"/>
+              </w:rPr>
+            </w:pPr>
+            <w:r>
+              <w:rPr>
+                <w:rFonts w:ascii="Arial" w:hAnsi="Arial" w:eastAsia="Arial" w:cs="Arial"/>
+                <w:i w:val="false"/>
+                <w:b w:val="false"/>
+                <w:u w:val="none"/>
+                <w:sz w:val="18"/>
+                <w:szCs w:val="18"/>
+                <w:color w:val="000000"/>
+              </w:rPr>
+              <w:t xml:space="preserve">19.00 [13.00, 28.50]</w:t>
+            </w:r>
+          </w:p>
+        </w:tc>
+        <w:tc>
+          <w:tcPr>
+            <w:tcBorders>
+              <w:bottom w:val="none" w:sz="0" w:space="0" w:color="000000"/>
+              <w:top w:val="none" w:sz="0" w:space="0" w:color="000000"/>
+              <w:left w:val="none" w:sz="0" w:space="0" w:color="000000"/>
+              <w:right w:val="none" w:sz="0" w:space="0" w:color="000000"/>
+            </w:tcBorders>
+            <w:shd w:val="clear" w:color="auto" w:fill="FFFFFF"/>
+            <w:tcMar>
+              <w:top w:w="0" w:type="dxa"/>
+              <w:bottom w:w="0" w:type="dxa"/>
+              <w:left w:w="0" w:type="dxa"/>
+              <w:right w:w="0" w:type="dxa"/>
+            </w:tcMar>
+            <w:vAlign w:val="center"/>
+          </w:tcPr>
+          <w:p>
+            <w:pPr>
+              <w:pStyle w:val="Normal"/>
+              <w:jc w:val="left"/>
+              <w:pBdr>
+                <w:bottom w:val="none" w:sz="0" w:space="0" w:color="000000"/>
+                <w:top w:val="none" w:sz="0" w:space="0" w:color="000000"/>
+                <w:left w:val="none" w:sz="0" w:space="0" w:color="000000"/>
+                <w:right w:val="none" w:sz="0" w:space="0" w:color="000000"/>
+              </w:pBdr>
+              <w:spacing w:after="100" w:before="100" w:line="240"/>
+              <w:ind w:left="100" w:right="100" w:firstLine="0" w:firstLineChars="0"/>
+              <w:rPr>
+                <w:rFonts w:ascii="Arial" w:hAnsi="Arial" w:eastAsia="Arial" w:cs="Arial"/>
+                <w:i w:val="false"/>
+                <w:b w:val="false"/>
+                <w:u w:val="none"/>
+                <w:sz w:val="18"/>
+                <w:szCs w:val="18"/>
+                <w:color w:val="000000"/>
+              </w:rPr>
+            </w:pPr>
+            <w:r>
+              <w:rPr>
+                <w:rFonts w:ascii="Arial" w:hAnsi="Arial" w:eastAsia="Arial" w:cs="Arial"/>
+                <w:i w:val="false"/>
+                <w:b w:val="false"/>
+                <w:u w:val="none"/>
+                <w:sz w:val="18"/>
+                <w:szCs w:val="18"/>
+                <w:color w:val="000000"/>
+              </w:rPr>
+              <w:t xml:space="preserve">0.226</w:t>
+            </w:r>
+          </w:p>
+        </w:tc>
+        <w:tc>
+          <w:tcPr>
+            <w:tcBorders>
+              <w:bottom w:val="none" w:sz="0" w:space="0" w:color="000000"/>
+              <w:top w:val="none" w:sz="0" w:space="0" w:color="000000"/>
+              <w:left w:val="none" w:sz="0" w:space="0" w:color="000000"/>
+              <w:right w:val="none" w:sz="0" w:space="0" w:color="000000"/>
+            </w:tcBorders>
+            <w:shd w:val="clear" w:color="auto" w:fill="FFFFFF"/>
+            <w:tcMar>
+              <w:top w:w="0" w:type="dxa"/>
+              <w:bottom w:w="0" w:type="dxa"/>
+              <w:left w:w="0" w:type="dxa"/>
+              <w:right w:w="0" w:type="dxa"/>
+            </w:tcMar>
+            <w:vAlign w:val="center"/>
+          </w:tcPr>
+          <w:p>
+            <w:pPr>
+              <w:pStyle w:val="Normal"/>
+              <w:jc w:val="left"/>
+              <w:pBdr>
+                <w:bottom w:val="none" w:sz="0" w:space="0" w:color="000000"/>
+                <w:top w:val="none" w:sz="0" w:space="0" w:color="000000"/>
+                <w:left w:val="none" w:sz="0" w:space="0" w:color="000000"/>
+                <w:right w:val="none" w:sz="0" w:space="0" w:color="000000"/>
+              </w:pBdr>
+              <w:spacing w:after="100" w:before="100" w:line="240"/>
+              <w:ind w:left="100" w:right="100" w:firstLine="0" w:firstLineChars="0"/>
+              <w:rPr>
+                <w:rFonts w:ascii="Arial" w:hAnsi="Arial" w:eastAsia="Arial" w:cs="Arial"/>
+                <w:i w:val="false"/>
+                <w:b w:val="false"/>
+                <w:u w:val="none"/>
+                <w:sz w:val="18"/>
+                <w:szCs w:val="18"/>
+                <w:color w:val="000000"/>
+              </w:rPr>
+            </w:pPr>
+            <w:r>
+              <w:rPr>
+                <w:rFonts w:ascii="Arial" w:hAnsi="Arial" w:eastAsia="Arial" w:cs="Arial"/>
+                <w:i w:val="false"/>
+                <w:b w:val="false"/>
+                <w:u w:val="none"/>
+                <w:sz w:val="18"/>
+                <w:szCs w:val="18"/>
+                <w:color w:val="000000"/>
+              </w:rPr>
+              <w:t xml:space="preserve">0.085</w:t>
             </w:r>
           </w:p>
         </w:tc>
@@ -1104,6 +1104,59 @@
                 <w:szCs w:val="18"/>
                 <w:color w:val="000000"/>
               </w:rPr>
+              <w:t xml:space="preserve">47.00 [35.00, 63.00]</w:t>
+            </w:r>
+          </w:p>
+        </w:tc>
+        <w:tc>
+          <w:tcPr>
+            <w:tcBorders>
+              <w:bottom w:val="none" w:sz="0" w:space="0" w:color="000000"/>
+              <w:top w:val="none" w:sz="0" w:space="0" w:color="000000"/>
+              <w:left w:val="none" w:sz="0" w:space="0" w:color="000000"/>
+              <w:right w:val="none" w:sz="0" w:space="0" w:color="000000"/>
+            </w:tcBorders>
+            <w:shd w:val="clear" w:color="auto" w:fill="FFFFFF"/>
+            <w:tcMar>
+              <w:top w:w="0" w:type="dxa"/>
+              <w:bottom w:w="0" w:type="dxa"/>
+              <w:left w:w="0" w:type="dxa"/>
+              <w:right w:w="0" w:type="dxa"/>
+            </w:tcMar>
+            <w:vAlign w:val="center"/>
+          </w:tcPr>
+          <w:p>
+            <w:pPr>
+              <w:pStyle w:val="Normal"/>
+              <w:jc w:val="left"/>
+              <w:pBdr>
+                <w:bottom w:val="none" w:sz="0" w:space="0" w:color="000000"/>
+                <w:top w:val="none" w:sz="0" w:space="0" w:color="000000"/>
+                <w:left w:val="none" w:sz="0" w:space="0" w:color="000000"/>
+                <w:right w:val="none" w:sz="0" w:space="0" w:color="000000"/>
+              </w:pBdr>
+              <w:spacing w:after="100" w:before="100" w:line="240"/>
+              <w:ind w:left="100" w:right="100" w:firstLine="0" w:firstLineChars="0"/>
+              <w:rPr>
+                <w:rFonts w:ascii="Arial" w:hAnsi="Arial" w:eastAsia="Arial" w:cs="Arial"/>
+                <w:i w:val="false"/>
+                <w:b w:val="false"/>
+                <w:u w:val="none"/>
+                <w:sz w:val="18"/>
+                <w:szCs w:val="18"/>
+                <w:color w:val="000000"/>
+              </w:rPr>
+            </w:pPr>
+            <w:r>
+              <w:rPr>
+                <w:rFonts w:ascii="Arial" w:hAnsi="Arial" w:eastAsia="Arial" w:cs="Arial"/>
+                <w:i w:val="false"/>
+                <w:b w:val="false"/>
+                <w:u w:val="none"/>
+                <w:sz w:val="18"/>
+                <w:szCs w:val="18"/>
+                <w:color w:val="000000"/>
+              </w:rPr>
               <w:t xml:space="preserve">43.00 [33.00, 54.00]</w:t>
             </w:r>
           </w:p>
@@ -1210,113 +1263,60 @@
                 <w:szCs w:val="18"/>
                 <w:color w:val="000000"/>
               </w:rPr>
-              <w:t xml:space="preserve">47.00 [35.00, 63.00]</w:t>
-            </w:r>
-          </w:p>
-        </w:tc>
-        <w:tc>
-          <w:tcPr>
-            <w:tcBorders>
-              <w:bottom w:val="none" w:sz="0" w:space="0" w:color="000000"/>
-              <w:top w:val="none" w:sz="0" w:space="0" w:color="000000"/>
-              <w:left w:val="none" w:sz="0" w:space="0" w:color="000000"/>
-              <w:right w:val="none" w:sz="0" w:space="0" w:color="000000"/>
-            </w:tcBorders>
-            <w:shd w:val="clear" w:color="auto" w:fill="FFFFFF"/>
-            <w:tcMar>
-              <w:top w:w="0" w:type="dxa"/>
-              <w:bottom w:w="0" w:type="dxa"/>
-              <w:left w:w="0" w:type="dxa"/>
-              <w:right w:w="0" w:type="dxa"/>
-            </w:tcMar>
-            <w:vAlign w:val="center"/>
-          </w:tcPr>
-          <w:p>
-            <w:pPr>
-              <w:pStyle w:val="Normal"/>
-              <w:jc w:val="left"/>
-              <w:pBdr>
-                <w:bottom w:val="none" w:sz="0" w:space="0" w:color="000000"/>
-                <w:top w:val="none" w:sz="0" w:space="0" w:color="000000"/>
-                <w:left w:val="none" w:sz="0" w:space="0" w:color="000000"/>
-                <w:right w:val="none" w:sz="0" w:space="0" w:color="000000"/>
-              </w:pBdr>
-              <w:spacing w:after="100" w:before="100" w:line="240"/>
-              <w:ind w:left="100" w:right="100" w:firstLine="0" w:firstLineChars="0"/>
-              <w:rPr>
-                <w:rFonts w:ascii="Arial" w:hAnsi="Arial" w:eastAsia="Arial" w:cs="Arial"/>
-                <w:i w:val="false"/>
-                <w:b w:val="false"/>
-                <w:u w:val="none"/>
-                <w:sz w:val="18"/>
-                <w:szCs w:val="18"/>
-                <w:color w:val="000000"/>
-              </w:rPr>
-            </w:pPr>
-            <w:r>
-              <w:rPr>
-                <w:rFonts w:ascii="Arial" w:hAnsi="Arial" w:eastAsia="Arial" w:cs="Arial"/>
-                <w:i w:val="false"/>
-                <w:b w:val="false"/>
-                <w:u w:val="none"/>
-                <w:sz w:val="18"/>
-                <w:szCs w:val="18"/>
-                <w:color w:val="000000"/>
-              </w:rPr>
-              <w:t xml:space="preserve">0.254</w:t>
-            </w:r>
-          </w:p>
-        </w:tc>
-        <w:tc>
-          <w:tcPr>
-            <w:tcBorders>
-              <w:bottom w:val="none" w:sz="0" w:space="0" w:color="000000"/>
-              <w:top w:val="none" w:sz="0" w:space="0" w:color="000000"/>
-              <w:left w:val="none" w:sz="0" w:space="0" w:color="000000"/>
-              <w:right w:val="none" w:sz="0" w:space="0" w:color="000000"/>
-            </w:tcBorders>
-            <w:shd w:val="clear" w:color="auto" w:fill="FFFFFF"/>
-            <w:tcMar>
-              <w:top w:w="0" w:type="dxa"/>
-              <w:bottom w:w="0" w:type="dxa"/>
-              <w:left w:w="0" w:type="dxa"/>
-              <w:right w:w="0" w:type="dxa"/>
-            </w:tcMar>
-            <w:vAlign w:val="center"/>
-          </w:tcPr>
-          <w:p>
-            <w:pPr>
-              <w:pStyle w:val="Normal"/>
-              <w:jc w:val="left"/>
-              <w:pBdr>
-                <w:bottom w:val="none" w:sz="0" w:space="0" w:color="000000"/>
-                <w:top w:val="none" w:sz="0" w:space="0" w:color="000000"/>
-                <w:left w:val="none" w:sz="0" w:space="0" w:color="000000"/>
-                <w:right w:val="none" w:sz="0" w:space="0" w:color="000000"/>
-              </w:pBdr>
-              <w:spacing w:after="100" w:before="100" w:line="240"/>
-              <w:ind w:left="100" w:right="100" w:firstLine="0" w:firstLineChars="0"/>
-              <w:rPr>
-                <w:rFonts w:ascii="Arial" w:hAnsi="Arial" w:eastAsia="Arial" w:cs="Arial"/>
-                <w:i w:val="false"/>
-                <w:b w:val="false"/>
-                <w:u w:val="none"/>
-                <w:sz w:val="18"/>
-                <w:szCs w:val="18"/>
-                <w:color w:val="000000"/>
-              </w:rPr>
-            </w:pPr>
-            <w:r>
-              <w:rPr>
-                <w:rFonts w:ascii="Arial" w:hAnsi="Arial" w:eastAsia="Arial" w:cs="Arial"/>
-                <w:i w:val="false"/>
-                <w:b w:val="false"/>
-                <w:u w:val="none"/>
-                <w:sz w:val="18"/>
-                <w:szCs w:val="18"/>
-                <w:color w:val="000000"/>
-              </w:rPr>
-              <w:t xml:space="preserve">0.794</w:t>
+              <w:t xml:space="preserve">0.257</w:t>
+            </w:r>
+          </w:p>
+        </w:tc>
+        <w:tc>
+          <w:tcPr>
+            <w:tcBorders>
+              <w:bottom w:val="none" w:sz="0" w:space="0" w:color="000000"/>
+              <w:top w:val="none" w:sz="0" w:space="0" w:color="000000"/>
+              <w:left w:val="none" w:sz="0" w:space="0" w:color="000000"/>
+              <w:right w:val="none" w:sz="0" w:space="0" w:color="000000"/>
+            </w:tcBorders>
+            <w:shd w:val="clear" w:color="auto" w:fill="FFFFFF"/>
+            <w:tcMar>
+              <w:top w:w="0" w:type="dxa"/>
+              <w:bottom w:w="0" w:type="dxa"/>
+              <w:left w:w="0" w:type="dxa"/>
+              <w:right w:w="0" w:type="dxa"/>
+            </w:tcMar>
+            <w:vAlign w:val="center"/>
+          </w:tcPr>
+          <w:p>
+            <w:pPr>
+              <w:pStyle w:val="Normal"/>
+              <w:jc w:val="left"/>
+              <w:pBdr>
+                <w:bottom w:val="none" w:sz="0" w:space="0" w:color="000000"/>
+                <w:top w:val="none" w:sz="0" w:space="0" w:color="000000"/>
+                <w:left w:val="none" w:sz="0" w:space="0" w:color="000000"/>
+                <w:right w:val="none" w:sz="0" w:space="0" w:color="000000"/>
+              </w:pBdr>
+              <w:spacing w:after="100" w:before="100" w:line="240"/>
+              <w:ind w:left="100" w:right="100" w:firstLine="0" w:firstLineChars="0"/>
+              <w:rPr>
+                <w:rFonts w:ascii="Arial" w:hAnsi="Arial" w:eastAsia="Arial" w:cs="Arial"/>
+                <w:i w:val="false"/>
+                <w:b w:val="false"/>
+                <w:u w:val="none"/>
+                <w:sz w:val="18"/>
+                <w:szCs w:val="18"/>
+                <w:color w:val="000000"/>
+              </w:rPr>
+            </w:pPr>
+            <w:r>
+              <w:rPr>
+                <w:rFonts w:ascii="Arial" w:hAnsi="Arial" w:eastAsia="Arial" w:cs="Arial"/>
+                <w:i w:val="false"/>
+                <w:b w:val="false"/>
+                <w:u w:val="none"/>
+                <w:sz w:val="18"/>
+                <w:szCs w:val="18"/>
+                <w:color w:val="000000"/>
+              </w:rPr>
+              <w:t xml:space="preserve">0.702</w:t>
             </w:r>
           </w:p>
         </w:tc>
@@ -1428,6 +1428,59 @@
                 <w:szCs w:val="18"/>
                 <w:color w:val="000000"/>
               </w:rPr>
+              <w:t xml:space="preserve">75.00 [57.50, 86.50]</w:t>
+            </w:r>
+          </w:p>
+        </w:tc>
+        <w:tc>
+          <w:tcPr>
+            <w:tcBorders>
+              <w:bottom w:val="none" w:sz="0" w:space="0" w:color="000000"/>
+              <w:top w:val="none" w:sz="0" w:space="0" w:color="000000"/>
+              <w:left w:val="none" w:sz="0" w:space="0" w:color="000000"/>
+              <w:right w:val="none" w:sz="0" w:space="0" w:color="000000"/>
+            </w:tcBorders>
+            <w:shd w:val="clear" w:color="auto" w:fill="FFFFFF"/>
+            <w:tcMar>
+              <w:top w:w="0" w:type="dxa"/>
+              <w:bottom w:w="0" w:type="dxa"/>
+              <w:left w:w="0" w:type="dxa"/>
+              <w:right w:w="0" w:type="dxa"/>
+            </w:tcMar>
+            <w:vAlign w:val="center"/>
+          </w:tcPr>
+          <w:p>
+            <w:pPr>
+              <w:pStyle w:val="Normal"/>
+              <w:jc w:val="left"/>
+              <w:pBdr>
+                <w:bottom w:val="none" w:sz="0" w:space="0" w:color="000000"/>
+                <w:top w:val="none" w:sz="0" w:space="0" w:color="000000"/>
+                <w:left w:val="none" w:sz="0" w:space="0" w:color="000000"/>
+                <w:right w:val="none" w:sz="0" w:space="0" w:color="000000"/>
+              </w:pBdr>
+              <w:spacing w:after="100" w:before="100" w:line="240"/>
+              <w:ind w:left="100" w:right="100" w:firstLine="0" w:firstLineChars="0"/>
+              <w:rPr>
+                <w:rFonts w:ascii="Arial" w:hAnsi="Arial" w:eastAsia="Arial" w:cs="Arial"/>
+                <w:i w:val="false"/>
+                <w:b w:val="false"/>
+                <w:u w:val="none"/>
+                <w:sz w:val="18"/>
+                <w:szCs w:val="18"/>
+                <w:color w:val="000000"/>
+              </w:rPr>
+            </w:pPr>
+            <w:r>
+              <w:rPr>
+                <w:rFonts w:ascii="Arial" w:hAnsi="Arial" w:eastAsia="Arial" w:cs="Arial"/>
+                <w:i w:val="false"/>
+                <w:b w:val="false"/>
+                <w:u w:val="none"/>
+                <w:sz w:val="18"/>
+                <w:szCs w:val="18"/>
+                <w:color w:val="000000"/>
+              </w:rPr>
               <w:t xml:space="preserve">71.50 [55.00, 87.00]</w:t>
             </w:r>
           </w:p>
@@ -1482,59 +1535,6 @@
                 <w:color w:val="000000"/>
               </w:rPr>
               <w:t xml:space="preserve">62.00 [49.50, 83.50]</w:t>
-            </w:r>
-          </w:p>
-        </w:tc>
-        <w:tc>
-          <w:tcPr>
-            <w:tcBorders>
-              <w:bottom w:val="none" w:sz="0" w:space="0" w:color="000000"/>
-              <w:top w:val="none" w:sz="0" w:space="0" w:color="000000"/>
-              <w:left w:val="none" w:sz="0" w:space="0" w:color="000000"/>
-              <w:right w:val="none" w:sz="0" w:space="0" w:color="000000"/>
-            </w:tcBorders>
-            <w:shd w:val="clear" w:color="auto" w:fill="FFFFFF"/>
-            <w:tcMar>
-              <w:top w:w="0" w:type="dxa"/>
-              <w:bottom w:w="0" w:type="dxa"/>
-              <w:left w:w="0" w:type="dxa"/>
-              <w:right w:w="0" w:type="dxa"/>
-            </w:tcMar>
-            <w:vAlign w:val="center"/>
-          </w:tcPr>
-          <w:p>
-            <w:pPr>
-              <w:pStyle w:val="Normal"/>
-              <w:jc w:val="left"/>
-              <w:pBdr>
-                <w:bottom w:val="none" w:sz="0" w:space="0" w:color="000000"/>
-                <w:top w:val="none" w:sz="0" w:space="0" w:color="000000"/>
-                <w:left w:val="none" w:sz="0" w:space="0" w:color="000000"/>
-                <w:right w:val="none" w:sz="0" w:space="0" w:color="000000"/>
-              </w:pBdr>
-              <w:spacing w:after="100" w:before="100" w:line="240"/>
-              <w:ind w:left="100" w:right="100" w:firstLine="0" w:firstLineChars="0"/>
-              <w:rPr>
-                <w:rFonts w:ascii="Arial" w:hAnsi="Arial" w:eastAsia="Arial" w:cs="Arial"/>
-                <w:i w:val="false"/>
-                <w:b w:val="false"/>
-                <w:u w:val="none"/>
-                <w:sz w:val="18"/>
-                <w:szCs w:val="18"/>
-                <w:color w:val="000000"/>
-              </w:rPr>
-            </w:pPr>
-            <w:r>
-              <w:rPr>
-                <w:rFonts w:ascii="Arial" w:hAnsi="Arial" w:eastAsia="Arial" w:cs="Arial"/>
-                <w:i w:val="false"/>
-                <w:b w:val="false"/>
-                <w:u w:val="none"/>
-                <w:sz w:val="18"/>
-                <w:szCs w:val="18"/>
-                <w:color w:val="000000"/>
-              </w:rPr>
-              <w:t xml:space="preserve">75.00 [57.50, 86.50]</w:t>
             </w:r>
           </w:p>
         </w:tc>
@@ -1752,6 +1752,59 @@
                 <w:szCs w:val="18"/>
                 <w:color w:val="000000"/>
               </w:rPr>
+              <w:t xml:space="preserve">14.00 [6.00, 20.00]</w:t>
+            </w:r>
+          </w:p>
+        </w:tc>
+        <w:tc>
+          <w:tcPr>
+            <w:tcBorders>
+              <w:bottom w:val="none" w:sz="0" w:space="0" w:color="000000"/>
+              <w:top w:val="none" w:sz="0" w:space="0" w:color="000000"/>
+              <w:left w:val="none" w:sz="0" w:space="0" w:color="000000"/>
+              <w:right w:val="none" w:sz="0" w:space="0" w:color="000000"/>
+            </w:tcBorders>
+            <w:shd w:val="clear" w:color="auto" w:fill="FFFFFF"/>
+            <w:tcMar>
+              <w:top w:w="0" w:type="dxa"/>
+              <w:bottom w:w="0" w:type="dxa"/>
+              <w:left w:w="0" w:type="dxa"/>
+              <w:right w:w="0" w:type="dxa"/>
+            </w:tcMar>
+            <w:vAlign w:val="center"/>
+          </w:tcPr>
+          <w:p>
+            <w:pPr>
+              <w:pStyle w:val="Normal"/>
+              <w:jc w:val="left"/>
+              <w:pBdr>
+                <w:bottom w:val="none" w:sz="0" w:space="0" w:color="000000"/>
+                <w:top w:val="none" w:sz="0" w:space="0" w:color="000000"/>
+                <w:left w:val="none" w:sz="0" w:space="0" w:color="000000"/>
+                <w:right w:val="none" w:sz="0" w:space="0" w:color="000000"/>
+              </w:pBdr>
+              <w:spacing w:after="100" w:before="100" w:line="240"/>
+              <w:ind w:left="100" w:right="100" w:firstLine="0" w:firstLineChars="0"/>
+              <w:rPr>
+                <w:rFonts w:ascii="Arial" w:hAnsi="Arial" w:eastAsia="Arial" w:cs="Arial"/>
+                <w:i w:val="false"/>
+                <w:b w:val="false"/>
+                <w:u w:val="none"/>
+                <w:sz w:val="18"/>
+                <w:szCs w:val="18"/>
+                <w:color w:val="000000"/>
+              </w:rPr>
+            </w:pPr>
+            <w:r>
+              <w:rPr>
+                <w:rFonts w:ascii="Arial" w:hAnsi="Arial" w:eastAsia="Arial" w:cs="Arial"/>
+                <w:i w:val="false"/>
+                <w:b w:val="false"/>
+                <w:u w:val="none"/>
+                <w:sz w:val="18"/>
+                <w:szCs w:val="18"/>
+                <w:color w:val="000000"/>
+              </w:rPr>
               <w:t xml:space="preserve">16.00 [9.00, 25.00]</w:t>
             </w:r>
           </w:p>
@@ -1805,60 +1858,7 @@
                 <w:szCs w:val="18"/>
                 <w:color w:val="000000"/>
               </w:rPr>
-              <w:t xml:space="preserve">26.00 [16.50, 39.00]</w:t>
-            </w:r>
-          </w:p>
-        </w:tc>
-        <w:tc>
-          <w:tcPr>
-            <w:tcBorders>
-              <w:bottom w:val="none" w:sz="0" w:space="0" w:color="000000"/>
-              <w:top w:val="none" w:sz="0" w:space="0" w:color="000000"/>
-              <w:left w:val="none" w:sz="0" w:space="0" w:color="000000"/>
-              <w:right w:val="none" w:sz="0" w:space="0" w:color="000000"/>
-            </w:tcBorders>
-            <w:shd w:val="clear" w:color="auto" w:fill="FFFFFF"/>
-            <w:tcMar>
-              <w:top w:w="0" w:type="dxa"/>
-              <w:bottom w:w="0" w:type="dxa"/>
-              <w:left w:w="0" w:type="dxa"/>
-              <w:right w:w="0" w:type="dxa"/>
-            </w:tcMar>
-            <w:vAlign w:val="center"/>
-          </w:tcPr>
-          <w:p>
-            <w:pPr>
-              <w:pStyle w:val="Normal"/>
-              <w:jc w:val="left"/>
-              <w:pBdr>
-                <w:bottom w:val="none" w:sz="0" w:space="0" w:color="000000"/>
-                <w:top w:val="none" w:sz="0" w:space="0" w:color="000000"/>
-                <w:left w:val="none" w:sz="0" w:space="0" w:color="000000"/>
-                <w:right w:val="none" w:sz="0" w:space="0" w:color="000000"/>
-              </w:pBdr>
-              <w:spacing w:after="100" w:before="100" w:line="240"/>
-              <w:ind w:left="100" w:right="100" w:firstLine="0" w:firstLineChars="0"/>
-              <w:rPr>
-                <w:rFonts w:ascii="Arial" w:hAnsi="Arial" w:eastAsia="Arial" w:cs="Arial"/>
-                <w:i w:val="false"/>
-                <w:b w:val="false"/>
-                <w:u w:val="none"/>
-                <w:sz w:val="18"/>
-                <w:szCs w:val="18"/>
-                <w:color w:val="000000"/>
-              </w:rPr>
-            </w:pPr>
-            <w:r>
-              <w:rPr>
-                <w:rFonts w:ascii="Arial" w:hAnsi="Arial" w:eastAsia="Arial" w:cs="Arial"/>
-                <w:i w:val="false"/>
-                <w:b w:val="false"/>
-                <w:u w:val="none"/>
-                <w:sz w:val="18"/>
-                <w:szCs w:val="18"/>
-                <w:color w:val="000000"/>
-              </w:rPr>
-              <w:t xml:space="preserve">14.00 [6.00, 20.00]</w:t>
+              <w:t xml:space="preserve">26.00 [16.75, 40.25]</w:t>
             </w:r>
           </w:p>
         </w:tc>
@@ -2129,60 +2129,60 @@
                 <w:szCs w:val="18"/>
                 <w:color w:val="000000"/>
               </w:rPr>
-              <w:t xml:space="preserve">10.00 [3.00, 24.50]</w:t>
-            </w:r>
-          </w:p>
-        </w:tc>
-        <w:tc>
-          <w:tcPr>
-            <w:tcBorders>
-              <w:bottom w:val="none" w:sz="0" w:space="0" w:color="000000"/>
-              <w:top w:val="none" w:sz="0" w:space="0" w:color="000000"/>
-              <w:left w:val="none" w:sz="0" w:space="0" w:color="000000"/>
-              <w:right w:val="none" w:sz="0" w:space="0" w:color="000000"/>
-            </w:tcBorders>
-            <w:shd w:val="clear" w:color="auto" w:fill="FFFFFF"/>
-            <w:tcMar>
-              <w:top w:w="0" w:type="dxa"/>
-              <w:bottom w:w="0" w:type="dxa"/>
-              <w:left w:w="0" w:type="dxa"/>
-              <w:right w:w="0" w:type="dxa"/>
-            </w:tcMar>
-            <w:vAlign w:val="center"/>
-          </w:tcPr>
-          <w:p>
-            <w:pPr>
-              <w:pStyle w:val="Normal"/>
-              <w:jc w:val="left"/>
-              <w:pBdr>
-                <w:bottom w:val="none" w:sz="0" w:space="0" w:color="000000"/>
-                <w:top w:val="none" w:sz="0" w:space="0" w:color="000000"/>
-                <w:left w:val="none" w:sz="0" w:space="0" w:color="000000"/>
-                <w:right w:val="none" w:sz="0" w:space="0" w:color="000000"/>
-              </w:pBdr>
-              <w:spacing w:after="100" w:before="100" w:line="240"/>
-              <w:ind w:left="100" w:right="100" w:firstLine="0" w:firstLineChars="0"/>
-              <w:rPr>
-                <w:rFonts w:ascii="Arial" w:hAnsi="Arial" w:eastAsia="Arial" w:cs="Arial"/>
-                <w:i w:val="false"/>
-                <w:b w:val="false"/>
-                <w:u w:val="none"/>
-                <w:sz w:val="18"/>
-                <w:szCs w:val="18"/>
-                <w:color w:val="000000"/>
-              </w:rPr>
-            </w:pPr>
-            <w:r>
-              <w:rPr>
-                <w:rFonts w:ascii="Arial" w:hAnsi="Arial" w:eastAsia="Arial" w:cs="Arial"/>
-                <w:i w:val="false"/>
-                <w:b w:val="false"/>
-                <w:u w:val="none"/>
-                <w:sz w:val="18"/>
-                <w:szCs w:val="18"/>
-                <w:color w:val="000000"/>
-              </w:rPr>
               <w:t xml:space="preserve">0.00 [0.00, 1.00]</w:t>
+            </w:r>
+          </w:p>
+        </w:tc>
+        <w:tc>
+          <w:tcPr>
+            <w:tcBorders>
+              <w:bottom w:val="none" w:sz="0" w:space="0" w:color="000000"/>
+              <w:top w:val="none" w:sz="0" w:space="0" w:color="000000"/>
+              <w:left w:val="none" w:sz="0" w:space="0" w:color="000000"/>
+              <w:right w:val="none" w:sz="0" w:space="0" w:color="000000"/>
+            </w:tcBorders>
+            <w:shd w:val="clear" w:color="auto" w:fill="FFFFFF"/>
+            <w:tcMar>
+              <w:top w:w="0" w:type="dxa"/>
+              <w:bottom w:w="0" w:type="dxa"/>
+              <w:left w:w="0" w:type="dxa"/>
+              <w:right w:w="0" w:type="dxa"/>
+            </w:tcMar>
+            <w:vAlign w:val="center"/>
+          </w:tcPr>
+          <w:p>
+            <w:pPr>
+              <w:pStyle w:val="Normal"/>
+              <w:jc w:val="left"/>
+              <w:pBdr>
+                <w:bottom w:val="none" w:sz="0" w:space="0" w:color="000000"/>
+                <w:top w:val="none" w:sz="0" w:space="0" w:color="000000"/>
+                <w:left w:val="none" w:sz="0" w:space="0" w:color="000000"/>
+                <w:right w:val="none" w:sz="0" w:space="0" w:color="000000"/>
+              </w:pBdr>
+              <w:spacing w:after="100" w:before="100" w:line="240"/>
+              <w:ind w:left="100" w:right="100" w:firstLine="0" w:firstLineChars="0"/>
+              <w:rPr>
+                <w:rFonts w:ascii="Arial" w:hAnsi="Arial" w:eastAsia="Arial" w:cs="Arial"/>
+                <w:i w:val="false"/>
+                <w:b w:val="false"/>
+                <w:u w:val="none"/>
+                <w:sz w:val="18"/>
+                <w:szCs w:val="18"/>
+                <w:color w:val="000000"/>
+              </w:rPr>
+            </w:pPr>
+            <w:r>
+              <w:rPr>
+                <w:rFonts w:ascii="Arial" w:hAnsi="Arial" w:eastAsia="Arial" w:cs="Arial"/>
+                <w:i w:val="false"/>
+                <w:b w:val="false"/>
+                <w:u w:val="none"/>
+                <w:sz w:val="18"/>
+                <w:szCs w:val="18"/>
+                <w:color w:val="000000"/>
+              </w:rPr>
+              <w:t xml:space="preserve">10.00 [3.00, 24.25]</w:t>
             </w:r>
           </w:p>
         </w:tc>
@@ -2400,6 +2400,59 @@
                 <w:szCs w:val="18"/>
                 <w:color w:val="000000"/>
               </w:rPr>
+              <w:t xml:space="preserve">38.00 [27.00, 50.00]</w:t>
+            </w:r>
+          </w:p>
+        </w:tc>
+        <w:tc>
+          <w:tcPr>
+            <w:tcBorders>
+              <w:bottom w:val="none" w:sz="0" w:space="0" w:color="000000"/>
+              <w:top w:val="none" w:sz="0" w:space="0" w:color="000000"/>
+              <w:left w:val="none" w:sz="0" w:space="0" w:color="000000"/>
+              <w:right w:val="none" w:sz="0" w:space="0" w:color="000000"/>
+            </w:tcBorders>
+            <w:shd w:val="clear" w:color="auto" w:fill="FFFFFF"/>
+            <w:tcMar>
+              <w:top w:w="0" w:type="dxa"/>
+              <w:bottom w:w="0" w:type="dxa"/>
+              <w:left w:w="0" w:type="dxa"/>
+              <w:right w:w="0" w:type="dxa"/>
+            </w:tcMar>
+            <w:vAlign w:val="center"/>
+          </w:tcPr>
+          <w:p>
+            <w:pPr>
+              <w:pStyle w:val="Normal"/>
+              <w:jc w:val="left"/>
+              <w:pBdr>
+                <w:bottom w:val="none" w:sz="0" w:space="0" w:color="000000"/>
+                <w:top w:val="none" w:sz="0" w:space="0" w:color="000000"/>
+                <w:left w:val="none" w:sz="0" w:space="0" w:color="000000"/>
+                <w:right w:val="none" w:sz="0" w:space="0" w:color="000000"/>
+              </w:pBdr>
+              <w:spacing w:after="100" w:before="100" w:line="240"/>
+              <w:ind w:left="100" w:right="100" w:firstLine="0" w:firstLineChars="0"/>
+              <w:rPr>
+                <w:rFonts w:ascii="Arial" w:hAnsi="Arial" w:eastAsia="Arial" w:cs="Arial"/>
+                <w:i w:val="false"/>
+                <w:b w:val="false"/>
+                <w:u w:val="none"/>
+                <w:sz w:val="18"/>
+                <w:szCs w:val="18"/>
+                <w:color w:val="000000"/>
+              </w:rPr>
+            </w:pPr>
+            <w:r>
+              <w:rPr>
+                <w:rFonts w:ascii="Arial" w:hAnsi="Arial" w:eastAsia="Arial" w:cs="Arial"/>
+                <w:i w:val="false"/>
+                <w:b w:val="false"/>
+                <w:u w:val="none"/>
+                <w:sz w:val="18"/>
+                <w:szCs w:val="18"/>
+                <w:color w:val="000000"/>
+              </w:rPr>
               <w:t xml:space="preserve">40.00 [31.00, 50.00]</w:t>
             </w:r>
           </w:p>
@@ -2454,59 +2507,6 @@
                 <w:color w:val="000000"/>
               </w:rPr>
               <w:t xml:space="preserve">51.00 [40.00, 62.00]</w:t>
-            </w:r>
-          </w:p>
-        </w:tc>
-        <w:tc>
-          <w:tcPr>
-            <w:tcBorders>
-              <w:bottom w:val="none" w:sz="0" w:space="0" w:color="000000"/>
-              <w:top w:val="none" w:sz="0" w:space="0" w:color="000000"/>
-              <w:left w:val="none" w:sz="0" w:space="0" w:color="000000"/>
-              <w:right w:val="none" w:sz="0" w:space="0" w:color="000000"/>
-            </w:tcBorders>
-            <w:shd w:val="clear" w:color="auto" w:fill="FFFFFF"/>
-            <w:tcMar>
-              <w:top w:w="0" w:type="dxa"/>
-              <w:bottom w:w="0" w:type="dxa"/>
-              <w:left w:w="0" w:type="dxa"/>
-              <w:right w:w="0" w:type="dxa"/>
-            </w:tcMar>
-            <w:vAlign w:val="center"/>
-          </w:tcPr>
-          <w:p>
-            <w:pPr>
-              <w:pStyle w:val="Normal"/>
-              <w:jc w:val="left"/>
-              <w:pBdr>
-                <w:bottom w:val="none" w:sz="0" w:space="0" w:color="000000"/>
-                <w:top w:val="none" w:sz="0" w:space="0" w:color="000000"/>
-                <w:left w:val="none" w:sz="0" w:space="0" w:color="000000"/>
-                <w:right w:val="none" w:sz="0" w:space="0" w:color="000000"/>
-              </w:pBdr>
-              <w:spacing w:after="100" w:before="100" w:line="240"/>
-              <w:ind w:left="100" w:right="100" w:firstLine="0" w:firstLineChars="0"/>
-              <w:rPr>
-                <w:rFonts w:ascii="Arial" w:hAnsi="Arial" w:eastAsia="Arial" w:cs="Arial"/>
-                <w:i w:val="false"/>
-                <w:b w:val="false"/>
-                <w:u w:val="none"/>
-                <w:sz w:val="18"/>
-                <w:szCs w:val="18"/>
-                <w:color w:val="000000"/>
-              </w:rPr>
-            </w:pPr>
-            <w:r>
-              <w:rPr>
-                <w:rFonts w:ascii="Arial" w:hAnsi="Arial" w:eastAsia="Arial" w:cs="Arial"/>
-                <w:i w:val="false"/>
-                <w:b w:val="false"/>
-                <w:u w:val="none"/>
-                <w:sz w:val="18"/>
-                <w:szCs w:val="18"/>
-                <w:color w:val="000000"/>
-              </w:rPr>
-              <w:t xml:space="preserve">38.00 [27.00, 50.00]</w:t>
             </w:r>
           </w:p>
         </w:tc>
@@ -2724,6 +2724,59 @@
                 <w:szCs w:val="18"/>
                 <w:color w:val="000000"/>
               </w:rPr>
+              <w:t xml:space="preserve">1.00 [0.00, 8.00]</w:t>
+            </w:r>
+          </w:p>
+        </w:tc>
+        <w:tc>
+          <w:tcPr>
+            <w:tcBorders>
+              <w:bottom w:val="none" w:sz="0" w:space="0" w:color="000000"/>
+              <w:top w:val="none" w:sz="0" w:space="0" w:color="000000"/>
+              <w:left w:val="none" w:sz="0" w:space="0" w:color="000000"/>
+              <w:right w:val="none" w:sz="0" w:space="0" w:color="000000"/>
+            </w:tcBorders>
+            <w:shd w:val="clear" w:color="auto" w:fill="FFFFFF"/>
+            <w:tcMar>
+              <w:top w:w="0" w:type="dxa"/>
+              <w:bottom w:w="0" w:type="dxa"/>
+              <w:left w:w="0" w:type="dxa"/>
+              <w:right w:w="0" w:type="dxa"/>
+            </w:tcMar>
+            <w:vAlign w:val="center"/>
+          </w:tcPr>
+          <w:p>
+            <w:pPr>
+              <w:pStyle w:val="Normal"/>
+              <w:jc w:val="left"/>
+              <w:pBdr>
+                <w:bottom w:val="none" w:sz="0" w:space="0" w:color="000000"/>
+                <w:top w:val="none" w:sz="0" w:space="0" w:color="000000"/>
+                <w:left w:val="none" w:sz="0" w:space="0" w:color="000000"/>
+                <w:right w:val="none" w:sz="0" w:space="0" w:color="000000"/>
+              </w:pBdr>
+              <w:spacing w:after="100" w:before="100" w:line="240"/>
+              <w:ind w:left="100" w:right="100" w:firstLine="0" w:firstLineChars="0"/>
+              <w:rPr>
+                <w:rFonts w:ascii="Arial" w:hAnsi="Arial" w:eastAsia="Arial" w:cs="Arial"/>
+                <w:i w:val="false"/>
+                <w:b w:val="false"/>
+                <w:u w:val="none"/>
+                <w:sz w:val="18"/>
+                <w:szCs w:val="18"/>
+                <w:color w:val="000000"/>
+              </w:rPr>
+            </w:pPr>
+            <w:r>
+              <w:rPr>
+                <w:rFonts w:ascii="Arial" w:hAnsi="Arial" w:eastAsia="Arial" w:cs="Arial"/>
+                <w:i w:val="false"/>
+                <w:b w:val="false"/>
+                <w:u w:val="none"/>
+                <w:sz w:val="18"/>
+                <w:szCs w:val="18"/>
+                <w:color w:val="000000"/>
+              </w:rPr>
               <w:t xml:space="preserve">1.00 [0.00, 7.00]</w:t>
             </w:r>
           </w:p>
@@ -2778,59 +2831,6 @@
                 <w:color w:val="000000"/>
               </w:rPr>
               <w:t xml:space="preserve">30.00 [22.00, 50.00]</w:t>
-            </w:r>
-          </w:p>
-        </w:tc>
-        <w:tc>
-          <w:tcPr>
-            <w:tcBorders>
-              <w:bottom w:val="none" w:sz="0" w:space="0" w:color="000000"/>
-              <w:top w:val="none" w:sz="0" w:space="0" w:color="000000"/>
-              <w:left w:val="none" w:sz="0" w:space="0" w:color="000000"/>
-              <w:right w:val="none" w:sz="0" w:space="0" w:color="000000"/>
-            </w:tcBorders>
-            <w:shd w:val="clear" w:color="auto" w:fill="FFFFFF"/>
-            <w:tcMar>
-              <w:top w:w="0" w:type="dxa"/>
-              <w:bottom w:w="0" w:type="dxa"/>
-              <w:left w:w="0" w:type="dxa"/>
-              <w:right w:w="0" w:type="dxa"/>
-            </w:tcMar>
-            <w:vAlign w:val="center"/>
-          </w:tcPr>
-          <w:p>
-            <w:pPr>
-              <w:pStyle w:val="Normal"/>
-              <w:jc w:val="left"/>
-              <w:pBdr>
-                <w:bottom w:val="none" w:sz="0" w:space="0" w:color="000000"/>
-                <w:top w:val="none" w:sz="0" w:space="0" w:color="000000"/>
-                <w:left w:val="none" w:sz="0" w:space="0" w:color="000000"/>
-                <w:right w:val="none" w:sz="0" w:space="0" w:color="000000"/>
-              </w:pBdr>
-              <w:spacing w:after="100" w:before="100" w:line="240"/>
-              <w:ind w:left="100" w:right="100" w:firstLine="0" w:firstLineChars="0"/>
-              <w:rPr>
-                <w:rFonts w:ascii="Arial" w:hAnsi="Arial" w:eastAsia="Arial" w:cs="Arial"/>
-                <w:i w:val="false"/>
-                <w:b w:val="false"/>
-                <w:u w:val="none"/>
-                <w:sz w:val="18"/>
-                <w:szCs w:val="18"/>
-                <w:color w:val="000000"/>
-              </w:rPr>
-            </w:pPr>
-            <w:r>
-              <w:rPr>
-                <w:rFonts w:ascii="Arial" w:hAnsi="Arial" w:eastAsia="Arial" w:cs="Arial"/>
-                <w:i w:val="false"/>
-                <w:b w:val="false"/>
-                <w:u w:val="none"/>
-                <w:sz w:val="18"/>
-                <w:szCs w:val="18"/>
-                <w:color w:val="000000"/>
-              </w:rPr>
-              <w:t xml:space="preserve">1.00 [0.00, 8.00]</w:t>
             </w:r>
           </w:p>
         </w:tc>
@@ -3048,6 +3048,59 @@
                 <w:szCs w:val="18"/>
                 <w:color w:val="000000"/>
               </w:rPr>
+              <w:t xml:space="preserve">83.00 [77.50, 89.00]</w:t>
+            </w:r>
+          </w:p>
+        </w:tc>
+        <w:tc>
+          <w:tcPr>
+            <w:tcBorders>
+              <w:bottom w:val="none" w:sz="0" w:space="0" w:color="000000"/>
+              <w:top w:val="none" w:sz="0" w:space="0" w:color="000000"/>
+              <w:left w:val="none" w:sz="0" w:space="0" w:color="000000"/>
+              <w:right w:val="none" w:sz="0" w:space="0" w:color="000000"/>
+            </w:tcBorders>
+            <w:shd w:val="clear" w:color="auto" w:fill="FFFFFF"/>
+            <w:tcMar>
+              <w:top w:w="0" w:type="dxa"/>
+              <w:bottom w:w="0" w:type="dxa"/>
+              <w:left w:w="0" w:type="dxa"/>
+              <w:right w:w="0" w:type="dxa"/>
+            </w:tcMar>
+            <w:vAlign w:val="center"/>
+          </w:tcPr>
+          <w:p>
+            <w:pPr>
+              <w:pStyle w:val="Normal"/>
+              <w:jc w:val="left"/>
+              <w:pBdr>
+                <w:bottom w:val="none" w:sz="0" w:space="0" w:color="000000"/>
+                <w:top w:val="none" w:sz="0" w:space="0" w:color="000000"/>
+                <w:left w:val="none" w:sz="0" w:space="0" w:color="000000"/>
+                <w:right w:val="none" w:sz="0" w:space="0" w:color="000000"/>
+              </w:pBdr>
+              <w:spacing w:after="100" w:before="100" w:line="240"/>
+              <w:ind w:left="100" w:right="100" w:firstLine="0" w:firstLineChars="0"/>
+              <w:rPr>
+                <w:rFonts w:ascii="Arial" w:hAnsi="Arial" w:eastAsia="Arial" w:cs="Arial"/>
+                <w:i w:val="false"/>
+                <w:b w:val="false"/>
+                <w:u w:val="none"/>
+                <w:sz w:val="18"/>
+                <w:szCs w:val="18"/>
+                <w:color w:val="000000"/>
+              </w:rPr>
+            </w:pPr>
+            <w:r>
+              <w:rPr>
+                <w:rFonts w:ascii="Arial" w:hAnsi="Arial" w:eastAsia="Arial" w:cs="Arial"/>
+                <w:i w:val="false"/>
+                <w:b w:val="false"/>
+                <w:u w:val="none"/>
+                <w:sz w:val="18"/>
+                <w:szCs w:val="18"/>
+                <w:color w:val="000000"/>
+              </w:rPr>
               <w:t xml:space="preserve">83.00 [74.00, 90.00]</w:t>
             </w:r>
           </w:p>
@@ -3102,59 +3155,6 @@
                 <w:color w:val="000000"/>
               </w:rPr>
               <w:t xml:space="preserve">84.50 [76.00, 90.75]</w:t>
-            </w:r>
-          </w:p>
-        </w:tc>
-        <w:tc>
-          <w:tcPr>
-            <w:tcBorders>
-              <w:bottom w:val="none" w:sz="0" w:space="0" w:color="000000"/>
-              <w:top w:val="none" w:sz="0" w:space="0" w:color="000000"/>
-              <w:left w:val="none" w:sz="0" w:space="0" w:color="000000"/>
-              <w:right w:val="none" w:sz="0" w:space="0" w:color="000000"/>
-            </w:tcBorders>
-            <w:shd w:val="clear" w:color="auto" w:fill="FFFFFF"/>
-            <w:tcMar>
-              <w:top w:w="0" w:type="dxa"/>
-              <w:bottom w:w="0" w:type="dxa"/>
-              <w:left w:w="0" w:type="dxa"/>
-              <w:right w:w="0" w:type="dxa"/>
-            </w:tcMar>
-            <w:vAlign w:val="center"/>
-          </w:tcPr>
-          <w:p>
-            <w:pPr>
-              <w:pStyle w:val="Normal"/>
-              <w:jc w:val="left"/>
-              <w:pBdr>
-                <w:bottom w:val="none" w:sz="0" w:space="0" w:color="000000"/>
-                <w:top w:val="none" w:sz="0" w:space="0" w:color="000000"/>
-                <w:left w:val="none" w:sz="0" w:space="0" w:color="000000"/>
-                <w:right w:val="none" w:sz="0" w:space="0" w:color="000000"/>
-              </w:pBdr>
-              <w:spacing w:after="100" w:before="100" w:line="240"/>
-              <w:ind w:left="100" w:right="100" w:firstLine="0" w:firstLineChars="0"/>
-              <w:rPr>
-                <w:rFonts w:ascii="Arial" w:hAnsi="Arial" w:eastAsia="Arial" w:cs="Arial"/>
-                <w:i w:val="false"/>
-                <w:b w:val="false"/>
-                <w:u w:val="none"/>
-                <w:sz w:val="18"/>
-                <w:szCs w:val="18"/>
-                <w:color w:val="000000"/>
-              </w:rPr>
-            </w:pPr>
-            <w:r>
-              <w:rPr>
-                <w:rFonts w:ascii="Arial" w:hAnsi="Arial" w:eastAsia="Arial" w:cs="Arial"/>
-                <w:i w:val="false"/>
-                <w:b w:val="false"/>
-                <w:u w:val="none"/>
-                <w:sz w:val="18"/>
-                <w:szCs w:val="18"/>
-                <w:color w:val="000000"/>
-              </w:rPr>
-              <w:t xml:space="preserve">83.00 [77.50, 89.00]</w:t>
             </w:r>
           </w:p>
         </w:tc>
@@ -3372,6 +3372,59 @@
                 <w:szCs w:val="18"/>
                 <w:color w:val="000000"/>
               </w:rPr>
+              <w:t xml:space="preserve">9.00 [0.50, 33.50]</w:t>
+            </w:r>
+          </w:p>
+        </w:tc>
+        <w:tc>
+          <w:tcPr>
+            <w:tcBorders>
+              <w:bottom w:val="none" w:sz="0" w:space="0" w:color="000000"/>
+              <w:top w:val="none" w:sz="0" w:space="0" w:color="000000"/>
+              <w:left w:val="none" w:sz="0" w:space="0" w:color="000000"/>
+              <w:right w:val="none" w:sz="0" w:space="0" w:color="000000"/>
+            </w:tcBorders>
+            <w:shd w:val="clear" w:color="auto" w:fill="FFFFFF"/>
+            <w:tcMar>
+              <w:top w:w="0" w:type="dxa"/>
+              <w:bottom w:w="0" w:type="dxa"/>
+              <w:left w:w="0" w:type="dxa"/>
+              <w:right w:w="0" w:type="dxa"/>
+            </w:tcMar>
+            <w:vAlign w:val="center"/>
+          </w:tcPr>
+          <w:p>
+            <w:pPr>
+              <w:pStyle w:val="Normal"/>
+              <w:jc w:val="left"/>
+              <w:pBdr>
+                <w:bottom w:val="none" w:sz="0" w:space="0" w:color="000000"/>
+                <w:top w:val="none" w:sz="0" w:space="0" w:color="000000"/>
+                <w:left w:val="none" w:sz="0" w:space="0" w:color="000000"/>
+                <w:right w:val="none" w:sz="0" w:space="0" w:color="000000"/>
+              </w:pBdr>
+              <w:spacing w:after="100" w:before="100" w:line="240"/>
+              <w:ind w:left="100" w:right="100" w:firstLine="0" w:firstLineChars="0"/>
+              <w:rPr>
+                <w:rFonts w:ascii="Arial" w:hAnsi="Arial" w:eastAsia="Arial" w:cs="Arial"/>
+                <w:i w:val="false"/>
+                <w:b w:val="false"/>
+                <w:u w:val="none"/>
+                <w:sz w:val="18"/>
+                <w:szCs w:val="18"/>
+                <w:color w:val="000000"/>
+              </w:rPr>
+            </w:pPr>
+            <w:r>
+              <w:rPr>
+                <w:rFonts w:ascii="Arial" w:hAnsi="Arial" w:eastAsia="Arial" w:cs="Arial"/>
+                <w:i w:val="false"/>
+                <w:b w:val="false"/>
+                <w:u w:val="none"/>
+                <w:sz w:val="18"/>
+                <w:szCs w:val="18"/>
+                <w:color w:val="000000"/>
+              </w:rPr>
               <w:t xml:space="preserve">14.00 [3.00, 32.50]</w:t>
             </w:r>
           </w:p>
@@ -3426,59 +3479,6 @@
                 <w:color w:val="000000"/>
               </w:rPr>
               <w:t xml:space="preserve">58.00 [40.00, 71.00]</w:t>
-            </w:r>
-          </w:p>
-        </w:tc>
-        <w:tc>
-          <w:tcPr>
-            <w:tcBorders>
-              <w:bottom w:val="none" w:sz="0" w:space="0" w:color="000000"/>
-              <w:top w:val="none" w:sz="0" w:space="0" w:color="000000"/>
-              <w:left w:val="none" w:sz="0" w:space="0" w:color="000000"/>
-              <w:right w:val="none" w:sz="0" w:space="0" w:color="000000"/>
-            </w:tcBorders>
-            <w:shd w:val="clear" w:color="auto" w:fill="FFFFFF"/>
-            <w:tcMar>
-              <w:top w:w="0" w:type="dxa"/>
-              <w:bottom w:w="0" w:type="dxa"/>
-              <w:left w:w="0" w:type="dxa"/>
-              <w:right w:w="0" w:type="dxa"/>
-            </w:tcMar>
-            <w:vAlign w:val="center"/>
-          </w:tcPr>
-          <w:p>
-            <w:pPr>
-              <w:pStyle w:val="Normal"/>
-              <w:jc w:val="left"/>
-              <w:pBdr>
-                <w:bottom w:val="none" w:sz="0" w:space="0" w:color="000000"/>
-                <w:top w:val="none" w:sz="0" w:space="0" w:color="000000"/>
-                <w:left w:val="none" w:sz="0" w:space="0" w:color="000000"/>
-                <w:right w:val="none" w:sz="0" w:space="0" w:color="000000"/>
-              </w:pBdr>
-              <w:spacing w:after="100" w:before="100" w:line="240"/>
-              <w:ind w:left="100" w:right="100" w:firstLine="0" w:firstLineChars="0"/>
-              <w:rPr>
-                <w:rFonts w:ascii="Arial" w:hAnsi="Arial" w:eastAsia="Arial" w:cs="Arial"/>
-                <w:i w:val="false"/>
-                <w:b w:val="false"/>
-                <w:u w:val="none"/>
-                <w:sz w:val="18"/>
-                <w:szCs w:val="18"/>
-                <w:color w:val="000000"/>
-              </w:rPr>
-            </w:pPr>
-            <w:r>
-              <w:rPr>
-                <w:rFonts w:ascii="Arial" w:hAnsi="Arial" w:eastAsia="Arial" w:cs="Arial"/>
-                <w:i w:val="false"/>
-                <w:b w:val="false"/>
-                <w:u w:val="none"/>
-                <w:sz w:val="18"/>
-                <w:szCs w:val="18"/>
-                <w:color w:val="000000"/>
-              </w:rPr>
-              <w:t xml:space="preserve">9.00 [0.50, 33.50]</w:t>
             </w:r>
           </w:p>
         </w:tc>
@@ -3696,7 +3696,60 @@
                 <w:szCs w:val="18"/>
                 <w:color w:val="000000"/>
               </w:rPr>
-              <w:t xml:space="preserve">2.00 [0.00, 14.75]</w:t>
+              <w:t xml:space="preserve">1.00 [0.00, 16.00]</w:t>
+            </w:r>
+          </w:p>
+        </w:tc>
+        <w:tc>
+          <w:tcPr>
+            <w:tcBorders>
+              <w:bottom w:val="none" w:sz="0" w:space="0" w:color="000000"/>
+              <w:top w:val="none" w:sz="0" w:space="0" w:color="000000"/>
+              <w:left w:val="none" w:sz="0" w:space="0" w:color="000000"/>
+              <w:right w:val="none" w:sz="0" w:space="0" w:color="000000"/>
+            </w:tcBorders>
+            <w:shd w:val="clear" w:color="auto" w:fill="FFFFFF"/>
+            <w:tcMar>
+              <w:top w:w="0" w:type="dxa"/>
+              <w:bottom w:w="0" w:type="dxa"/>
+              <w:left w:w="0" w:type="dxa"/>
+              <w:right w:w="0" w:type="dxa"/>
+            </w:tcMar>
+            <w:vAlign w:val="center"/>
+          </w:tcPr>
+          <w:p>
+            <w:pPr>
+              <w:pStyle w:val="Normal"/>
+              <w:jc w:val="left"/>
+              <w:pBdr>
+                <w:bottom w:val="none" w:sz="0" w:space="0" w:color="000000"/>
+                <w:top w:val="none" w:sz="0" w:space="0" w:color="000000"/>
+                <w:left w:val="none" w:sz="0" w:space="0" w:color="000000"/>
+                <w:right w:val="none" w:sz="0" w:space="0" w:color="000000"/>
+              </w:pBdr>
+              <w:spacing w:after="100" w:before="100" w:line="240"/>
+              <w:ind w:left="100" w:right="100" w:firstLine="0" w:firstLineChars="0"/>
+              <w:rPr>
+                <w:rFonts w:ascii="Arial" w:hAnsi="Arial" w:eastAsia="Arial" w:cs="Arial"/>
+                <w:i w:val="false"/>
+                <w:b w:val="false"/>
+                <w:u w:val="none"/>
+                <w:sz w:val="18"/>
+                <w:szCs w:val="18"/>
+                <w:color w:val="000000"/>
+              </w:rPr>
+            </w:pPr>
+            <w:r>
+              <w:rPr>
+                <w:rFonts w:ascii="Arial" w:hAnsi="Arial" w:eastAsia="Arial" w:cs="Arial"/>
+                <w:i w:val="false"/>
+                <w:b w:val="false"/>
+                <w:u w:val="none"/>
+                <w:sz w:val="18"/>
+                <w:szCs w:val="18"/>
+                <w:color w:val="000000"/>
+              </w:rPr>
+              <w:t xml:space="preserve">2.00 [0.00, 14.50]</w:t>
             </w:r>
           </w:p>
         </w:tc>
@@ -3750,59 +3803,6 @@
                 <w:color w:val="000000"/>
               </w:rPr>
               <w:t xml:space="preserve">35.50 [10.00, 59.00]</w:t>
-            </w:r>
-          </w:p>
-        </w:tc>
-        <w:tc>
-          <w:tcPr>
-            <w:tcBorders>
-              <w:bottom w:val="none" w:sz="0" w:space="0" w:color="000000"/>
-              <w:top w:val="none" w:sz="0" w:space="0" w:color="000000"/>
-              <w:left w:val="none" w:sz="0" w:space="0" w:color="000000"/>
-              <w:right w:val="none" w:sz="0" w:space="0" w:color="000000"/>
-            </w:tcBorders>
-            <w:shd w:val="clear" w:color="auto" w:fill="FFFFFF"/>
-            <w:tcMar>
-              <w:top w:w="0" w:type="dxa"/>
-              <w:bottom w:w="0" w:type="dxa"/>
-              <w:left w:w="0" w:type="dxa"/>
-              <w:right w:w="0" w:type="dxa"/>
-            </w:tcMar>
-            <w:vAlign w:val="center"/>
-          </w:tcPr>
-          <w:p>
-            <w:pPr>
-              <w:pStyle w:val="Normal"/>
-              <w:jc w:val="left"/>
-              <w:pBdr>
-                <w:bottom w:val="none" w:sz="0" w:space="0" w:color="000000"/>
-                <w:top w:val="none" w:sz="0" w:space="0" w:color="000000"/>
-                <w:left w:val="none" w:sz="0" w:space="0" w:color="000000"/>
-                <w:right w:val="none" w:sz="0" w:space="0" w:color="000000"/>
-              </w:pBdr>
-              <w:spacing w:after="100" w:before="100" w:line="240"/>
-              <w:ind w:left="100" w:right="100" w:firstLine="0" w:firstLineChars="0"/>
-              <w:rPr>
-                <w:rFonts w:ascii="Arial" w:hAnsi="Arial" w:eastAsia="Arial" w:cs="Arial"/>
-                <w:i w:val="false"/>
-                <w:b w:val="false"/>
-                <w:u w:val="none"/>
-                <w:sz w:val="18"/>
-                <w:szCs w:val="18"/>
-                <w:color w:val="000000"/>
-              </w:rPr>
-            </w:pPr>
-            <w:r>
-              <w:rPr>
-                <w:rFonts w:ascii="Arial" w:hAnsi="Arial" w:eastAsia="Arial" w:cs="Arial"/>
-                <w:i w:val="false"/>
-                <w:b w:val="false"/>
-                <w:u w:val="none"/>
-                <w:sz w:val="18"/>
-                <w:szCs w:val="18"/>
-                <w:color w:val="000000"/>
-              </w:rPr>
-              <w:t xml:space="preserve">1.00 [0.00, 16.00]</w:t>
             </w:r>
           </w:p>
         </w:tc>
@@ -4020,7 +4020,60 @@
                 <w:szCs w:val="18"/>
                 <w:color w:val="000000"/>
               </w:rPr>
-              <w:t xml:space="preserve">30.00 [8.00, 59.00]</w:t>
+              <w:t xml:space="preserve">11.50 [1.50, 48.75]</w:t>
+            </w:r>
+          </w:p>
+        </w:tc>
+        <w:tc>
+          <w:tcPr>
+            <w:tcBorders>
+              <w:bottom w:val="none" w:sz="0" w:space="0" w:color="000000"/>
+              <w:top w:val="none" w:sz="0" w:space="0" w:color="000000"/>
+              <w:left w:val="none" w:sz="0" w:space="0" w:color="000000"/>
+              <w:right w:val="none" w:sz="0" w:space="0" w:color="000000"/>
+            </w:tcBorders>
+            <w:shd w:val="clear" w:color="auto" w:fill="FFFFFF"/>
+            <w:tcMar>
+              <w:top w:w="0" w:type="dxa"/>
+              <w:bottom w:w="0" w:type="dxa"/>
+              <w:left w:w="0" w:type="dxa"/>
+              <w:right w:w="0" w:type="dxa"/>
+            </w:tcMar>
+            <w:vAlign w:val="center"/>
+          </w:tcPr>
+          <w:p>
+            <w:pPr>
+              <w:pStyle w:val="Normal"/>
+              <w:jc w:val="left"/>
+              <w:pBdr>
+                <w:bottom w:val="none" w:sz="0" w:space="0" w:color="000000"/>
+                <w:top w:val="none" w:sz="0" w:space="0" w:color="000000"/>
+                <w:left w:val="none" w:sz="0" w:space="0" w:color="000000"/>
+                <w:right w:val="none" w:sz="0" w:space="0" w:color="000000"/>
+              </w:pBdr>
+              <w:spacing w:after="100" w:before="100" w:line="240"/>
+              <w:ind w:left="100" w:right="100" w:firstLine="0" w:firstLineChars="0"/>
+              <w:rPr>
+                <w:rFonts w:ascii="Arial" w:hAnsi="Arial" w:eastAsia="Arial" w:cs="Arial"/>
+                <w:i w:val="false"/>
+                <w:b w:val="false"/>
+                <w:u w:val="none"/>
+                <w:sz w:val="18"/>
+                <w:szCs w:val="18"/>
+                <w:color w:val="000000"/>
+              </w:rPr>
+            </w:pPr>
+            <w:r>
+              <w:rPr>
+                <w:rFonts w:ascii="Arial" w:hAnsi="Arial" w:eastAsia="Arial" w:cs="Arial"/>
+                <w:i w:val="false"/>
+                <w:b w:val="false"/>
+                <w:u w:val="none"/>
+                <w:sz w:val="18"/>
+                <w:szCs w:val="18"/>
+                <w:color w:val="000000"/>
+              </w:rPr>
+              <w:t xml:space="preserve">29.50 [8.00, 58.75]</w:t>
             </w:r>
           </w:p>
         </w:tc>
@@ -4074,59 +4127,6 @@
                 <w:color w:val="000000"/>
               </w:rPr>
               <w:t xml:space="preserve">62.00 [46.00, 76.00]</w:t>
-            </w:r>
-          </w:p>
-        </w:tc>
-        <w:tc>
-          <w:tcPr>
-            <w:tcBorders>
-              <w:bottom w:val="none" w:sz="0" w:space="0" w:color="000000"/>
-              <w:top w:val="none" w:sz="0" w:space="0" w:color="000000"/>
-              <w:left w:val="none" w:sz="0" w:space="0" w:color="000000"/>
-              <w:right w:val="none" w:sz="0" w:space="0" w:color="000000"/>
-            </w:tcBorders>
-            <w:shd w:val="clear" w:color="auto" w:fill="FFFFFF"/>
-            <w:tcMar>
-              <w:top w:w="0" w:type="dxa"/>
-              <w:bottom w:w="0" w:type="dxa"/>
-              <w:left w:w="0" w:type="dxa"/>
-              <w:right w:w="0" w:type="dxa"/>
-            </w:tcMar>
-            <w:vAlign w:val="center"/>
-          </w:tcPr>
-          <w:p>
-            <w:pPr>
-              <w:pStyle w:val="Normal"/>
-              <w:jc w:val="left"/>
-              <w:pBdr>
-                <w:bottom w:val="none" w:sz="0" w:space="0" w:color="000000"/>
-                <w:top w:val="none" w:sz="0" w:space="0" w:color="000000"/>
-                <w:left w:val="none" w:sz="0" w:space="0" w:color="000000"/>
-                <w:right w:val="none" w:sz="0" w:space="0" w:color="000000"/>
-              </w:pBdr>
-              <w:spacing w:after="100" w:before="100" w:line="240"/>
-              <w:ind w:left="100" w:right="100" w:firstLine="0" w:firstLineChars="0"/>
-              <w:rPr>
-                <w:rFonts w:ascii="Arial" w:hAnsi="Arial" w:eastAsia="Arial" w:cs="Arial"/>
-                <w:i w:val="false"/>
-                <w:b w:val="false"/>
-                <w:u w:val="none"/>
-                <w:sz w:val="18"/>
-                <w:szCs w:val="18"/>
-                <w:color w:val="000000"/>
-              </w:rPr>
-            </w:pPr>
-            <w:r>
-              <w:rPr>
-                <w:rFonts w:ascii="Arial" w:hAnsi="Arial" w:eastAsia="Arial" w:cs="Arial"/>
-                <w:i w:val="false"/>
-                <w:b w:val="false"/>
-                <w:u w:val="none"/>
-                <w:sz w:val="18"/>
-                <w:szCs w:val="18"/>
-                <w:color w:val="000000"/>
-              </w:rPr>
-              <w:t xml:space="preserve">11.50 [1.50, 48.75]</w:t>
             </w:r>
           </w:p>
         </w:tc>
@@ -4344,219 +4344,219 @@
                 <w:szCs w:val="18"/>
                 <w:color w:val="000000"/>
               </w:rPr>
-              <w:t xml:space="preserve">21 (7.9)</w:t>
-            </w:r>
-          </w:p>
-        </w:tc>
-        <w:tc>
-          <w:tcPr>
-            <w:tcBorders>
-              <w:bottom w:val="none" w:sz="0" w:space="0" w:color="000000"/>
-              <w:top w:val="none" w:sz="0" w:space="0" w:color="000000"/>
-              <w:left w:val="none" w:sz="0" w:space="0" w:color="000000"/>
-              <w:right w:val="none" w:sz="0" w:space="0" w:color="000000"/>
-            </w:tcBorders>
-            <w:shd w:val="clear" w:color="auto" w:fill="FFFFFF"/>
-            <w:tcMar>
-              <w:top w:w="0" w:type="dxa"/>
-              <w:bottom w:w="0" w:type="dxa"/>
-              <w:left w:w="0" w:type="dxa"/>
-              <w:right w:w="0" w:type="dxa"/>
-            </w:tcMar>
-            <w:vAlign w:val="center"/>
-          </w:tcPr>
-          <w:p>
-            <w:pPr>
-              <w:pStyle w:val="Normal"/>
-              <w:jc w:val="left"/>
-              <w:pBdr>
-                <w:bottom w:val="none" w:sz="0" w:space="0" w:color="000000"/>
-                <w:top w:val="none" w:sz="0" w:space="0" w:color="000000"/>
-                <w:left w:val="none" w:sz="0" w:space="0" w:color="000000"/>
-                <w:right w:val="none" w:sz="0" w:space="0" w:color="000000"/>
-              </w:pBdr>
-              <w:spacing w:after="100" w:before="100" w:line="240"/>
-              <w:ind w:left="100" w:right="100" w:firstLine="0" w:firstLineChars="0"/>
-              <w:rPr>
-                <w:rFonts w:ascii="Arial" w:hAnsi="Arial" w:eastAsia="Arial" w:cs="Arial"/>
-                <w:i w:val="false"/>
-                <w:b w:val="false"/>
-                <w:u w:val="none"/>
-                <w:sz w:val="18"/>
-                <w:szCs w:val="18"/>
-                <w:color w:val="000000"/>
-              </w:rPr>
-            </w:pPr>
-            <w:r>
-              <w:rPr>
-                <w:rFonts w:ascii="Arial" w:hAnsi="Arial" w:eastAsia="Arial" w:cs="Arial"/>
-                <w:i w:val="false"/>
-                <w:b w:val="false"/>
-                <w:u w:val="none"/>
-                <w:sz w:val="18"/>
-                <w:szCs w:val="18"/>
-                <w:color w:val="000000"/>
-              </w:rPr>
-              <w:t xml:space="preserve">11 (8.6)</w:t>
-            </w:r>
-          </w:p>
-        </w:tc>
-        <w:tc>
-          <w:tcPr>
-            <w:tcBorders>
-              <w:bottom w:val="none" w:sz="0" w:space="0" w:color="000000"/>
-              <w:top w:val="none" w:sz="0" w:space="0" w:color="000000"/>
-              <w:left w:val="none" w:sz="0" w:space="0" w:color="000000"/>
-              <w:right w:val="none" w:sz="0" w:space="0" w:color="000000"/>
-            </w:tcBorders>
-            <w:shd w:val="clear" w:color="auto" w:fill="FFFFFF"/>
-            <w:tcMar>
-              <w:top w:w="0" w:type="dxa"/>
-              <w:bottom w:w="0" w:type="dxa"/>
-              <w:left w:w="0" w:type="dxa"/>
-              <w:right w:w="0" w:type="dxa"/>
-            </w:tcMar>
-            <w:vAlign w:val="center"/>
-          </w:tcPr>
-          <w:p>
-            <w:pPr>
-              <w:pStyle w:val="Normal"/>
-              <w:jc w:val="left"/>
-              <w:pBdr>
-                <w:bottom w:val="none" w:sz="0" w:space="0" w:color="000000"/>
-                <w:top w:val="none" w:sz="0" w:space="0" w:color="000000"/>
-                <w:left w:val="none" w:sz="0" w:space="0" w:color="000000"/>
-                <w:right w:val="none" w:sz="0" w:space="0" w:color="000000"/>
-              </w:pBdr>
-              <w:spacing w:after="100" w:before="100" w:line="240"/>
-              <w:ind w:left="100" w:right="100" w:firstLine="0" w:firstLineChars="0"/>
-              <w:rPr>
-                <w:rFonts w:ascii="Arial" w:hAnsi="Arial" w:eastAsia="Arial" w:cs="Arial"/>
-                <w:i w:val="false"/>
-                <w:b w:val="false"/>
-                <w:u w:val="none"/>
-                <w:sz w:val="18"/>
-                <w:szCs w:val="18"/>
-                <w:color w:val="000000"/>
-              </w:rPr>
-            </w:pPr>
-            <w:r>
-              <w:rPr>
-                <w:rFonts w:ascii="Arial" w:hAnsi="Arial" w:eastAsia="Arial" w:cs="Arial"/>
-                <w:i w:val="false"/>
-                <w:b w:val="false"/>
-                <w:u w:val="none"/>
-                <w:sz w:val="18"/>
-                <w:szCs w:val="18"/>
-                <w:color w:val="000000"/>
-              </w:rPr>
-              <w:t xml:space="preserve">12 (19.0)</w:t>
-            </w:r>
-          </w:p>
-        </w:tc>
-        <w:tc>
-          <w:tcPr>
-            <w:tcBorders>
-              <w:bottom w:val="none" w:sz="0" w:space="0" w:color="000000"/>
-              <w:top w:val="none" w:sz="0" w:space="0" w:color="000000"/>
-              <w:left w:val="none" w:sz="0" w:space="0" w:color="000000"/>
-              <w:right w:val="none" w:sz="0" w:space="0" w:color="000000"/>
-            </w:tcBorders>
-            <w:shd w:val="clear" w:color="auto" w:fill="FFFFFF"/>
-            <w:tcMar>
-              <w:top w:w="0" w:type="dxa"/>
-              <w:bottom w:w="0" w:type="dxa"/>
-              <w:left w:w="0" w:type="dxa"/>
-              <w:right w:w="0" w:type="dxa"/>
-            </w:tcMar>
-            <w:vAlign w:val="center"/>
-          </w:tcPr>
-          <w:p>
-            <w:pPr>
-              <w:pStyle w:val="Normal"/>
-              <w:jc w:val="left"/>
-              <w:pBdr>
-                <w:bottom w:val="none" w:sz="0" w:space="0" w:color="000000"/>
-                <w:top w:val="none" w:sz="0" w:space="0" w:color="000000"/>
-                <w:left w:val="none" w:sz="0" w:space="0" w:color="000000"/>
-                <w:right w:val="none" w:sz="0" w:space="0" w:color="000000"/>
-              </w:pBdr>
-              <w:spacing w:after="100" w:before="100" w:line="240"/>
-              <w:ind w:left="100" w:right="100" w:firstLine="0" w:firstLineChars="0"/>
-              <w:rPr>
-                <w:rFonts w:ascii="Arial" w:hAnsi="Arial" w:eastAsia="Arial" w:cs="Arial"/>
-                <w:i w:val="false"/>
-                <w:b w:val="false"/>
-                <w:u w:val="none"/>
-                <w:sz w:val="18"/>
-                <w:szCs w:val="18"/>
-                <w:color w:val="000000"/>
-              </w:rPr>
-            </w:pPr>
-            <w:r>
-              <w:rPr>
-                <w:rFonts w:ascii="Arial" w:hAnsi="Arial" w:eastAsia="Arial" w:cs="Arial"/>
-                <w:i w:val="false"/>
-                <w:b w:val="false"/>
-                <w:u w:val="none"/>
-                <w:sz w:val="18"/>
-                <w:szCs w:val="18"/>
-                <w:color w:val="000000"/>
-              </w:rPr>
-              <w:t xml:space="preserve">0.024</w:t>
-            </w:r>
-          </w:p>
-        </w:tc>
-        <w:tc>
-          <w:tcPr>
-            <w:tcBorders>
-              <w:bottom w:val="none" w:sz="0" w:space="0" w:color="000000"/>
-              <w:top w:val="none" w:sz="0" w:space="0" w:color="000000"/>
-              <w:left w:val="none" w:sz="0" w:space="0" w:color="000000"/>
-              <w:right w:val="none" w:sz="0" w:space="0" w:color="000000"/>
-            </w:tcBorders>
-            <w:shd w:val="clear" w:color="auto" w:fill="FFFFFF"/>
-            <w:tcMar>
-              <w:top w:w="0" w:type="dxa"/>
-              <w:bottom w:w="0" w:type="dxa"/>
-              <w:left w:w="0" w:type="dxa"/>
-              <w:right w:w="0" w:type="dxa"/>
-            </w:tcMar>
-            <w:vAlign w:val="center"/>
-          </w:tcPr>
-          <w:p>
-            <w:pPr>
-              <w:pStyle w:val="Normal"/>
-              <w:jc w:val="left"/>
-              <w:pBdr>
-                <w:bottom w:val="none" w:sz="0" w:space="0" w:color="000000"/>
-                <w:top w:val="none" w:sz="0" w:space="0" w:color="000000"/>
-                <w:left w:val="none" w:sz="0" w:space="0" w:color="000000"/>
-                <w:right w:val="none" w:sz="0" w:space="0" w:color="000000"/>
-              </w:pBdr>
-              <w:spacing w:after="100" w:before="100" w:line="240"/>
-              <w:ind w:left="100" w:right="100" w:firstLine="0" w:firstLineChars="0"/>
-              <w:rPr>
-                <w:rFonts w:ascii="Arial" w:hAnsi="Arial" w:eastAsia="Arial" w:cs="Arial"/>
-                <w:i w:val="false"/>
-                <w:b w:val="false"/>
-                <w:u w:val="none"/>
-                <w:sz w:val="18"/>
-                <w:szCs w:val="18"/>
-                <w:color w:val="000000"/>
-              </w:rPr>
-            </w:pPr>
-            <w:r>
-              <w:rPr>
-                <w:rFonts w:ascii="Arial" w:hAnsi="Arial" w:eastAsia="Arial" w:cs="Arial"/>
-                <w:i w:val="false"/>
-                <w:b w:val="false"/>
-                <w:u w:val="none"/>
-                <w:sz w:val="18"/>
-                <w:szCs w:val="18"/>
-                <w:color w:val="000000"/>
-              </w:rPr>
-              <w:t xml:space="preserve">0.976</w:t>
+              <w:t xml:space="preserve">12 (19.0%)</w:t>
+            </w:r>
+          </w:p>
+        </w:tc>
+        <w:tc>
+          <w:tcPr>
+            <w:tcBorders>
+              <w:bottom w:val="none" w:sz="0" w:space="0" w:color="000000"/>
+              <w:top w:val="none" w:sz="0" w:space="0" w:color="000000"/>
+              <w:left w:val="none" w:sz="0" w:space="0" w:color="000000"/>
+              <w:right w:val="none" w:sz="0" w:space="0" w:color="000000"/>
+            </w:tcBorders>
+            <w:shd w:val="clear" w:color="auto" w:fill="FFFFFF"/>
+            <w:tcMar>
+              <w:top w:w="0" w:type="dxa"/>
+              <w:bottom w:w="0" w:type="dxa"/>
+              <w:left w:w="0" w:type="dxa"/>
+              <w:right w:w="0" w:type="dxa"/>
+            </w:tcMar>
+            <w:vAlign w:val="center"/>
+          </w:tcPr>
+          <w:p>
+            <w:pPr>
+              <w:pStyle w:val="Normal"/>
+              <w:jc w:val="left"/>
+              <w:pBdr>
+                <w:bottom w:val="none" w:sz="0" w:space="0" w:color="000000"/>
+                <w:top w:val="none" w:sz="0" w:space="0" w:color="000000"/>
+                <w:left w:val="none" w:sz="0" w:space="0" w:color="000000"/>
+                <w:right w:val="none" w:sz="0" w:space="0" w:color="000000"/>
+              </w:pBdr>
+              <w:spacing w:after="100" w:before="100" w:line="240"/>
+              <w:ind w:left="100" w:right="100" w:firstLine="0" w:firstLineChars="0"/>
+              <w:rPr>
+                <w:rFonts w:ascii="Arial" w:hAnsi="Arial" w:eastAsia="Arial" w:cs="Arial"/>
+                <w:i w:val="false"/>
+                <w:b w:val="false"/>
+                <w:u w:val="none"/>
+                <w:sz w:val="18"/>
+                <w:szCs w:val="18"/>
+                <w:color w:val="000000"/>
+              </w:rPr>
+            </w:pPr>
+            <w:r>
+              <w:rPr>
+                <w:rFonts w:ascii="Arial" w:hAnsi="Arial" w:eastAsia="Arial" w:cs="Arial"/>
+                <w:i w:val="false"/>
+                <w:b w:val="false"/>
+                <w:u w:val="none"/>
+                <w:sz w:val="18"/>
+                <w:szCs w:val="18"/>
+                <w:color w:val="000000"/>
+              </w:rPr>
+              <w:t xml:space="preserve">22 (8.3%)</w:t>
+            </w:r>
+          </w:p>
+        </w:tc>
+        <w:tc>
+          <w:tcPr>
+            <w:tcBorders>
+              <w:bottom w:val="none" w:sz="0" w:space="0" w:color="000000"/>
+              <w:top w:val="none" w:sz="0" w:space="0" w:color="000000"/>
+              <w:left w:val="none" w:sz="0" w:space="0" w:color="000000"/>
+              <w:right w:val="none" w:sz="0" w:space="0" w:color="000000"/>
+            </w:tcBorders>
+            <w:shd w:val="clear" w:color="auto" w:fill="FFFFFF"/>
+            <w:tcMar>
+              <w:top w:w="0" w:type="dxa"/>
+              <w:bottom w:w="0" w:type="dxa"/>
+              <w:left w:w="0" w:type="dxa"/>
+              <w:right w:w="0" w:type="dxa"/>
+            </w:tcMar>
+            <w:vAlign w:val="center"/>
+          </w:tcPr>
+          <w:p>
+            <w:pPr>
+              <w:pStyle w:val="Normal"/>
+              <w:jc w:val="left"/>
+              <w:pBdr>
+                <w:bottom w:val="none" w:sz="0" w:space="0" w:color="000000"/>
+                <w:top w:val="none" w:sz="0" w:space="0" w:color="000000"/>
+                <w:left w:val="none" w:sz="0" w:space="0" w:color="000000"/>
+                <w:right w:val="none" w:sz="0" w:space="0" w:color="000000"/>
+              </w:pBdr>
+              <w:spacing w:after="100" w:before="100" w:line="240"/>
+              <w:ind w:left="100" w:right="100" w:firstLine="0" w:firstLineChars="0"/>
+              <w:rPr>
+                <w:rFonts w:ascii="Arial" w:hAnsi="Arial" w:eastAsia="Arial" w:cs="Arial"/>
+                <w:i w:val="false"/>
+                <w:b w:val="false"/>
+                <w:u w:val="none"/>
+                <w:sz w:val="18"/>
+                <w:szCs w:val="18"/>
+                <w:color w:val="000000"/>
+              </w:rPr>
+            </w:pPr>
+            <w:r>
+              <w:rPr>
+                <w:rFonts w:ascii="Arial" w:hAnsi="Arial" w:eastAsia="Arial" w:cs="Arial"/>
+                <w:i w:val="false"/>
+                <w:b w:val="false"/>
+                <w:u w:val="none"/>
+                <w:sz w:val="18"/>
+                <w:szCs w:val="18"/>
+                <w:color w:val="000000"/>
+              </w:rPr>
+              <w:t xml:space="preserve">12 (9.3%)</w:t>
+            </w:r>
+          </w:p>
+        </w:tc>
+        <w:tc>
+          <w:tcPr>
+            <w:tcBorders>
+              <w:bottom w:val="none" w:sz="0" w:space="0" w:color="000000"/>
+              <w:top w:val="none" w:sz="0" w:space="0" w:color="000000"/>
+              <w:left w:val="none" w:sz="0" w:space="0" w:color="000000"/>
+              <w:right w:val="none" w:sz="0" w:space="0" w:color="000000"/>
+            </w:tcBorders>
+            <w:shd w:val="clear" w:color="auto" w:fill="FFFFFF"/>
+            <w:tcMar>
+              <w:top w:w="0" w:type="dxa"/>
+              <w:bottom w:w="0" w:type="dxa"/>
+              <w:left w:w="0" w:type="dxa"/>
+              <w:right w:w="0" w:type="dxa"/>
+            </w:tcMar>
+            <w:vAlign w:val="center"/>
+          </w:tcPr>
+          <w:p>
+            <w:pPr>
+              <w:pStyle w:val="Normal"/>
+              <w:jc w:val="left"/>
+              <w:pBdr>
+                <w:bottom w:val="none" w:sz="0" w:space="0" w:color="000000"/>
+                <w:top w:val="none" w:sz="0" w:space="0" w:color="000000"/>
+                <w:left w:val="none" w:sz="0" w:space="0" w:color="000000"/>
+                <w:right w:val="none" w:sz="0" w:space="0" w:color="000000"/>
+              </w:pBdr>
+              <w:spacing w:after="100" w:before="100" w:line="240"/>
+              <w:ind w:left="100" w:right="100" w:firstLine="0" w:firstLineChars="0"/>
+              <w:rPr>
+                <w:rFonts w:ascii="Arial" w:hAnsi="Arial" w:eastAsia="Arial" w:cs="Arial"/>
+                <w:i w:val="false"/>
+                <w:b w:val="false"/>
+                <w:u w:val="none"/>
+                <w:sz w:val="18"/>
+                <w:szCs w:val="18"/>
+                <w:color w:val="000000"/>
+              </w:rPr>
+            </w:pPr>
+            <w:r>
+              <w:rPr>
+                <w:rFonts w:ascii="Arial" w:hAnsi="Arial" w:eastAsia="Arial" w:cs="Arial"/>
+                <w:i w:val="false"/>
+                <w:b w:val="false"/>
+                <w:u w:val="none"/>
+                <w:sz w:val="18"/>
+                <w:szCs w:val="18"/>
+                <w:color w:val="000000"/>
+              </w:rPr>
+              <w:t xml:space="preserve">0.036</w:t>
+            </w:r>
+          </w:p>
+        </w:tc>
+        <w:tc>
+          <w:tcPr>
+            <w:tcBorders>
+              <w:bottom w:val="none" w:sz="0" w:space="0" w:color="000000"/>
+              <w:top w:val="none" w:sz="0" w:space="0" w:color="000000"/>
+              <w:left w:val="none" w:sz="0" w:space="0" w:color="000000"/>
+              <w:right w:val="none" w:sz="0" w:space="0" w:color="000000"/>
+            </w:tcBorders>
+            <w:shd w:val="clear" w:color="auto" w:fill="FFFFFF"/>
+            <w:tcMar>
+              <w:top w:w="0" w:type="dxa"/>
+              <w:bottom w:w="0" w:type="dxa"/>
+              <w:left w:w="0" w:type="dxa"/>
+              <w:right w:w="0" w:type="dxa"/>
+            </w:tcMar>
+            <w:vAlign w:val="center"/>
+          </w:tcPr>
+          <w:p>
+            <w:pPr>
+              <w:pStyle w:val="Normal"/>
+              <w:jc w:val="left"/>
+              <w:pBdr>
+                <w:bottom w:val="none" w:sz="0" w:space="0" w:color="000000"/>
+                <w:top w:val="none" w:sz="0" w:space="0" w:color="000000"/>
+                <w:left w:val="none" w:sz="0" w:space="0" w:color="000000"/>
+                <w:right w:val="none" w:sz="0" w:space="0" w:color="000000"/>
+              </w:pBdr>
+              <w:spacing w:after="100" w:before="100" w:line="240"/>
+              <w:ind w:left="100" w:right="100" w:firstLine="0" w:firstLineChars="0"/>
+              <w:rPr>
+                <w:rFonts w:ascii="Arial" w:hAnsi="Arial" w:eastAsia="Arial" w:cs="Arial"/>
+                <w:i w:val="false"/>
+                <w:b w:val="false"/>
+                <w:u w:val="none"/>
+                <w:sz w:val="18"/>
+                <w:szCs w:val="18"/>
+                <w:color w:val="000000"/>
+              </w:rPr>
+            </w:pPr>
+            <w:r>
+              <w:rPr>
+                <w:rFonts w:ascii="Arial" w:hAnsi="Arial" w:eastAsia="Arial" w:cs="Arial"/>
+                <w:i w:val="false"/>
+                <w:b w:val="false"/>
+                <w:u w:val="none"/>
+                <w:sz w:val="18"/>
+                <w:szCs w:val="18"/>
+                <w:color w:val="000000"/>
+              </w:rPr>
+              <w:t xml:space="preserve">0.880</w:t>
             </w:r>
           </w:p>
         </w:tc>
@@ -4668,112 +4668,6 @@
                 <w:szCs w:val="18"/>
                 <w:color w:val="000000"/>
               </w:rPr>
-              <w:t xml:space="preserve">450.00 [300.00, 640.00]</w:t>
-            </w:r>
-          </w:p>
-        </w:tc>
-        <w:tc>
-          <w:tcPr>
-            <w:tcBorders>
-              <w:bottom w:val="none" w:sz="0" w:space="0" w:color="000000"/>
-              <w:top w:val="none" w:sz="0" w:space="0" w:color="000000"/>
-              <w:left w:val="none" w:sz="0" w:space="0" w:color="000000"/>
-              <w:right w:val="none" w:sz="0" w:space="0" w:color="000000"/>
-            </w:tcBorders>
-            <w:shd w:val="clear" w:color="auto" w:fill="FFFFFF"/>
-            <w:tcMar>
-              <w:top w:w="0" w:type="dxa"/>
-              <w:bottom w:w="0" w:type="dxa"/>
-              <w:left w:w="0" w:type="dxa"/>
-              <w:right w:w="0" w:type="dxa"/>
-            </w:tcMar>
-            <w:vAlign w:val="center"/>
-          </w:tcPr>
-          <w:p>
-            <w:pPr>
-              <w:pStyle w:val="Normal"/>
-              <w:jc w:val="left"/>
-              <w:pBdr>
-                <w:bottom w:val="none" w:sz="0" w:space="0" w:color="000000"/>
-                <w:top w:val="none" w:sz="0" w:space="0" w:color="000000"/>
-                <w:left w:val="none" w:sz="0" w:space="0" w:color="000000"/>
-                <w:right w:val="none" w:sz="0" w:space="0" w:color="000000"/>
-              </w:pBdr>
-              <w:spacing w:after="100" w:before="100" w:line="240"/>
-              <w:ind w:left="100" w:right="100" w:firstLine="0" w:firstLineChars="0"/>
-              <w:rPr>
-                <w:rFonts w:ascii="Arial" w:hAnsi="Arial" w:eastAsia="Arial" w:cs="Arial"/>
-                <w:i w:val="false"/>
-                <w:b w:val="false"/>
-                <w:u w:val="none"/>
-                <w:sz w:val="18"/>
-                <w:szCs w:val="18"/>
-                <w:color w:val="000000"/>
-              </w:rPr>
-            </w:pPr>
-            <w:r>
-              <w:rPr>
-                <w:rFonts w:ascii="Arial" w:hAnsi="Arial" w:eastAsia="Arial" w:cs="Arial"/>
-                <w:i w:val="false"/>
-                <w:b w:val="false"/>
-                <w:u w:val="none"/>
-                <w:sz w:val="18"/>
-                <w:szCs w:val="18"/>
-                <w:color w:val="000000"/>
-              </w:rPr>
-              <w:t xml:space="preserve">400.00 [245.00, 585.00]</w:t>
-            </w:r>
-          </w:p>
-        </w:tc>
-        <w:tc>
-          <w:tcPr>
-            <w:tcBorders>
-              <w:bottom w:val="none" w:sz="0" w:space="0" w:color="000000"/>
-              <w:top w:val="none" w:sz="0" w:space="0" w:color="000000"/>
-              <w:left w:val="none" w:sz="0" w:space="0" w:color="000000"/>
-              <w:right w:val="none" w:sz="0" w:space="0" w:color="000000"/>
-            </w:tcBorders>
-            <w:shd w:val="clear" w:color="auto" w:fill="FFFFFF"/>
-            <w:tcMar>
-              <w:top w:w="0" w:type="dxa"/>
-              <w:bottom w:w="0" w:type="dxa"/>
-              <w:left w:w="0" w:type="dxa"/>
-              <w:right w:w="0" w:type="dxa"/>
-            </w:tcMar>
-            <w:vAlign w:val="center"/>
-          </w:tcPr>
-          <w:p>
-            <w:pPr>
-              <w:pStyle w:val="Normal"/>
-              <w:jc w:val="left"/>
-              <w:pBdr>
-                <w:bottom w:val="none" w:sz="0" w:space="0" w:color="000000"/>
-                <w:top w:val="none" w:sz="0" w:space="0" w:color="000000"/>
-                <w:left w:val="none" w:sz="0" w:space="0" w:color="000000"/>
-                <w:right w:val="none" w:sz="0" w:space="0" w:color="000000"/>
-              </w:pBdr>
-              <w:spacing w:after="100" w:before="100" w:line="240"/>
-              <w:ind w:left="100" w:right="100" w:firstLine="0" w:firstLineChars="0"/>
-              <w:rPr>
-                <w:rFonts w:ascii="Arial" w:hAnsi="Arial" w:eastAsia="Arial" w:cs="Arial"/>
-                <w:i w:val="false"/>
-                <w:b w:val="false"/>
-                <w:u w:val="none"/>
-                <w:sz w:val="18"/>
-                <w:szCs w:val="18"/>
-                <w:color w:val="000000"/>
-              </w:rPr>
-            </w:pPr>
-            <w:r>
-              <w:rPr>
-                <w:rFonts w:ascii="Arial" w:hAnsi="Arial" w:eastAsia="Arial" w:cs="Arial"/>
-                <w:i w:val="false"/>
-                <w:b w:val="false"/>
-                <w:u w:val="none"/>
-                <w:sz w:val="18"/>
-                <w:szCs w:val="18"/>
-                <w:color w:val="000000"/>
-              </w:rPr>
               <w:t xml:space="preserve">500.00 [335.00, 700.00]</w:t>
             </w:r>
           </w:p>
@@ -4827,60 +4721,166 @@
                 <w:szCs w:val="18"/>
                 <w:color w:val="000000"/>
               </w:rPr>
-              <w:t xml:space="preserve">0.021</w:t>
-            </w:r>
-          </w:p>
-        </w:tc>
-        <w:tc>
-          <w:tcPr>
-            <w:tcBorders>
-              <w:bottom w:val="none" w:sz="0" w:space="0" w:color="000000"/>
-              <w:top w:val="none" w:sz="0" w:space="0" w:color="000000"/>
-              <w:left w:val="none" w:sz="0" w:space="0" w:color="000000"/>
-              <w:right w:val="none" w:sz="0" w:space="0" w:color="000000"/>
-            </w:tcBorders>
-            <w:shd w:val="clear" w:color="auto" w:fill="FFFFFF"/>
-            <w:tcMar>
-              <w:top w:w="0" w:type="dxa"/>
-              <w:bottom w:w="0" w:type="dxa"/>
-              <w:left w:w="0" w:type="dxa"/>
-              <w:right w:w="0" w:type="dxa"/>
-            </w:tcMar>
-            <w:vAlign w:val="center"/>
-          </w:tcPr>
-          <w:p>
-            <w:pPr>
-              <w:pStyle w:val="Normal"/>
-              <w:jc w:val="left"/>
-              <w:pBdr>
-                <w:bottom w:val="none" w:sz="0" w:space="0" w:color="000000"/>
-                <w:top w:val="none" w:sz="0" w:space="0" w:color="000000"/>
-                <w:left w:val="none" w:sz="0" w:space="0" w:color="000000"/>
-                <w:right w:val="none" w:sz="0" w:space="0" w:color="000000"/>
-              </w:pBdr>
-              <w:spacing w:after="100" w:before="100" w:line="240"/>
-              <w:ind w:left="100" w:right="100" w:firstLine="0" w:firstLineChars="0"/>
-              <w:rPr>
-                <w:rFonts w:ascii="Arial" w:hAnsi="Arial" w:eastAsia="Arial" w:cs="Arial"/>
-                <w:i w:val="false"/>
-                <w:b w:val="false"/>
-                <w:u w:val="none"/>
-                <w:sz w:val="18"/>
-                <w:szCs w:val="18"/>
-                <w:color w:val="000000"/>
-              </w:rPr>
-            </w:pPr>
-            <w:r>
-              <w:rPr>
-                <w:rFonts w:ascii="Arial" w:hAnsi="Arial" w:eastAsia="Arial" w:cs="Arial"/>
-                <w:i w:val="false"/>
-                <w:b w:val="false"/>
-                <w:u w:val="none"/>
-                <w:sz w:val="18"/>
-                <w:szCs w:val="18"/>
-                <w:color w:val="000000"/>
-              </w:rPr>
-              <w:t xml:space="preserve">0.020</w:t>
+              <w:t xml:space="preserve">450.00 [300.00, 647.50]</w:t>
+            </w:r>
+          </w:p>
+        </w:tc>
+        <w:tc>
+          <w:tcPr>
+            <w:tcBorders>
+              <w:bottom w:val="none" w:sz="0" w:space="0" w:color="000000"/>
+              <w:top w:val="none" w:sz="0" w:space="0" w:color="000000"/>
+              <w:left w:val="none" w:sz="0" w:space="0" w:color="000000"/>
+              <w:right w:val="none" w:sz="0" w:space="0" w:color="000000"/>
+            </w:tcBorders>
+            <w:shd w:val="clear" w:color="auto" w:fill="FFFFFF"/>
+            <w:tcMar>
+              <w:top w:w="0" w:type="dxa"/>
+              <w:bottom w:w="0" w:type="dxa"/>
+              <w:left w:w="0" w:type="dxa"/>
+              <w:right w:w="0" w:type="dxa"/>
+            </w:tcMar>
+            <w:vAlign w:val="center"/>
+          </w:tcPr>
+          <w:p>
+            <w:pPr>
+              <w:pStyle w:val="Normal"/>
+              <w:jc w:val="left"/>
+              <w:pBdr>
+                <w:bottom w:val="none" w:sz="0" w:space="0" w:color="000000"/>
+                <w:top w:val="none" w:sz="0" w:space="0" w:color="000000"/>
+                <w:left w:val="none" w:sz="0" w:space="0" w:color="000000"/>
+                <w:right w:val="none" w:sz="0" w:space="0" w:color="000000"/>
+              </w:pBdr>
+              <w:spacing w:after="100" w:before="100" w:line="240"/>
+              <w:ind w:left="100" w:right="100" w:firstLine="0" w:firstLineChars="0"/>
+              <w:rPr>
+                <w:rFonts w:ascii="Arial" w:hAnsi="Arial" w:eastAsia="Arial" w:cs="Arial"/>
+                <w:i w:val="false"/>
+                <w:b w:val="false"/>
+                <w:u w:val="none"/>
+                <w:sz w:val="18"/>
+                <w:szCs w:val="18"/>
+                <w:color w:val="000000"/>
+              </w:rPr>
+            </w:pPr>
+            <w:r>
+              <w:rPr>
+                <w:rFonts w:ascii="Arial" w:hAnsi="Arial" w:eastAsia="Arial" w:cs="Arial"/>
+                <w:i w:val="false"/>
+                <w:b w:val="false"/>
+                <w:u w:val="none"/>
+                <w:sz w:val="18"/>
+                <w:szCs w:val="18"/>
+                <w:color w:val="000000"/>
+              </w:rPr>
+              <w:t xml:space="preserve">400.00 [247.50, 582.50]</w:t>
+            </w:r>
+          </w:p>
+        </w:tc>
+        <w:tc>
+          <w:tcPr>
+            <w:tcBorders>
+              <w:bottom w:val="none" w:sz="0" w:space="0" w:color="000000"/>
+              <w:top w:val="none" w:sz="0" w:space="0" w:color="000000"/>
+              <w:left w:val="none" w:sz="0" w:space="0" w:color="000000"/>
+              <w:right w:val="none" w:sz="0" w:space="0" w:color="000000"/>
+            </w:tcBorders>
+            <w:shd w:val="clear" w:color="auto" w:fill="FFFFFF"/>
+            <w:tcMar>
+              <w:top w:w="0" w:type="dxa"/>
+              <w:bottom w:w="0" w:type="dxa"/>
+              <w:left w:w="0" w:type="dxa"/>
+              <w:right w:w="0" w:type="dxa"/>
+            </w:tcMar>
+            <w:vAlign w:val="center"/>
+          </w:tcPr>
+          <w:p>
+            <w:pPr>
+              <w:pStyle w:val="Normal"/>
+              <w:jc w:val="left"/>
+              <w:pBdr>
+                <w:bottom w:val="none" w:sz="0" w:space="0" w:color="000000"/>
+                <w:top w:val="none" w:sz="0" w:space="0" w:color="000000"/>
+                <w:left w:val="none" w:sz="0" w:space="0" w:color="000000"/>
+                <w:right w:val="none" w:sz="0" w:space="0" w:color="000000"/>
+              </w:pBdr>
+              <w:spacing w:after="100" w:before="100" w:line="240"/>
+              <w:ind w:left="100" w:right="100" w:firstLine="0" w:firstLineChars="0"/>
+              <w:rPr>
+                <w:rFonts w:ascii="Arial" w:hAnsi="Arial" w:eastAsia="Arial" w:cs="Arial"/>
+                <w:i w:val="false"/>
+                <w:b w:val="false"/>
+                <w:u w:val="none"/>
+                <w:sz w:val="18"/>
+                <w:szCs w:val="18"/>
+                <w:color w:val="000000"/>
+              </w:rPr>
+            </w:pPr>
+            <w:r>
+              <w:rPr>
+                <w:rFonts w:ascii="Arial" w:hAnsi="Arial" w:eastAsia="Arial" w:cs="Arial"/>
+                <w:i w:val="false"/>
+                <w:b w:val="false"/>
+                <w:u w:val="none"/>
+                <w:sz w:val="18"/>
+                <w:szCs w:val="18"/>
+                <w:color w:val="000000"/>
+              </w:rPr>
+              <w:t xml:space="preserve">0.019</w:t>
+            </w:r>
+          </w:p>
+        </w:tc>
+        <w:tc>
+          <w:tcPr>
+            <w:tcBorders>
+              <w:bottom w:val="none" w:sz="0" w:space="0" w:color="000000"/>
+              <w:top w:val="none" w:sz="0" w:space="0" w:color="000000"/>
+              <w:left w:val="none" w:sz="0" w:space="0" w:color="000000"/>
+              <w:right w:val="none" w:sz="0" w:space="0" w:color="000000"/>
+            </w:tcBorders>
+            <w:shd w:val="clear" w:color="auto" w:fill="FFFFFF"/>
+            <w:tcMar>
+              <w:top w:w="0" w:type="dxa"/>
+              <w:bottom w:w="0" w:type="dxa"/>
+              <w:left w:w="0" w:type="dxa"/>
+              <w:right w:w="0" w:type="dxa"/>
+            </w:tcMar>
+            <w:vAlign w:val="center"/>
+          </w:tcPr>
+          <w:p>
+            <w:pPr>
+              <w:pStyle w:val="Normal"/>
+              <w:jc w:val="left"/>
+              <w:pBdr>
+                <w:bottom w:val="none" w:sz="0" w:space="0" w:color="000000"/>
+                <w:top w:val="none" w:sz="0" w:space="0" w:color="000000"/>
+                <w:left w:val="none" w:sz="0" w:space="0" w:color="000000"/>
+                <w:right w:val="none" w:sz="0" w:space="0" w:color="000000"/>
+              </w:pBdr>
+              <w:spacing w:after="100" w:before="100" w:line="240"/>
+              <w:ind w:left="100" w:right="100" w:firstLine="0" w:firstLineChars="0"/>
+              <w:rPr>
+                <w:rFonts w:ascii="Arial" w:hAnsi="Arial" w:eastAsia="Arial" w:cs="Arial"/>
+                <w:i w:val="false"/>
+                <w:b w:val="false"/>
+                <w:u w:val="none"/>
+                <w:sz w:val="18"/>
+                <w:szCs w:val="18"/>
+                <w:color w:val="000000"/>
+              </w:rPr>
+            </w:pPr>
+            <w:r>
+              <w:rPr>
+                <w:rFonts w:ascii="Arial" w:hAnsi="Arial" w:eastAsia="Arial" w:cs="Arial"/>
+                <w:i w:val="false"/>
+                <w:b w:val="false"/>
+                <w:u w:val="none"/>
+                <w:sz w:val="18"/>
+                <w:szCs w:val="18"/>
+                <w:color w:val="000000"/>
+              </w:rPr>
+              <w:t xml:space="preserve">0.017</w:t>
             </w:r>
           </w:p>
         </w:tc>
@@ -4992,6 +4992,59 @@
                 <w:szCs w:val="18"/>
                 <w:color w:val="000000"/>
               </w:rPr>
+              <w:t xml:space="preserve">1.00 [0.00, 1.00]</w:t>
+            </w:r>
+          </w:p>
+        </w:tc>
+        <w:tc>
+          <w:tcPr>
+            <w:tcBorders>
+              <w:bottom w:val="none" w:sz="0" w:space="0" w:color="000000"/>
+              <w:top w:val="none" w:sz="0" w:space="0" w:color="000000"/>
+              <w:left w:val="none" w:sz="0" w:space="0" w:color="000000"/>
+              <w:right w:val="none" w:sz="0" w:space="0" w:color="000000"/>
+            </w:tcBorders>
+            <w:shd w:val="clear" w:color="auto" w:fill="FFFFFF"/>
+            <w:tcMar>
+              <w:top w:w="0" w:type="dxa"/>
+              <w:bottom w:w="0" w:type="dxa"/>
+              <w:left w:w="0" w:type="dxa"/>
+              <w:right w:w="0" w:type="dxa"/>
+            </w:tcMar>
+            <w:vAlign w:val="center"/>
+          </w:tcPr>
+          <w:p>
+            <w:pPr>
+              <w:pStyle w:val="Normal"/>
+              <w:jc w:val="left"/>
+              <w:pBdr>
+                <w:bottom w:val="none" w:sz="0" w:space="0" w:color="000000"/>
+                <w:top w:val="none" w:sz="0" w:space="0" w:color="000000"/>
+                <w:left w:val="none" w:sz="0" w:space="0" w:color="000000"/>
+                <w:right w:val="none" w:sz="0" w:space="0" w:color="000000"/>
+              </w:pBdr>
+              <w:spacing w:after="100" w:before="100" w:line="240"/>
+              <w:ind w:left="100" w:right="100" w:firstLine="0" w:firstLineChars="0"/>
+              <w:rPr>
+                <w:rFonts w:ascii="Arial" w:hAnsi="Arial" w:eastAsia="Arial" w:cs="Arial"/>
+                <w:i w:val="false"/>
+                <w:b w:val="false"/>
+                <w:u w:val="none"/>
+                <w:sz w:val="18"/>
+                <w:szCs w:val="18"/>
+                <w:color w:val="000000"/>
+              </w:rPr>
+            </w:pPr>
+            <w:r>
+              <w:rPr>
+                <w:rFonts w:ascii="Arial" w:hAnsi="Arial" w:eastAsia="Arial" w:cs="Arial"/>
+                <w:i w:val="false"/>
+                <w:b w:val="false"/>
+                <w:u w:val="none"/>
+                <w:sz w:val="18"/>
+                <w:szCs w:val="18"/>
+                <w:color w:val="000000"/>
+              </w:rPr>
               <w:t xml:space="preserve">1.00 [0.00, 3.00]</w:t>
             </w:r>
           </w:p>
@@ -5046,59 +5099,6 @@
                 <w:color w:val="000000"/>
               </w:rPr>
               <w:t xml:space="preserve">3.00 [1.00, 5.00]</w:t>
-            </w:r>
-          </w:p>
-        </w:tc>
-        <w:tc>
-          <w:tcPr>
-            <w:tcBorders>
-              <w:bottom w:val="none" w:sz="0" w:space="0" w:color="000000"/>
-              <w:top w:val="none" w:sz="0" w:space="0" w:color="000000"/>
-              <w:left w:val="none" w:sz="0" w:space="0" w:color="000000"/>
-              <w:right w:val="none" w:sz="0" w:space="0" w:color="000000"/>
-            </w:tcBorders>
-            <w:shd w:val="clear" w:color="auto" w:fill="FFFFFF"/>
-            <w:tcMar>
-              <w:top w:w="0" w:type="dxa"/>
-              <w:bottom w:w="0" w:type="dxa"/>
-              <w:left w:w="0" w:type="dxa"/>
-              <w:right w:w="0" w:type="dxa"/>
-            </w:tcMar>
-            <w:vAlign w:val="center"/>
-          </w:tcPr>
-          <w:p>
-            <w:pPr>
-              <w:pStyle w:val="Normal"/>
-              <w:jc w:val="left"/>
-              <w:pBdr>
-                <w:bottom w:val="none" w:sz="0" w:space="0" w:color="000000"/>
-                <w:top w:val="none" w:sz="0" w:space="0" w:color="000000"/>
-                <w:left w:val="none" w:sz="0" w:space="0" w:color="000000"/>
-                <w:right w:val="none" w:sz="0" w:space="0" w:color="000000"/>
-              </w:pBdr>
-              <w:spacing w:after="100" w:before="100" w:line="240"/>
-              <w:ind w:left="100" w:right="100" w:firstLine="0" w:firstLineChars="0"/>
-              <w:rPr>
-                <w:rFonts w:ascii="Arial" w:hAnsi="Arial" w:eastAsia="Arial" w:cs="Arial"/>
-                <w:i w:val="false"/>
-                <w:b w:val="false"/>
-                <w:u w:val="none"/>
-                <w:sz w:val="18"/>
-                <w:szCs w:val="18"/>
-                <w:color w:val="000000"/>
-              </w:rPr>
-            </w:pPr>
-            <w:r>
-              <w:rPr>
-                <w:rFonts w:ascii="Arial" w:hAnsi="Arial" w:eastAsia="Arial" w:cs="Arial"/>
-                <w:i w:val="false"/>
-                <w:b w:val="false"/>
-                <w:u w:val="none"/>
-                <w:sz w:val="18"/>
-                <w:szCs w:val="18"/>
-                <w:color w:val="000000"/>
-              </w:rPr>
-              <w:t xml:space="preserve">1.00 [0.00, 1.00]</w:t>
             </w:r>
           </w:p>
         </w:tc>
@@ -5528,7 +5528,7 @@
                 <w:szCs w:val="18"/>
                 <w:color w:val="000000"/>
               </w:rPr>
-              <w:t xml:space="preserve">0.420</w:t>
+              <w:t xml:space="preserve">0.423</w:t>
             </w:r>
           </w:p>
         </w:tc>
@@ -5640,113 +5640,113 @@
                 <w:szCs w:val="18"/>
                 <w:color w:val="000000"/>
               </w:rPr>
-              <w:t xml:space="preserve">2 (0.8)</w:t>
-            </w:r>
-          </w:p>
-        </w:tc>
-        <w:tc>
-          <w:tcPr>
-            <w:tcBorders>
-              <w:bottom w:val="none" w:sz="0" w:space="0" w:color="000000"/>
-              <w:top w:val="none" w:sz="0" w:space="0" w:color="000000"/>
-              <w:left w:val="none" w:sz="0" w:space="0" w:color="000000"/>
-              <w:right w:val="none" w:sz="0" w:space="0" w:color="000000"/>
-            </w:tcBorders>
-            <w:shd w:val="clear" w:color="auto" w:fill="FFFFFF"/>
-            <w:tcMar>
-              <w:top w:w="0" w:type="dxa"/>
-              <w:bottom w:w="0" w:type="dxa"/>
-              <w:left w:w="0" w:type="dxa"/>
-              <w:right w:w="0" w:type="dxa"/>
-            </w:tcMar>
-            <w:vAlign w:val="center"/>
-          </w:tcPr>
-          <w:p>
-            <w:pPr>
-              <w:pStyle w:val="Normal"/>
-              <w:jc w:val="left"/>
-              <w:pBdr>
-                <w:bottom w:val="none" w:sz="0" w:space="0" w:color="000000"/>
-                <w:top w:val="none" w:sz="0" w:space="0" w:color="000000"/>
-                <w:left w:val="none" w:sz="0" w:space="0" w:color="000000"/>
-                <w:right w:val="none" w:sz="0" w:space="0" w:color="000000"/>
-              </w:pBdr>
-              <w:spacing w:after="100" w:before="100" w:line="240"/>
-              <w:ind w:left="100" w:right="100" w:firstLine="0" w:firstLineChars="0"/>
-              <w:rPr>
-                <w:rFonts w:ascii="Arial" w:hAnsi="Arial" w:eastAsia="Arial" w:cs="Arial"/>
-                <w:i w:val="false"/>
-                <w:b w:val="false"/>
-                <w:u w:val="none"/>
-                <w:sz w:val="18"/>
-                <w:szCs w:val="18"/>
-                <w:color w:val="000000"/>
-              </w:rPr>
-            </w:pPr>
-            <w:r>
-              <w:rPr>
-                <w:rFonts w:ascii="Arial" w:hAnsi="Arial" w:eastAsia="Arial" w:cs="Arial"/>
-                <w:i w:val="false"/>
-                <w:b w:val="false"/>
-                <w:u w:val="none"/>
-                <w:sz w:val="18"/>
-                <w:szCs w:val="18"/>
-                <w:color w:val="000000"/>
-              </w:rPr>
-              <w:t xml:space="preserve">3 (2.3)</w:t>
-            </w:r>
-          </w:p>
-        </w:tc>
-        <w:tc>
-          <w:tcPr>
-            <w:tcBorders>
-              <w:bottom w:val="none" w:sz="0" w:space="0" w:color="000000"/>
-              <w:top w:val="none" w:sz="0" w:space="0" w:color="000000"/>
-              <w:left w:val="none" w:sz="0" w:space="0" w:color="000000"/>
-              <w:right w:val="none" w:sz="0" w:space="0" w:color="000000"/>
-            </w:tcBorders>
-            <w:shd w:val="clear" w:color="auto" w:fill="FFFFFF"/>
-            <w:tcMar>
-              <w:top w:w="0" w:type="dxa"/>
-              <w:bottom w:w="0" w:type="dxa"/>
-              <w:left w:w="0" w:type="dxa"/>
-              <w:right w:w="0" w:type="dxa"/>
-            </w:tcMar>
-            <w:vAlign w:val="center"/>
-          </w:tcPr>
-          <w:p>
-            <w:pPr>
-              <w:pStyle w:val="Normal"/>
-              <w:jc w:val="left"/>
-              <w:pBdr>
-                <w:bottom w:val="none" w:sz="0" w:space="0" w:color="000000"/>
-                <w:top w:val="none" w:sz="0" w:space="0" w:color="000000"/>
-                <w:left w:val="none" w:sz="0" w:space="0" w:color="000000"/>
-                <w:right w:val="none" w:sz="0" w:space="0" w:color="000000"/>
-              </w:pBdr>
-              <w:spacing w:after="100" w:before="100" w:line="240"/>
-              <w:ind w:left="100" w:right="100" w:firstLine="0" w:firstLineChars="0"/>
-              <w:rPr>
-                <w:rFonts w:ascii="Arial" w:hAnsi="Arial" w:eastAsia="Arial" w:cs="Arial"/>
-                <w:i w:val="false"/>
-                <w:b w:val="false"/>
-                <w:u w:val="none"/>
-                <w:sz w:val="18"/>
-                <w:szCs w:val="18"/>
-                <w:color w:val="000000"/>
-              </w:rPr>
-            </w:pPr>
-            <w:r>
-              <w:rPr>
-                <w:rFonts w:ascii="Arial" w:hAnsi="Arial" w:eastAsia="Arial" w:cs="Arial"/>
-                <w:i w:val="false"/>
-                <w:b w:val="false"/>
-                <w:u w:val="none"/>
-                <w:sz w:val="18"/>
-                <w:szCs w:val="18"/>
-                <w:color w:val="000000"/>
-              </w:rPr>
-              <w:t xml:space="preserve">0 (0.0)</w:t>
+              <w:t xml:space="preserve">0 (0.0%)</w:t>
+            </w:r>
+          </w:p>
+        </w:tc>
+        <w:tc>
+          <w:tcPr>
+            <w:tcBorders>
+              <w:bottom w:val="none" w:sz="0" w:space="0" w:color="000000"/>
+              <w:top w:val="none" w:sz="0" w:space="0" w:color="000000"/>
+              <w:left w:val="none" w:sz="0" w:space="0" w:color="000000"/>
+              <w:right w:val="none" w:sz="0" w:space="0" w:color="000000"/>
+            </w:tcBorders>
+            <w:shd w:val="clear" w:color="auto" w:fill="FFFFFF"/>
+            <w:tcMar>
+              <w:top w:w="0" w:type="dxa"/>
+              <w:bottom w:w="0" w:type="dxa"/>
+              <w:left w:w="0" w:type="dxa"/>
+              <w:right w:w="0" w:type="dxa"/>
+            </w:tcMar>
+            <w:vAlign w:val="center"/>
+          </w:tcPr>
+          <w:p>
+            <w:pPr>
+              <w:pStyle w:val="Normal"/>
+              <w:jc w:val="left"/>
+              <w:pBdr>
+                <w:bottom w:val="none" w:sz="0" w:space="0" w:color="000000"/>
+                <w:top w:val="none" w:sz="0" w:space="0" w:color="000000"/>
+                <w:left w:val="none" w:sz="0" w:space="0" w:color="000000"/>
+                <w:right w:val="none" w:sz="0" w:space="0" w:color="000000"/>
+              </w:pBdr>
+              <w:spacing w:after="100" w:before="100" w:line="240"/>
+              <w:ind w:left="100" w:right="100" w:firstLine="0" w:firstLineChars="0"/>
+              <w:rPr>
+                <w:rFonts w:ascii="Arial" w:hAnsi="Arial" w:eastAsia="Arial" w:cs="Arial"/>
+                <w:i w:val="false"/>
+                <w:b w:val="false"/>
+                <w:u w:val="none"/>
+                <w:sz w:val="18"/>
+                <w:szCs w:val="18"/>
+                <w:color w:val="000000"/>
+              </w:rPr>
+            </w:pPr>
+            <w:r>
+              <w:rPr>
+                <w:rFonts w:ascii="Arial" w:hAnsi="Arial" w:eastAsia="Arial" w:cs="Arial"/>
+                <w:i w:val="false"/>
+                <w:b w:val="false"/>
+                <w:u w:val="none"/>
+                <w:sz w:val="18"/>
+                <w:szCs w:val="18"/>
+                <w:color w:val="000000"/>
+              </w:rPr>
+              <w:t xml:space="preserve">2 (0.8%)</w:t>
+            </w:r>
+          </w:p>
+        </w:tc>
+        <w:tc>
+          <w:tcPr>
+            <w:tcBorders>
+              <w:bottom w:val="none" w:sz="0" w:space="0" w:color="000000"/>
+              <w:top w:val="none" w:sz="0" w:space="0" w:color="000000"/>
+              <w:left w:val="none" w:sz="0" w:space="0" w:color="000000"/>
+              <w:right w:val="none" w:sz="0" w:space="0" w:color="000000"/>
+            </w:tcBorders>
+            <w:shd w:val="clear" w:color="auto" w:fill="FFFFFF"/>
+            <w:tcMar>
+              <w:top w:w="0" w:type="dxa"/>
+              <w:bottom w:w="0" w:type="dxa"/>
+              <w:left w:w="0" w:type="dxa"/>
+              <w:right w:w="0" w:type="dxa"/>
+            </w:tcMar>
+            <w:vAlign w:val="center"/>
+          </w:tcPr>
+          <w:p>
+            <w:pPr>
+              <w:pStyle w:val="Normal"/>
+              <w:jc w:val="left"/>
+              <w:pBdr>
+                <w:bottom w:val="none" w:sz="0" w:space="0" w:color="000000"/>
+                <w:top w:val="none" w:sz="0" w:space="0" w:color="000000"/>
+                <w:left w:val="none" w:sz="0" w:space="0" w:color="000000"/>
+                <w:right w:val="none" w:sz="0" w:space="0" w:color="000000"/>
+              </w:pBdr>
+              <w:spacing w:after="100" w:before="100" w:line="240"/>
+              <w:ind w:left="100" w:right="100" w:firstLine="0" w:firstLineChars="0"/>
+              <w:rPr>
+                <w:rFonts w:ascii="Arial" w:hAnsi="Arial" w:eastAsia="Arial" w:cs="Arial"/>
+                <w:i w:val="false"/>
+                <w:b w:val="false"/>
+                <w:u w:val="none"/>
+                <w:sz w:val="18"/>
+                <w:szCs w:val="18"/>
+                <w:color w:val="000000"/>
+              </w:rPr>
+            </w:pPr>
+            <w:r>
+              <w:rPr>
+                <w:rFonts w:ascii="Arial" w:hAnsi="Arial" w:eastAsia="Arial" w:cs="Arial"/>
+                <w:i w:val="false"/>
+                <w:b w:val="false"/>
+                <w:u w:val="none"/>
+                <w:sz w:val="18"/>
+                <w:szCs w:val="18"/>
+                <w:color w:val="000000"/>
+              </w:rPr>
+              <w:t xml:space="preserve">3 (2.3%)</w:t>
             </w:r>
           </w:p>
         </w:tc>
@@ -5964,113 +5964,113 @@
                 <w:szCs w:val="18"/>
                 <w:color w:val="000000"/>
               </w:rPr>
-              <w:t xml:space="preserve">2 (0.8)</w:t>
-            </w:r>
-          </w:p>
-        </w:tc>
-        <w:tc>
-          <w:tcPr>
-            <w:tcBorders>
-              <w:bottom w:val="none" w:sz="0" w:space="0" w:color="000000"/>
-              <w:top w:val="none" w:sz="0" w:space="0" w:color="000000"/>
-              <w:left w:val="none" w:sz="0" w:space="0" w:color="000000"/>
-              <w:right w:val="none" w:sz="0" w:space="0" w:color="000000"/>
-            </w:tcBorders>
-            <w:shd w:val="clear" w:color="auto" w:fill="FFFFFF"/>
-            <w:tcMar>
-              <w:top w:w="0" w:type="dxa"/>
-              <w:bottom w:w="0" w:type="dxa"/>
-              <w:left w:w="0" w:type="dxa"/>
-              <w:right w:w="0" w:type="dxa"/>
-            </w:tcMar>
-            <w:vAlign w:val="center"/>
-          </w:tcPr>
-          <w:p>
-            <w:pPr>
-              <w:pStyle w:val="Normal"/>
-              <w:jc w:val="left"/>
-              <w:pBdr>
-                <w:bottom w:val="none" w:sz="0" w:space="0" w:color="000000"/>
-                <w:top w:val="none" w:sz="0" w:space="0" w:color="000000"/>
-                <w:left w:val="none" w:sz="0" w:space="0" w:color="000000"/>
-                <w:right w:val="none" w:sz="0" w:space="0" w:color="000000"/>
-              </w:pBdr>
-              <w:spacing w:after="100" w:before="100" w:line="240"/>
-              <w:ind w:left="100" w:right="100" w:firstLine="0" w:firstLineChars="0"/>
-              <w:rPr>
-                <w:rFonts w:ascii="Arial" w:hAnsi="Arial" w:eastAsia="Arial" w:cs="Arial"/>
-                <w:i w:val="false"/>
-                <w:b w:val="false"/>
-                <w:u w:val="none"/>
-                <w:sz w:val="18"/>
-                <w:szCs w:val="18"/>
-                <w:color w:val="000000"/>
-              </w:rPr>
-            </w:pPr>
-            <w:r>
-              <w:rPr>
-                <w:rFonts w:ascii="Arial" w:hAnsi="Arial" w:eastAsia="Arial" w:cs="Arial"/>
-                <w:i w:val="false"/>
-                <w:b w:val="false"/>
-                <w:u w:val="none"/>
-                <w:sz w:val="18"/>
-                <w:szCs w:val="18"/>
-                <w:color w:val="000000"/>
-              </w:rPr>
-              <w:t xml:space="preserve">1 (0.8)</w:t>
-            </w:r>
-          </w:p>
-        </w:tc>
-        <w:tc>
-          <w:tcPr>
-            <w:tcBorders>
-              <w:bottom w:val="none" w:sz="0" w:space="0" w:color="000000"/>
-              <w:top w:val="none" w:sz="0" w:space="0" w:color="000000"/>
-              <w:left w:val="none" w:sz="0" w:space="0" w:color="000000"/>
-              <w:right w:val="none" w:sz="0" w:space="0" w:color="000000"/>
-            </w:tcBorders>
-            <w:shd w:val="clear" w:color="auto" w:fill="FFFFFF"/>
-            <w:tcMar>
-              <w:top w:w="0" w:type="dxa"/>
-              <w:bottom w:w="0" w:type="dxa"/>
-              <w:left w:w="0" w:type="dxa"/>
-              <w:right w:w="0" w:type="dxa"/>
-            </w:tcMar>
-            <w:vAlign w:val="center"/>
-          </w:tcPr>
-          <w:p>
-            <w:pPr>
-              <w:pStyle w:val="Normal"/>
-              <w:jc w:val="left"/>
-              <w:pBdr>
-                <w:bottom w:val="none" w:sz="0" w:space="0" w:color="000000"/>
-                <w:top w:val="none" w:sz="0" w:space="0" w:color="000000"/>
-                <w:left w:val="none" w:sz="0" w:space="0" w:color="000000"/>
-                <w:right w:val="none" w:sz="0" w:space="0" w:color="000000"/>
-              </w:pBdr>
-              <w:spacing w:after="100" w:before="100" w:line="240"/>
-              <w:ind w:left="100" w:right="100" w:firstLine="0" w:firstLineChars="0"/>
-              <w:rPr>
-                <w:rFonts w:ascii="Arial" w:hAnsi="Arial" w:eastAsia="Arial" w:cs="Arial"/>
-                <w:i w:val="false"/>
-                <w:b w:val="false"/>
-                <w:u w:val="none"/>
-                <w:sz w:val="18"/>
-                <w:szCs w:val="18"/>
-                <w:color w:val="000000"/>
-              </w:rPr>
-            </w:pPr>
-            <w:r>
-              <w:rPr>
-                <w:rFonts w:ascii="Arial" w:hAnsi="Arial" w:eastAsia="Arial" w:cs="Arial"/>
-                <w:i w:val="false"/>
-                <w:b w:val="false"/>
-                <w:u w:val="none"/>
-                <w:sz w:val="18"/>
-                <w:szCs w:val="18"/>
-                <w:color w:val="000000"/>
-              </w:rPr>
-              <w:t xml:space="preserve">2 (3.2)</w:t>
+              <w:t xml:space="preserve">2 (3.2%)</w:t>
+            </w:r>
+          </w:p>
+        </w:tc>
+        <w:tc>
+          <w:tcPr>
+            <w:tcBorders>
+              <w:bottom w:val="none" w:sz="0" w:space="0" w:color="000000"/>
+              <w:top w:val="none" w:sz="0" w:space="0" w:color="000000"/>
+              <w:left w:val="none" w:sz="0" w:space="0" w:color="000000"/>
+              <w:right w:val="none" w:sz="0" w:space="0" w:color="000000"/>
+            </w:tcBorders>
+            <w:shd w:val="clear" w:color="auto" w:fill="FFFFFF"/>
+            <w:tcMar>
+              <w:top w:w="0" w:type="dxa"/>
+              <w:bottom w:w="0" w:type="dxa"/>
+              <w:left w:w="0" w:type="dxa"/>
+              <w:right w:w="0" w:type="dxa"/>
+            </w:tcMar>
+            <w:vAlign w:val="center"/>
+          </w:tcPr>
+          <w:p>
+            <w:pPr>
+              <w:pStyle w:val="Normal"/>
+              <w:jc w:val="left"/>
+              <w:pBdr>
+                <w:bottom w:val="none" w:sz="0" w:space="0" w:color="000000"/>
+                <w:top w:val="none" w:sz="0" w:space="0" w:color="000000"/>
+                <w:left w:val="none" w:sz="0" w:space="0" w:color="000000"/>
+                <w:right w:val="none" w:sz="0" w:space="0" w:color="000000"/>
+              </w:pBdr>
+              <w:spacing w:after="100" w:before="100" w:line="240"/>
+              <w:ind w:left="100" w:right="100" w:firstLine="0" w:firstLineChars="0"/>
+              <w:rPr>
+                <w:rFonts w:ascii="Arial" w:hAnsi="Arial" w:eastAsia="Arial" w:cs="Arial"/>
+                <w:i w:val="false"/>
+                <w:b w:val="false"/>
+                <w:u w:val="none"/>
+                <w:sz w:val="18"/>
+                <w:szCs w:val="18"/>
+                <w:color w:val="000000"/>
+              </w:rPr>
+            </w:pPr>
+            <w:r>
+              <w:rPr>
+                <w:rFonts w:ascii="Arial" w:hAnsi="Arial" w:eastAsia="Arial" w:cs="Arial"/>
+                <w:i w:val="false"/>
+                <w:b w:val="false"/>
+                <w:u w:val="none"/>
+                <w:sz w:val="18"/>
+                <w:szCs w:val="18"/>
+                <w:color w:val="000000"/>
+              </w:rPr>
+              <w:t xml:space="preserve">2 (0.8%)</w:t>
+            </w:r>
+          </w:p>
+        </w:tc>
+        <w:tc>
+          <w:tcPr>
+            <w:tcBorders>
+              <w:bottom w:val="none" w:sz="0" w:space="0" w:color="000000"/>
+              <w:top w:val="none" w:sz="0" w:space="0" w:color="000000"/>
+              <w:left w:val="none" w:sz="0" w:space="0" w:color="000000"/>
+              <w:right w:val="none" w:sz="0" w:space="0" w:color="000000"/>
+            </w:tcBorders>
+            <w:shd w:val="clear" w:color="auto" w:fill="FFFFFF"/>
+            <w:tcMar>
+              <w:top w:w="0" w:type="dxa"/>
+              <w:bottom w:w="0" w:type="dxa"/>
+              <w:left w:w="0" w:type="dxa"/>
+              <w:right w:w="0" w:type="dxa"/>
+            </w:tcMar>
+            <w:vAlign w:val="center"/>
+          </w:tcPr>
+          <w:p>
+            <w:pPr>
+              <w:pStyle w:val="Normal"/>
+              <w:jc w:val="left"/>
+              <w:pBdr>
+                <w:bottom w:val="none" w:sz="0" w:space="0" w:color="000000"/>
+                <w:top w:val="none" w:sz="0" w:space="0" w:color="000000"/>
+                <w:left w:val="none" w:sz="0" w:space="0" w:color="000000"/>
+                <w:right w:val="none" w:sz="0" w:space="0" w:color="000000"/>
+              </w:pBdr>
+              <w:spacing w:after="100" w:before="100" w:line="240"/>
+              <w:ind w:left="100" w:right="100" w:firstLine="0" w:firstLineChars="0"/>
+              <w:rPr>
+                <w:rFonts w:ascii="Arial" w:hAnsi="Arial" w:eastAsia="Arial" w:cs="Arial"/>
+                <w:i w:val="false"/>
+                <w:b w:val="false"/>
+                <w:u w:val="none"/>
+                <w:sz w:val="18"/>
+                <w:szCs w:val="18"/>
+                <w:color w:val="000000"/>
+              </w:rPr>
+            </w:pPr>
+            <w:r>
+              <w:rPr>
+                <w:rFonts w:ascii="Arial" w:hAnsi="Arial" w:eastAsia="Arial" w:cs="Arial"/>
+                <w:i w:val="false"/>
+                <w:b w:val="false"/>
+                <w:u w:val="none"/>
+                <w:sz w:val="18"/>
+                <w:szCs w:val="18"/>
+                <w:color w:val="000000"/>
+              </w:rPr>
+              <w:t xml:space="preserve">1 (0.8%)</w:t>
             </w:r>
           </w:p>
         </w:tc>
@@ -6288,113 +6288,113 @@
                 <w:szCs w:val="18"/>
                 <w:color w:val="000000"/>
               </w:rPr>
-              <w:t xml:space="preserve">261 (98.5)</w:t>
-            </w:r>
-          </w:p>
-        </w:tc>
-        <w:tc>
-          <w:tcPr>
-            <w:tcBorders>
-              <w:bottom w:val="none" w:sz="0" w:space="0" w:color="000000"/>
-              <w:top w:val="none" w:sz="0" w:space="0" w:color="000000"/>
-              <w:left w:val="none" w:sz="0" w:space="0" w:color="000000"/>
-              <w:right w:val="none" w:sz="0" w:space="0" w:color="000000"/>
-            </w:tcBorders>
-            <w:shd w:val="clear" w:color="auto" w:fill="FFFFFF"/>
-            <w:tcMar>
-              <w:top w:w="0" w:type="dxa"/>
-              <w:bottom w:w="0" w:type="dxa"/>
-              <w:left w:w="0" w:type="dxa"/>
-              <w:right w:w="0" w:type="dxa"/>
-            </w:tcMar>
-            <w:vAlign w:val="center"/>
-          </w:tcPr>
-          <w:p>
-            <w:pPr>
-              <w:pStyle w:val="Normal"/>
-              <w:jc w:val="left"/>
-              <w:pBdr>
-                <w:bottom w:val="none" w:sz="0" w:space="0" w:color="000000"/>
-                <w:top w:val="none" w:sz="0" w:space="0" w:color="000000"/>
-                <w:left w:val="none" w:sz="0" w:space="0" w:color="000000"/>
-                <w:right w:val="none" w:sz="0" w:space="0" w:color="000000"/>
-              </w:pBdr>
-              <w:spacing w:after="100" w:before="100" w:line="240"/>
-              <w:ind w:left="100" w:right="100" w:firstLine="0" w:firstLineChars="0"/>
-              <w:rPr>
-                <w:rFonts w:ascii="Arial" w:hAnsi="Arial" w:eastAsia="Arial" w:cs="Arial"/>
-                <w:i w:val="false"/>
-                <w:b w:val="false"/>
-                <w:u w:val="none"/>
-                <w:sz w:val="18"/>
-                <w:szCs w:val="18"/>
-                <w:color w:val="000000"/>
-              </w:rPr>
-            </w:pPr>
-            <w:r>
-              <w:rPr>
-                <w:rFonts w:ascii="Arial" w:hAnsi="Arial" w:eastAsia="Arial" w:cs="Arial"/>
-                <w:i w:val="false"/>
-                <w:b w:val="false"/>
-                <w:u w:val="none"/>
-                <w:sz w:val="18"/>
-                <w:szCs w:val="18"/>
-                <w:color w:val="000000"/>
-              </w:rPr>
-              <w:t xml:space="preserve">124 (96.9)</w:t>
-            </w:r>
-          </w:p>
-        </w:tc>
-        <w:tc>
-          <w:tcPr>
-            <w:tcBorders>
-              <w:bottom w:val="none" w:sz="0" w:space="0" w:color="000000"/>
-              <w:top w:val="none" w:sz="0" w:space="0" w:color="000000"/>
-              <w:left w:val="none" w:sz="0" w:space="0" w:color="000000"/>
-              <w:right w:val="none" w:sz="0" w:space="0" w:color="000000"/>
-            </w:tcBorders>
-            <w:shd w:val="clear" w:color="auto" w:fill="FFFFFF"/>
-            <w:tcMar>
-              <w:top w:w="0" w:type="dxa"/>
-              <w:bottom w:w="0" w:type="dxa"/>
-              <w:left w:w="0" w:type="dxa"/>
-              <w:right w:w="0" w:type="dxa"/>
-            </w:tcMar>
-            <w:vAlign w:val="center"/>
-          </w:tcPr>
-          <w:p>
-            <w:pPr>
-              <w:pStyle w:val="Normal"/>
-              <w:jc w:val="left"/>
-              <w:pBdr>
-                <w:bottom w:val="none" w:sz="0" w:space="0" w:color="000000"/>
-                <w:top w:val="none" w:sz="0" w:space="0" w:color="000000"/>
-                <w:left w:val="none" w:sz="0" w:space="0" w:color="000000"/>
-                <w:right w:val="none" w:sz="0" w:space="0" w:color="000000"/>
-              </w:pBdr>
-              <w:spacing w:after="100" w:before="100" w:line="240"/>
-              <w:ind w:left="100" w:right="100" w:firstLine="0" w:firstLineChars="0"/>
-              <w:rPr>
-                <w:rFonts w:ascii="Arial" w:hAnsi="Arial" w:eastAsia="Arial" w:cs="Arial"/>
-                <w:i w:val="false"/>
-                <w:b w:val="false"/>
-                <w:u w:val="none"/>
-                <w:sz w:val="18"/>
-                <w:szCs w:val="18"/>
-                <w:color w:val="000000"/>
-              </w:rPr>
-            </w:pPr>
-            <w:r>
-              <w:rPr>
-                <w:rFonts w:ascii="Arial" w:hAnsi="Arial" w:eastAsia="Arial" w:cs="Arial"/>
-                <w:i w:val="false"/>
-                <w:b w:val="false"/>
-                <w:u w:val="none"/>
-                <w:sz w:val="18"/>
-                <w:szCs w:val="18"/>
-                <w:color w:val="000000"/>
-              </w:rPr>
-              <w:t xml:space="preserve">61 (96.8)</w:t>
+              <w:t xml:space="preserve">61 (96.8%)</w:t>
+            </w:r>
+          </w:p>
+        </w:tc>
+        <w:tc>
+          <w:tcPr>
+            <w:tcBorders>
+              <w:bottom w:val="none" w:sz="0" w:space="0" w:color="000000"/>
+              <w:top w:val="none" w:sz="0" w:space="0" w:color="000000"/>
+              <w:left w:val="none" w:sz="0" w:space="0" w:color="000000"/>
+              <w:right w:val="none" w:sz="0" w:space="0" w:color="000000"/>
+            </w:tcBorders>
+            <w:shd w:val="clear" w:color="auto" w:fill="FFFFFF"/>
+            <w:tcMar>
+              <w:top w:w="0" w:type="dxa"/>
+              <w:bottom w:w="0" w:type="dxa"/>
+              <w:left w:w="0" w:type="dxa"/>
+              <w:right w:w="0" w:type="dxa"/>
+            </w:tcMar>
+            <w:vAlign w:val="center"/>
+          </w:tcPr>
+          <w:p>
+            <w:pPr>
+              <w:pStyle w:val="Normal"/>
+              <w:jc w:val="left"/>
+              <w:pBdr>
+                <w:bottom w:val="none" w:sz="0" w:space="0" w:color="000000"/>
+                <w:top w:val="none" w:sz="0" w:space="0" w:color="000000"/>
+                <w:left w:val="none" w:sz="0" w:space="0" w:color="000000"/>
+                <w:right w:val="none" w:sz="0" w:space="0" w:color="000000"/>
+              </w:pBdr>
+              <w:spacing w:after="100" w:before="100" w:line="240"/>
+              <w:ind w:left="100" w:right="100" w:firstLine="0" w:firstLineChars="0"/>
+              <w:rPr>
+                <w:rFonts w:ascii="Arial" w:hAnsi="Arial" w:eastAsia="Arial" w:cs="Arial"/>
+                <w:i w:val="false"/>
+                <w:b w:val="false"/>
+                <w:u w:val="none"/>
+                <w:sz w:val="18"/>
+                <w:szCs w:val="18"/>
+                <w:color w:val="000000"/>
+              </w:rPr>
+            </w:pPr>
+            <w:r>
+              <w:rPr>
+                <w:rFonts w:ascii="Arial" w:hAnsi="Arial" w:eastAsia="Arial" w:cs="Arial"/>
+                <w:i w:val="false"/>
+                <w:b w:val="false"/>
+                <w:u w:val="none"/>
+                <w:sz w:val="18"/>
+                <w:szCs w:val="18"/>
+                <w:color w:val="000000"/>
+              </w:rPr>
+              <w:t xml:space="preserve">262 (98.5%)</w:t>
+            </w:r>
+          </w:p>
+        </w:tc>
+        <w:tc>
+          <w:tcPr>
+            <w:tcBorders>
+              <w:bottom w:val="none" w:sz="0" w:space="0" w:color="000000"/>
+              <w:top w:val="none" w:sz="0" w:space="0" w:color="000000"/>
+              <w:left w:val="none" w:sz="0" w:space="0" w:color="000000"/>
+              <w:right w:val="none" w:sz="0" w:space="0" w:color="000000"/>
+            </w:tcBorders>
+            <w:shd w:val="clear" w:color="auto" w:fill="FFFFFF"/>
+            <w:tcMar>
+              <w:top w:w="0" w:type="dxa"/>
+              <w:bottom w:w="0" w:type="dxa"/>
+              <w:left w:w="0" w:type="dxa"/>
+              <w:right w:w="0" w:type="dxa"/>
+            </w:tcMar>
+            <w:vAlign w:val="center"/>
+          </w:tcPr>
+          <w:p>
+            <w:pPr>
+              <w:pStyle w:val="Normal"/>
+              <w:jc w:val="left"/>
+              <w:pBdr>
+                <w:bottom w:val="none" w:sz="0" w:space="0" w:color="000000"/>
+                <w:top w:val="none" w:sz="0" w:space="0" w:color="000000"/>
+                <w:left w:val="none" w:sz="0" w:space="0" w:color="000000"/>
+                <w:right w:val="none" w:sz="0" w:space="0" w:color="000000"/>
+              </w:pBdr>
+              <w:spacing w:after="100" w:before="100" w:line="240"/>
+              <w:ind w:left="100" w:right="100" w:firstLine="0" w:firstLineChars="0"/>
+              <w:rPr>
+                <w:rFonts w:ascii="Arial" w:hAnsi="Arial" w:eastAsia="Arial" w:cs="Arial"/>
+                <w:i w:val="false"/>
+                <w:b w:val="false"/>
+                <w:u w:val="none"/>
+                <w:sz w:val="18"/>
+                <w:szCs w:val="18"/>
+                <w:color w:val="000000"/>
+              </w:rPr>
+            </w:pPr>
+            <w:r>
+              <w:rPr>
+                <w:rFonts w:ascii="Arial" w:hAnsi="Arial" w:eastAsia="Arial" w:cs="Arial"/>
+                <w:i w:val="false"/>
+                <w:b w:val="false"/>
+                <w:u w:val="none"/>
+                <w:sz w:val="18"/>
+                <w:szCs w:val="18"/>
+                <w:color w:val="000000"/>
+              </w:rPr>
+              <w:t xml:space="preserve">125 (96.9%)</w:t>
             </w:r>
           </w:p>
         </w:tc>
@@ -6612,6 +6612,59 @@
                 <w:szCs w:val="18"/>
                 <w:color w:val="000000"/>
               </w:rPr>
+              <w:t xml:space="preserve">76.00 [62.00, 88.00]</w:t>
+            </w:r>
+          </w:p>
+        </w:tc>
+        <w:tc>
+          <w:tcPr>
+            <w:tcBorders>
+              <w:bottom w:val="single" w:sz="12" w:space="0" w:color="000000"/>
+              <w:top w:val="none" w:sz="0" w:space="0" w:color="000000"/>
+              <w:left w:val="none" w:sz="0" w:space="0" w:color="000000"/>
+              <w:right w:val="none" w:sz="0" w:space="0" w:color="000000"/>
+            </w:tcBorders>
+            <w:shd w:val="clear" w:color="auto" w:fill="FFFFFF"/>
+            <w:tcMar>
+              <w:top w:w="0" w:type="dxa"/>
+              <w:bottom w:w="0" w:type="dxa"/>
+              <w:left w:w="0" w:type="dxa"/>
+              <w:right w:w="0" w:type="dxa"/>
+            </w:tcMar>
+            <w:vAlign w:val="center"/>
+          </w:tcPr>
+          <w:p>
+            <w:pPr>
+              <w:pStyle w:val="Normal"/>
+              <w:jc w:val="left"/>
+              <w:pBdr>
+                <w:bottom w:val="none" w:sz="0" w:space="0" w:color="000000"/>
+                <w:top w:val="none" w:sz="0" w:space="0" w:color="000000"/>
+                <w:left w:val="none" w:sz="0" w:space="0" w:color="000000"/>
+                <w:right w:val="none" w:sz="0" w:space="0" w:color="000000"/>
+              </w:pBdr>
+              <w:spacing w:after="100" w:before="100" w:line="240"/>
+              <w:ind w:left="100" w:right="100" w:firstLine="0" w:firstLineChars="0"/>
+              <w:rPr>
+                <w:rFonts w:ascii="Arial" w:hAnsi="Arial" w:eastAsia="Arial" w:cs="Arial"/>
+                <w:i w:val="false"/>
+                <w:b w:val="false"/>
+                <w:u w:val="none"/>
+                <w:sz w:val="18"/>
+                <w:szCs w:val="18"/>
+                <w:color w:val="000000"/>
+              </w:rPr>
+            </w:pPr>
+            <w:r>
+              <w:rPr>
+                <w:rFonts w:ascii="Arial" w:hAnsi="Arial" w:eastAsia="Arial" w:cs="Arial"/>
+                <w:i w:val="false"/>
+                <w:b w:val="false"/>
+                <w:u w:val="none"/>
+                <w:sz w:val="18"/>
+                <w:szCs w:val="18"/>
+                <w:color w:val="000000"/>
+              </w:rPr>
               <w:t xml:space="preserve">78.00 [66.00, 90.00]</w:t>
             </w:r>
           </w:p>
@@ -6665,7 +6718,7 @@
                 <w:szCs w:val="18"/>
                 <w:color w:val="000000"/>
               </w:rPr>
-              <w:t xml:space="preserve">80.00 [71.00, 90.50]</w:t>
+              <w:t xml:space="preserve">80.00 [71.00, 90.25]</w:t>
             </w:r>
           </w:p>
         </w:tc>
@@ -6718,7 +6771,7 @@
                 <w:szCs w:val="18"/>
                 <w:color w:val="000000"/>
               </w:rPr>
-              <w:t xml:space="preserve">76.00 [62.00, 88.00]</w:t>
+              <w:t xml:space="preserve">0.191</w:t>
             </w:r>
           </w:p>
         </w:tc>
@@ -6771,60 +6824,7 @@
                 <w:szCs w:val="18"/>
                 <w:color w:val="000000"/>
               </w:rPr>
-              <w:t xml:space="preserve">0.197</w:t>
-            </w:r>
-          </w:p>
-        </w:tc>
-        <w:tc>
-          <w:tcPr>
-            <w:tcBorders>
-              <w:bottom w:val="single" w:sz="12" w:space="0" w:color="000000"/>
-              <w:top w:val="none" w:sz="0" w:space="0" w:color="000000"/>
-              <w:left w:val="none" w:sz="0" w:space="0" w:color="000000"/>
-              <w:right w:val="none" w:sz="0" w:space="0" w:color="000000"/>
-            </w:tcBorders>
-            <w:shd w:val="clear" w:color="auto" w:fill="FFFFFF"/>
-            <w:tcMar>
-              <w:top w:w="0" w:type="dxa"/>
-              <w:bottom w:w="0" w:type="dxa"/>
-              <w:left w:w="0" w:type="dxa"/>
-              <w:right w:w="0" w:type="dxa"/>
-            </w:tcMar>
-            <w:vAlign w:val="center"/>
-          </w:tcPr>
-          <w:p>
-            <w:pPr>
-              <w:pStyle w:val="Normal"/>
-              <w:jc w:val="left"/>
-              <w:pBdr>
-                <w:bottom w:val="none" w:sz="0" w:space="0" w:color="000000"/>
-                <w:top w:val="none" w:sz="0" w:space="0" w:color="000000"/>
-                <w:left w:val="none" w:sz="0" w:space="0" w:color="000000"/>
-                <w:right w:val="none" w:sz="0" w:space="0" w:color="000000"/>
-              </w:pBdr>
-              <w:spacing w:after="100" w:before="100" w:line="240"/>
-              <w:ind w:left="100" w:right="100" w:firstLine="0" w:firstLineChars="0"/>
-              <w:rPr>
-                <w:rFonts w:ascii="Arial" w:hAnsi="Arial" w:eastAsia="Arial" w:cs="Arial"/>
-                <w:i w:val="false"/>
-                <w:b w:val="false"/>
-                <w:u w:val="none"/>
-                <w:sz w:val="18"/>
-                <w:szCs w:val="18"/>
-                <w:color w:val="000000"/>
-              </w:rPr>
-            </w:pPr>
-            <w:r>
-              <w:rPr>
-                <w:rFonts w:ascii="Arial" w:hAnsi="Arial" w:eastAsia="Arial" w:cs="Arial"/>
-                <w:i w:val="false"/>
-                <w:b w:val="false"/>
-                <w:u w:val="none"/>
-                <w:sz w:val="18"/>
-                <w:szCs w:val="18"/>
-                <w:color w:val="000000"/>
-              </w:rPr>
-              <w:t xml:space="preserve">0.475</w:t>
+              <w:t xml:space="preserve">0.425</w:t>
             </w:r>
           </w:p>
         </w:tc>

</xml_diff>